<commit_message>
Archive des niveaux d'alerte du 2026-10-28
</commit_message>
<xml_diff>
--- a/web/rapports/mensuel/2026-10.docx
+++ b/web/rapports/mensuel/2026-10.docx
@@ -212,7 +212,7 @@
           <w:szCs w:val="40"/>
           <w:rFonts w:ascii="Calibri" w:cs="Calibri" w:eastAsia="Calibri" w:hAnsi="Calibri"/>
         </w:rPr>
-        <w:t xml:space="preserve">27 OCTOBRE 2026</w:t>
+        <w:t xml:space="preserve">28 OCTOBRE 2026</w:t>
       </w:r>
     </w:p>
     <w:p>
@@ -226,7 +226,7 @@
           <w:szCs w:val="28"/>
           <w:rFonts w:ascii="Calibri" w:cs="Calibri" w:eastAsia="Calibri" w:hAnsi="Calibri"/>
         </w:rPr>
-        <w:t xml:space="preserve">Période du 1er au 27 octobre 2026</w:t>
+        <w:t xml:space="preserve">Période du 1er au 28 octobre 2026</w:t>
       </w:r>
     </w:p>
     <w:p>
@@ -959,7 +959,7 @@
                 <w:szCs w:val="18"/>
                 <w:rFonts w:ascii="Calibri" w:cs="Calibri" w:eastAsia="Calibri" w:hAnsi="Calibri"/>
               </w:rPr>
-              <w:t xml:space="preserve">TCHAD-NIGER : UNE NOUVELLE ESCALADE ENTRE MAHAMAT IDRISS DÉBY ET ABDOURAHAMANE TIANI</w:t>
+              <w:t xml:space="preserve">FRAPPE DE DRONE À AGADEZ : LE NIGER CONVOQUE L’AMBASSADEUR DU TCHAD ET ANNONCE DE…</w:t>
             </w:r>
           </w:p>
           <w:p>
@@ -998,7 +998,7 @@
                 <w:szCs w:val="18"/>
                 <w:rFonts w:ascii="Calibri" w:cs="Calibri" w:eastAsia="Calibri" w:hAnsi="Calibri"/>
               </w:rPr>
-              <w:t xml:space="preserve">SEVEN SHOT DEAD BY GUNMEN AT CHURCH FUNERAL IN JORDAN, OFFICIALS SAY</w:t>
+              <w:t xml:space="preserve">WOMAN KILLED BY TEMA-AFIENYA TRAIN AS RESIDENTS DEMAND FOOTBRIDGE</w:t>
             </w:r>
           </w:p>
           <w:p>
@@ -1154,7 +1154,7 @@
                 <w:szCs w:val="18"/>
                 <w:rFonts w:ascii="Calibri" w:cs="Calibri" w:eastAsia="Calibri" w:hAnsi="Calibri"/>
               </w:rPr>
-              <w:t xml:space="preserve">(EN) LIBERIA: DOLPHIN KILLED, BUTCHERED BEFORE NAFAA RESCUE TEAM ARRIVED</w:t>
+              <w:t xml:space="preserve">LIBÉRIA : UN DAUPHIN TUÉ ET MASSACRÉ AVANT L'ARRIVÉE DE L'ÉQUIPE DE SECOURS DE LA…</w:t>
             </w:r>
           </w:p>
           <w:p>
@@ -1193,7 +1193,7 @@
                 <w:szCs w:val="18"/>
                 <w:rFonts w:ascii="Calibri" w:cs="Calibri" w:eastAsia="Calibri" w:hAnsi="Calibri"/>
               </w:rPr>
-              <w:t xml:space="preserve">IMMEUBLE EFFONDRÉ À THIÈS : UN MORT ET DEUX BLESSÉS, SELON LE BILAN PROVISOIRE</w:t>
+              <w:t xml:space="preserve">TOUBA : UN DÉBAT SUR LES MOTEURS DE JAKARTA SE TERMINE PAR LA MORT DE BAYE M. DIOP</w:t>
             </w:r>
           </w:p>
         </w:tc>
@@ -1536,7 +1536,7 @@
           <w:szCs w:val="22"/>
           <w:rFonts w:ascii="Calibri" w:cs="Calibri" w:eastAsia="Calibri" w:hAnsi="Calibri"/>
         </w:rPr>
-        <w:t xml:space="preserve">Indice de confiance : moyenne (incident vérifié le plus récent : 120 jours ; 2 signaux du jour)</w:t>
+        <w:t xml:space="preserve">Indice de confiance : faible (incident vérifié le plus récent : 121 jours ; aucun signal du jour)</w:t>
       </w:r>
     </w:p>
     <w:p>
@@ -1661,7 +1661,7 @@
           <w:rFonts w:ascii="Calibri" w:cs="Calibri" w:eastAsia="Calibri" w:hAnsi="Calibri"/>
         </w:rPr>
       </w:r>
-      <w:hyperlink w:history="1" r:id="rIdx9kvkcr_4jnwfltzdkjvc">
+      <w:hyperlink w:history="1" r:id="rIdhm5qsqwgqedplqmfvogy6">
         <w:r>
           <w:rPr>
             <w:u w:val="single"/>
@@ -2006,7 +2006,7 @@
           <w:rFonts w:ascii="Calibri" w:cs="Calibri" w:eastAsia="Calibri" w:hAnsi="Calibri"/>
         </w:rPr>
       </w:r>
-      <w:hyperlink w:history="1" r:id="rIdks_fkll7luuetbkykmjcf">
+      <w:hyperlink w:history="1" r:id="rIdsvqucnxum5a995uptnh3q">
         <w:r>
           <w:rPr>
             <w:u w:val="single"/>
@@ -2351,7 +2351,7 @@
           <w:rFonts w:ascii="Calibri" w:cs="Calibri" w:eastAsia="Calibri" w:hAnsi="Calibri"/>
         </w:rPr>
       </w:r>
-      <w:hyperlink w:history="1" r:id="rIdhia-mrfgvawyglztsvfiq">
+      <w:hyperlink w:history="1" r:id="rId4nr3bfv_o8ql50s64ejcb">
         <w:r>
           <w:rPr>
             <w:u w:val="single"/>
@@ -2614,7 +2614,7 @@
         </w:rPr>
         <w:t xml:space="preserve">▪  Source : </w:t>
       </w:r>
-      <w:hyperlink w:history="1" r:id="rIdmkupp2alobfht_zx4dfu8">
+      <w:hyperlink w:history="1" r:id="rIdopu0xokzkdtjygvt2hyhb">
         <w:r>
           <w:rPr>
             <w:u w:val="single"/>
@@ -2676,7 +2676,7 @@
         </w:rPr>
         <w:t xml:space="preserve">▪  Source : </w:t>
       </w:r>
-      <w:hyperlink w:history="1" r:id="rIdz4suvnb8lgj_64eunisa2">
+      <w:hyperlink w:history="1" r:id="rIdvodbmfb2mglzsj8mmovkm">
         <w:r>
           <w:rPr>
             <w:u w:val="single"/>
@@ -2912,7 +2912,7 @@
           <w:szCs w:val="22"/>
           <w:rFonts w:ascii="Calibri" w:cs="Calibri" w:eastAsia="Calibri" w:hAnsi="Calibri"/>
         </w:rPr>
-        <w:t xml:space="preserve">Indice de confiance : moyenne (incident vérifié le plus récent : 120 jours ; 2 signaux du jour)</w:t>
+        <w:t xml:space="preserve">Indice de confiance : faible (incident vérifié le plus récent : 121 jours ; aucun signal du jour)</w:t>
       </w:r>
     </w:p>
     <w:p>
@@ -2955,7 +2955,7 @@
         </w:rPr>
         <w:t xml:space="preserve">▪  Source : </w:t>
       </w:r>
-      <w:hyperlink w:history="1" r:id="rId5rivxngbphn6f5yglvho1">
+      <w:hyperlink w:history="1" r:id="rIdwa9e3sznfxx4i8erh-9nw">
         <w:r>
           <w:rPr>
             <w:u w:val="single"/>
@@ -3017,7 +3017,7 @@
         </w:rPr>
         <w:t xml:space="preserve">▪  Source : </w:t>
       </w:r>
-      <w:hyperlink w:history="1" r:id="rIdem75b-r77m34lpaoernt5">
+      <w:hyperlink w:history="1" r:id="rIdvbssmmcoee9hm6ujo7yvu">
         <w:r>
           <w:rPr>
             <w:u w:val="single"/>
@@ -3253,7 +3253,7 @@
           <w:szCs w:val="22"/>
           <w:rFonts w:ascii="Calibri" w:cs="Calibri" w:eastAsia="Calibri" w:hAnsi="Calibri"/>
         </w:rPr>
-        <w:t xml:space="preserve">Indice de confiance : moyenne (incident vérifié le plus récent : 120 jours ; 2 signaux du jour)</w:t>
+        <w:t xml:space="preserve">Indice de confiance : faible (incident vérifié le plus récent : 121 jours ; aucun signal du jour)</w:t>
       </w:r>
     </w:p>
     <w:p>
@@ -3296,7 +3296,7 @@
         </w:rPr>
         <w:t xml:space="preserve">▪  Source : </w:t>
       </w:r>
-      <w:hyperlink w:history="1" r:id="rIdidnegbrhocdl9u48cu7yp">
+      <w:hyperlink w:history="1" r:id="rIde-b2q7wuejuqbxnyotck3">
         <w:r>
           <w:rPr>
             <w:u w:val="single"/>
@@ -3369,7 +3369,7 @@
         </w:rPr>
         <w:t xml:space="preserve">▪  Source : </w:t>
       </w:r>
-      <w:hyperlink w:history="1" r:id="rIdx24dk5gaa_s3svbowzvx-">
+      <w:hyperlink w:history="1" r:id="rIdhe9wje9lqrzooppggtbxc">
         <w:r>
           <w:rPr>
             <w:u w:val="single"/>
@@ -3442,7 +3442,7 @@
         </w:rPr>
         <w:t xml:space="preserve">▪  Source : </w:t>
       </w:r>
-      <w:hyperlink w:history="1" r:id="rIdkfom1unhiehgzblje17u9">
+      <w:hyperlink w:history="1" r:id="rIdpvgpyukougifb8gf6toar">
         <w:r>
           <w:rPr>
             <w:u w:val="single"/>
@@ -3504,7 +3504,7 @@
         </w:rPr>
         <w:t xml:space="preserve">▪  Source : </w:t>
       </w:r>
-      <w:hyperlink w:history="1" r:id="rIdlxyvxaub5panluqcvto3i">
+      <w:hyperlink w:history="1" r:id="rIddgsfblgjtn91nbdunuan3">
         <w:r>
           <w:rPr>
             <w:u w:val="single"/>
@@ -3577,7 +3577,7 @@
         </w:rPr>
         <w:t xml:space="preserve">▪  Source : </w:t>
       </w:r>
-      <w:hyperlink w:history="1" r:id="rIdh_fhe8xemnygwlzraqogf">
+      <w:hyperlink w:history="1" r:id="rIdvjsyynvgprg9yzqci89sl">
         <w:r>
           <w:rPr>
             <w:u w:val="single"/>
@@ -3840,7 +3840,7 @@
         </w:rPr>
         <w:t xml:space="preserve">▪  Source : </w:t>
       </w:r>
-      <w:hyperlink w:history="1" r:id="rIdkrdokqbilsujrzcv4s4is">
+      <w:hyperlink w:history="1" r:id="rIdzvwpiikpo8ogcodvvuk8u">
         <w:r>
           <w:rPr>
             <w:u w:val="single"/>
@@ -3902,7 +3902,7 @@
         </w:rPr>
         <w:t xml:space="preserve">▪  Source : </w:t>
       </w:r>
-      <w:hyperlink w:history="1" r:id="rId2lrsp2-zdczppngyj869p">
+      <w:hyperlink w:history="1" r:id="rIdk3jg9injqbfpftttjs3qp">
         <w:r>
           <w:rPr>
             <w:u w:val="single"/>
@@ -3964,7 +3964,7 @@
         </w:rPr>
         <w:t xml:space="preserve">▪  Source : </w:t>
       </w:r>
-      <w:hyperlink w:history="1" r:id="rId0nasercoivkifhz8wiapm">
+      <w:hyperlink w:history="1" r:id="rIdli360brmpjziyog90f7a4">
         <w:r>
           <w:rPr>
             <w:u w:val="single"/>
@@ -4026,7 +4026,7 @@
         </w:rPr>
         <w:t xml:space="preserve">▪  Source : </w:t>
       </w:r>
-      <w:hyperlink w:history="1" r:id="rIdvtgoiexzo7jqgnnsarhnc">
+      <w:hyperlink w:history="1" r:id="rIdzv4kpnkvsfeqi9hjvbwia">
         <w:r>
           <w:rPr>
             <w:u w:val="single"/>
@@ -4088,7 +4088,7 @@
         </w:rPr>
         <w:t xml:space="preserve">▪  Source : </w:t>
       </w:r>
-      <w:hyperlink w:history="1" r:id="rIdavxaynyukwxhzjxxwnwaa">
+      <w:hyperlink w:history="1" r:id="rIdreqpdbm4g9dihaxanwfvd">
         <w:r>
           <w:rPr>
             <w:u w:val="single"/>
@@ -4324,7 +4324,7 @@
           <w:szCs w:val="22"/>
           <w:rFonts w:ascii="Calibri" w:cs="Calibri" w:eastAsia="Calibri" w:hAnsi="Calibri"/>
         </w:rPr>
-        <w:t xml:space="preserve">Indice de confiance : moyenne (incident vérifié le plus récent : 120 jours ; 2 signaux du jour)</w:t>
+        <w:t xml:space="preserve">Indice de confiance : faible (incident vérifié le plus récent : 121 jours ; aucun signal du jour)</w:t>
       </w:r>
     </w:p>
     <w:p>
@@ -4449,7 +4449,7 @@
           <w:rFonts w:ascii="Calibri" w:cs="Calibri" w:eastAsia="Calibri" w:hAnsi="Calibri"/>
         </w:rPr>
       </w:r>
-      <w:hyperlink w:history="1" r:id="rIdg3svuvna2uvhvy2bkljcj">
+      <w:hyperlink w:history="1" r:id="rIdwqtwiahow-vsif0wwvpku">
         <w:r>
           <w:rPr>
             <w:u w:val="single"/>
@@ -4712,7 +4712,7 @@
         </w:rPr>
         <w:t xml:space="preserve">▪  Source : </w:t>
       </w:r>
-      <w:hyperlink w:history="1" r:id="rId1dluiaax0ap3atszeb8ct">
+      <w:hyperlink w:history="1" r:id="rIdqltql7fdwrapuoq0hmenz">
         <w:r>
           <w:rPr>
             <w:u w:val="single"/>
@@ -5034,7 +5034,7 @@
           <w:szCs w:val="22"/>
           <w:rFonts w:ascii="Calibri" w:cs="Calibri" w:eastAsia="Calibri" w:hAnsi="Calibri"/>
         </w:rPr>
-        <w:t xml:space="preserve">Indice de confiance : faible (incident vérifié le plus récent : 120 jours ; aucun signal du jour)</w:t>
+        <w:t xml:space="preserve">Indice de confiance : moyenne (incident vérifié le plus récent : 121 jours ; 1 signal du jour)</w:t>
       </w:r>
     </w:p>
     <w:p>
@@ -5173,7 +5173,7 @@
           <w:rFonts w:ascii="Calibri" w:cs="Calibri" w:eastAsia="Calibri" w:hAnsi="Calibri"/>
         </w:rPr>
       </w:r>
-      <w:hyperlink w:history="1" r:id="rIda2y68ev0qsa27viv_agau">
+      <w:hyperlink w:history="1" r:id="rIdcwlszjamuiej5htttjlh2">
         <w:r>
           <w:rPr>
             <w:u w:val="single"/>
@@ -5427,7 +5427,7 @@
         </w:rPr>
         <w:t xml:space="preserve">▪  Sources : </w:t>
       </w:r>
-      <w:hyperlink w:history="1" r:id="rIdwrjefzenyzjekmeocwxks">
+      <w:hyperlink w:history="1" r:id="rIdd7a2zvoqlgtvbratesktu">
         <w:r>
           <w:rPr>
             <w:u w:val="single"/>
@@ -5484,6 +5484,79 @@
           <w:szCs w:val="28"/>
           <w:rFonts w:ascii="Calibri" w:cs="Calibri" w:eastAsia="Calibri" w:hAnsi="Calibri"/>
         </w:rPr>
+        <w:t xml:space="preserve">ENTREPRENEURIAT FÉMININ À KORSIMORO : LE COMBAT INSPIRANT DES FEMMES POUR L’AUTONOMIE FINANCIÈRE</w:t>
+      </w:r>
+    </w:p>
+    <w:p>
+      <w:pPr>
+        <w:ind w:left="720"/>
+      </w:pPr>
+      <w:r>
+        <w:rPr>
+          <w:color w:val="1F2937"/>
+          <w:sz w:val="26"/>
+          <w:szCs w:val="26"/>
+          <w:rFonts w:ascii="Calibri" w:cs="Calibri" w:eastAsia="Calibri" w:hAnsi="Calibri"/>
+        </w:rPr>
+        <w:t xml:space="preserve">▪  Source : </w:t>
+      </w:r>
+      <w:hyperlink w:history="1" r:id="rIdwmpixqlrcjfsyvka5x9ml">
+        <w:r>
+          <w:rPr>
+            <w:u w:val="single"/>
+            <w:color w:val="1F6B5E"/>
+            <w:sz w:val="26"/>
+            <w:szCs w:val="26"/>
+            <w:rFonts w:ascii="Calibri" w:cs="Calibri" w:eastAsia="Calibri" w:hAnsi="Calibri"/>
+          </w:rPr>
+          <w:t xml:space="preserve">Burkina24</w:t>
+        </w:r>
+      </w:hyperlink>
+      <w:r>
+        <w:rPr>
+          <w:color w:val="1F2937"/>
+          <w:sz w:val="26"/>
+          <w:szCs w:val="26"/>
+          <w:rFonts w:ascii="Calibri" w:cs="Calibri" w:eastAsia="Calibri" w:hAnsi="Calibri"/>
+        </w:rPr>
+        <w:t xml:space="preserve"> — 28 octobre 2026, 8 h UTC</w:t>
+      </w:r>
+      <w:r>
+        <w:rPr>
+          <w:b/>
+          <w:bCs/>
+          <w:color w:val="1F2937"/>
+          <w:sz w:val="26"/>
+          <w:szCs w:val="26"/>
+          <w:rFonts w:ascii="Calibri" w:cs="Calibri" w:eastAsia="Calibri" w:hAnsi="Calibri"/>
+        </w:rPr>
+        <w:t xml:space="preserve">   ·   Cotation : Probable</w:t>
+      </w:r>
+    </w:p>
+    <w:p>
+      <w:pPr>
+        <w:spacing w:before="160"/>
+        <w:ind w:left="360"/>
+      </w:pPr>
+      <w:r>
+        <w:rPr>
+          <w:color w:val="1F6B5E"/>
+          <w:sz w:val="28"/>
+          <w:szCs w:val="28"/>
+          <w:rFonts w:ascii="Calibri" w:cs="Calibri" w:eastAsia="Calibri" w:hAnsi="Calibri"/>
+        </w:rPr>
+        <w:t xml:space="preserve">❑  </w:t>
+      </w:r>
+      <w:r>
+        <w:rPr>
+          <w:b/>
+          <w:bCs/>
+          <w:u w:val="single"/>
+          <w:color w:val="1F6B5E"/>
+          <w:sz w:val="28"/>
+          <w:szCs w:val="28"/>
+          <w:rFonts w:ascii="Calibri" w:cs="Calibri" w:eastAsia="Calibri" w:hAnsi="Calibri"/>
+        </w:rPr>
         <w:t xml:space="preserve">SÉCURITÉ NUMÉRIQUE AU BURKINA : LA BCLCC LANCE LA 2ᵉ SEMAINE NATIONALE DE LUTTE CONTRE LA CYBERCRIMINALITÉ</w:t>
       </w:r>
     </w:p>
@@ -5500,7 +5573,7 @@
         </w:rPr>
         <w:t xml:space="preserve">▪  Source : </w:t>
       </w:r>
-      <w:hyperlink w:history="1" r:id="rIdrrkp9jm_eakoveobzstf-">
+      <w:hyperlink w:history="1" r:id="rIdzp2_c68ivvky70xm0hqko">
         <w:r>
           <w:rPr>
             <w:u w:val="single"/>
@@ -5562,7 +5635,7 @@
         </w:rPr>
         <w:t xml:space="preserve">▪  Source : </w:t>
       </w:r>
-      <w:hyperlink w:history="1" r:id="rIdh0nzetiwy5xi_lywh6inl">
+      <w:hyperlink w:history="1" r:id="rIdaafdzv1gqom16pduyqhuz">
         <w:r>
           <w:rPr>
             <w:u w:val="single"/>
@@ -5624,7 +5697,7 @@
         </w:rPr>
         <w:t xml:space="preserve">▪  Source : </w:t>
       </w:r>
-      <w:hyperlink w:history="1" r:id="rIdethm8dhppa4-lmnzcbn6y">
+      <w:hyperlink w:history="1" r:id="rIdxbnyc6o75npdykbv6qixp">
         <w:r>
           <w:rPr>
             <w:u w:val="single"/>
@@ -5644,68 +5717,6 @@
           <w:rFonts w:ascii="Calibri" w:cs="Calibri" w:eastAsia="Calibri" w:hAnsi="Calibri"/>
         </w:rPr>
         <w:t xml:space="preserve"> — 23 octobre 2026, 14 h UTC</w:t>
-      </w:r>
-    </w:p>
-    <w:p>
-      <w:pPr>
-        <w:spacing w:before="160"/>
-        <w:ind w:left="360"/>
-      </w:pPr>
-      <w:r>
-        <w:rPr>
-          <w:color w:val="1F6B5E"/>
-          <w:sz w:val="28"/>
-          <w:szCs w:val="28"/>
-          <w:rFonts w:ascii="Calibri" w:cs="Calibri" w:eastAsia="Calibri" w:hAnsi="Calibri"/>
-        </w:rPr>
-        <w:t xml:space="preserve">❑  </w:t>
-      </w:r>
-      <w:r>
-        <w:rPr>
-          <w:b/>
-          <w:bCs/>
-          <w:u w:val="single"/>
-          <w:color w:val="1F6B5E"/>
-          <w:sz w:val="28"/>
-          <w:szCs w:val="28"/>
-          <w:rFonts w:ascii="Calibri" w:cs="Calibri" w:eastAsia="Calibri" w:hAnsi="Calibri"/>
-        </w:rPr>
-        <w:t xml:space="preserve">BURKINA FASO-TURQUIE : UNE OFFENSIVE DIPLOMATIQUE D’ENVERGURE POUR CONSOLIDER LA COOPÉRATION BILATÉRALE</w:t>
-      </w:r>
-    </w:p>
-    <w:p>
-      <w:pPr>
-        <w:ind w:left="720"/>
-      </w:pPr>
-      <w:r>
-        <w:rPr>
-          <w:color w:val="1F2937"/>
-          <w:sz w:val="26"/>
-          <w:szCs w:val="26"/>
-          <w:rFonts w:ascii="Calibri" w:cs="Calibri" w:eastAsia="Calibri" w:hAnsi="Calibri"/>
-        </w:rPr>
-        <w:t xml:space="preserve">▪  Source : </w:t>
-      </w:r>
-      <w:hyperlink w:history="1" r:id="rIdrowobvesv19y-vuenaw31">
-        <w:r>
-          <w:rPr>
-            <w:u w:val="single"/>
-            <w:color w:val="1F6B5E"/>
-            <w:sz w:val="26"/>
-            <w:szCs w:val="26"/>
-            <w:rFonts w:ascii="Calibri" w:cs="Calibri" w:eastAsia="Calibri" w:hAnsi="Calibri"/>
-          </w:rPr>
-          <w:t xml:space="preserve">Alwihda Info (Tchad)</w:t>
-        </w:r>
-      </w:hyperlink>
-      <w:r>
-        <w:rPr>
-          <w:color w:val="1F2937"/>
-          <w:sz w:val="26"/>
-          <w:szCs w:val="26"/>
-          <w:rFonts w:ascii="Calibri" w:cs="Calibri" w:eastAsia="Calibri" w:hAnsi="Calibri"/>
-        </w:rPr>
-        <w:t xml:space="preserve"> — 23 octobre 2026, 9 h UTC</w:t>
       </w:r>
     </w:p>
     <w:p>
@@ -5913,6 +5924,68 @@
           <w:szCs w:val="28"/>
           <w:rFonts w:ascii="Calibri" w:cs="Calibri" w:eastAsia="Calibri" w:hAnsi="Calibri"/>
         </w:rPr>
+        <w:t xml:space="preserve">BURKINA FASO-TURQUIE : UNE OFFENSIVE DIPLOMATIQUE D’ENVERGURE POUR CONSOLIDER LA COOPÉRATION BILATÉRALE</w:t>
+      </w:r>
+    </w:p>
+    <w:p>
+      <w:pPr>
+        <w:ind w:left="720"/>
+      </w:pPr>
+      <w:r>
+        <w:rPr>
+          <w:color w:val="1F2937"/>
+          <w:sz w:val="26"/>
+          <w:szCs w:val="26"/>
+          <w:rFonts w:ascii="Calibri" w:cs="Calibri" w:eastAsia="Calibri" w:hAnsi="Calibri"/>
+        </w:rPr>
+        <w:t xml:space="preserve">▪  Source : </w:t>
+      </w:r>
+      <w:hyperlink w:history="1" r:id="rIdkbt4z_a0vzfnrdvq8txwy">
+        <w:r>
+          <w:rPr>
+            <w:u w:val="single"/>
+            <w:color w:val="1F6B5E"/>
+            <w:sz w:val="26"/>
+            <w:szCs w:val="26"/>
+            <w:rFonts w:ascii="Calibri" w:cs="Calibri" w:eastAsia="Calibri" w:hAnsi="Calibri"/>
+          </w:rPr>
+          <w:t xml:space="preserve">Alwihda Info (Tchad)</w:t>
+        </w:r>
+      </w:hyperlink>
+      <w:r>
+        <w:rPr>
+          <w:color w:val="1F2937"/>
+          <w:sz w:val="26"/>
+          <w:szCs w:val="26"/>
+          <w:rFonts w:ascii="Calibri" w:cs="Calibri" w:eastAsia="Calibri" w:hAnsi="Calibri"/>
+        </w:rPr>
+        <w:t xml:space="preserve"> — 23 octobre 2026, 9 h UTC</w:t>
+      </w:r>
+    </w:p>
+    <w:p>
+      <w:pPr>
+        <w:spacing w:before="160"/>
+        <w:ind w:left="360"/>
+      </w:pPr>
+      <w:r>
+        <w:rPr>
+          <w:color w:val="1F6B5E"/>
+          <w:sz w:val="28"/>
+          <w:szCs w:val="28"/>
+          <w:rFonts w:ascii="Calibri" w:cs="Calibri" w:eastAsia="Calibri" w:hAnsi="Calibri"/>
+        </w:rPr>
+        <w:t xml:space="preserve">❑  </w:t>
+      </w:r>
+      <w:r>
+        <w:rPr>
+          <w:b/>
+          <w:bCs/>
+          <w:u w:val="single"/>
+          <w:color w:val="1F6B5E"/>
+          <w:sz w:val="28"/>
+          <w:szCs w:val="28"/>
+          <w:rFonts w:ascii="Calibri" w:cs="Calibri" w:eastAsia="Calibri" w:hAnsi="Calibri"/>
+        </w:rPr>
         <w:t xml:space="preserve">EXPANSION GÉOGRAPHIQUE DU TERRORISME SAHÉLIEN - IMPLICATIONS POUR LE GHANA</w:t>
       </w:r>
     </w:p>
@@ -5929,7 +6002,7 @@
         </w:rPr>
         <w:t xml:space="preserve">▪  Source : </w:t>
       </w:r>
-      <w:hyperlink w:history="1" r:id="rIdzzpikqor-4gd3ztfc10po">
+      <w:hyperlink w:history="1" r:id="rIdg3mkhwidfezwtmfgyontm">
         <w:r>
           <w:rPr>
             <w:u w:val="single"/>
@@ -6002,7 +6075,7 @@
         </w:rPr>
         <w:t xml:space="preserve">▪  Source : </w:t>
       </w:r>
-      <w:hyperlink w:history="1" r:id="rIdooozsydu5qjmw4olgflxk">
+      <w:hyperlink w:history="1" r:id="rIdklz7tip01zvs9mkdrjsqn">
         <w:r>
           <w:rPr>
             <w:u w:val="single"/>
@@ -6075,7 +6148,7 @@
         </w:rPr>
         <w:t xml:space="preserve">▪  Source : </w:t>
       </w:r>
-      <w:hyperlink w:history="1" r:id="rIdf8cizhou8doaobtqdwhgs">
+      <w:hyperlink w:history="1" r:id="rIdl1yqekrmaepy538hkuzdw">
         <w:r>
           <w:rPr>
             <w:u w:val="single"/>
@@ -6095,68 +6168,6 @@
           <w:rFonts w:ascii="Calibri" w:cs="Calibri" w:eastAsia="Calibri" w:hAnsi="Calibri"/>
         </w:rPr>
         <w:t xml:space="preserve"> — 27 octobre 2026, 11 h UTC</w:t>
-      </w:r>
-    </w:p>
-    <w:p>
-      <w:pPr>
-        <w:spacing w:before="160"/>
-        <w:ind w:left="360"/>
-      </w:pPr>
-      <w:r>
-        <w:rPr>
-          <w:color w:val="1F6B5E"/>
-          <w:sz w:val="28"/>
-          <w:szCs w:val="28"/>
-          <w:rFonts w:ascii="Calibri" w:cs="Calibri" w:eastAsia="Calibri" w:hAnsi="Calibri"/>
-        </w:rPr>
-        <w:t xml:space="preserve">❑  </w:t>
-      </w:r>
-      <w:r>
-        <w:rPr>
-          <w:b/>
-          <w:bCs/>
-          <w:u w:val="single"/>
-          <w:color w:val="1F6B5E"/>
-          <w:sz w:val="28"/>
-          <w:szCs w:val="28"/>
-          <w:rFonts w:ascii="Calibri" w:cs="Calibri" w:eastAsia="Calibri" w:hAnsi="Calibri"/>
-        </w:rPr>
-        <w:t xml:space="preserve">BURKINA FASO : RIMTALBA JEAN EMMANUEL OUÉDRAOGO ATTENDU AU SOMMET RUSSIE-AFRIQUE À MOSCOU</w:t>
-      </w:r>
-    </w:p>
-    <w:p>
-      <w:pPr>
-        <w:ind w:left="720"/>
-      </w:pPr>
-      <w:r>
-        <w:rPr>
-          <w:color w:val="1F2937"/>
-          <w:sz w:val="26"/>
-          <w:szCs w:val="26"/>
-          <w:rFonts w:ascii="Calibri" w:cs="Calibri" w:eastAsia="Calibri" w:hAnsi="Calibri"/>
-        </w:rPr>
-        <w:t xml:space="preserve">▪  Source : </w:t>
-      </w:r>
-      <w:hyperlink w:history="1" r:id="rIdm1yyvcbfl7pzbddw86tn3">
-        <w:r>
-          <w:rPr>
-            <w:u w:val="single"/>
-            <w:color w:val="1F6B5E"/>
-            <w:sz w:val="26"/>
-            <w:szCs w:val="26"/>
-            <w:rFonts w:ascii="Calibri" w:cs="Calibri" w:eastAsia="Calibri" w:hAnsi="Calibri"/>
-          </w:rPr>
-          <w:t xml:space="preserve">Malijet</w:t>
-        </w:r>
-      </w:hyperlink>
-      <w:r>
-        <w:rPr>
-          <w:color w:val="1F2937"/>
-          <w:sz w:val="26"/>
-          <w:szCs w:val="26"/>
-          <w:rFonts w:ascii="Calibri" w:cs="Calibri" w:eastAsia="Calibri" w:hAnsi="Calibri"/>
-        </w:rPr>
-        <w:t xml:space="preserve"> — 26 octobre 2026, 23 h UTC</w:t>
       </w:r>
     </w:p>
     <w:p>
@@ -6372,285 +6383,178 @@
           <w:szCs w:val="22"/>
           <w:rFonts w:ascii="Calibri" w:cs="Calibri" w:eastAsia="Calibri" w:hAnsi="Calibri"/>
         </w:rPr>
-        <w:t xml:space="preserve">Indice de confiance : faible (incident vérifié le plus récent : 121 jours ; aucun signal du jour)</w:t>
-      </w:r>
-    </w:p>
-    <w:tbl>
-      <w:tblPr>
-        <w:tblW w:type="dxa" w:w="17680"/>
-        <w:tblBorders>
-          <w:top w:val="single" w:color="auto" w:sz="4"/>
-          <w:left w:val="single" w:color="auto" w:sz="4"/>
-          <w:bottom w:val="single" w:color="auto" w:sz="4"/>
-          <w:right w:val="single" w:color="auto" w:sz="4"/>
-          <w:insideH w:val="single" w:color="auto" w:sz="4"/>
-          <w:insideV w:val="single" w:color="auto" w:sz="4"/>
-        </w:tblBorders>
-      </w:tblPr>
-      <w:tblGrid>
-        <w:gridCol w:w="11280"/>
-        <w:gridCol w:w="6400"/>
-      </w:tblGrid>
-      <w:tr>
-        <w:tc>
-          <w:tcPr>
-            <w:tcW w:type="dxa" w:w="11280"/>
-            <w:tcBorders>
-              <w:top w:val="none" w:color="FFFFFF" w:sz="0"/>
-              <w:left w:val="none" w:color="FFFFFF" w:sz="0"/>
-              <w:bottom w:val="none" w:color="FFFFFF" w:sz="0"/>
-              <w:right w:val="none" w:color="FFFFFF" w:sz="0"/>
-            </w:tcBorders>
-            <w:tcMar>
-              <w:right w:type="dxa" w:w="200"/>
-            </w:tcMar>
-          </w:tcPr>
-          <w:p>
-            <w:pPr>
-              <w:spacing w:before="120" w:after="60"/>
-            </w:pPr>
-            <w:r>
-              <w:rPr>
-                <w:b/>
-                <w:bCs/>
-                <w:color w:val="1F6B5E"/>
-                <w:sz w:val="40"/>
-                <w:szCs w:val="40"/>
-                <w:rFonts w:ascii="Arial Narrow" w:cs="Arial Narrow" w:eastAsia="Arial Narrow" w:hAnsi="Arial Narrow"/>
-              </w:rPr>
-              <w:t xml:space="preserve">Mali : Ce que l’on sait de la mort mystérieuse du jeune commerçant Bocar Ly</w:t>
-            </w:r>
-          </w:p>
-          <w:p>
-            <w:pPr>
-              <w:spacing w:before="120" w:after="20"/>
-            </w:pPr>
-            <w:r>
-              <w:rPr>
-                <w:b/>
-                <w:bCs/>
-                <w:color w:val="1F6B5E"/>
-                <w:sz w:val="28"/>
-                <w:szCs w:val="28"/>
-                <w:rFonts w:ascii="Calibri" w:cs="Calibri" w:eastAsia="Calibri" w:hAnsi="Calibri"/>
-              </w:rPr>
-              <w:t xml:space="preserve">Contexte</w:t>
-            </w:r>
-          </w:p>
-          <w:p>
-            <w:r>
-              <w:rPr>
-                <w:color w:val="1F2937"/>
-                <w:sz w:val="26"/>
-                <w:szCs w:val="26"/>
-                <w:rFonts w:ascii="Calibri" w:cs="Calibri" w:eastAsia="Calibri" w:hAnsi="Calibri"/>
-              </w:rPr>
-              <w:t xml:space="preserve">Fait rapporté le mardi 27 octobre 2026. Lieu : Mali. Actualité sécuritaire. Une seule source à ce stade (Mali 24) : à confirmer par un second média.</w:t>
-            </w:r>
-          </w:p>
-          <w:p>
-            <w:pPr>
-              <w:spacing w:before="120" w:after="20"/>
-            </w:pPr>
-            <w:r>
-              <w:rPr>
-                <w:b/>
-                <w:bCs/>
-                <w:color w:val="1F6B5E"/>
-                <w:sz w:val="28"/>
-                <w:szCs w:val="28"/>
-                <w:rFonts w:ascii="Calibri" w:cs="Calibri" w:eastAsia="Calibri" w:hAnsi="Calibri"/>
-              </w:rPr>
-              <w:t xml:space="preserve">Ce que rapportent les sources</w:t>
-            </w:r>
-          </w:p>
-          <w:p>
-            <w:pPr>
-              <w:spacing w:after="60"/>
-            </w:pPr>
-            <w:r>
-              <w:rPr>
-                <w:b/>
-                <w:bCs/>
-                <w:color w:val="1F2937"/>
-                <w:sz w:val="26"/>
-                <w:szCs w:val="26"/>
-                <w:rFonts w:ascii="Calibri" w:cs="Calibri" w:eastAsia="Calibri" w:hAnsi="Calibri"/>
-              </w:rPr>
-              <w:t xml:space="preserve">Mali 24 : </w:t>
-            </w:r>
-            <w:r>
-              <w:rPr>
-                <w:i/>
-                <w:iCs/>
-                <w:color w:val="1F2937"/>
-                <w:sz w:val="26"/>
-                <w:szCs w:val="26"/>
-                <w:rFonts w:ascii="Calibri" w:cs="Calibri" w:eastAsia="Calibri" w:hAnsi="Calibri"/>
-              </w:rPr>
-              <w:t xml:space="preserve">« Porté disparu depuis le vendredi 23 octobre 2026 à 19 heures, le corps sans vie du jeune Bocar Ly, commerçant L’article Mali : Ce que l’on sait de la mort mystérieuse du jeune commerçant Bocar Ly est apparu en premier sur Mali 24. »</w:t>
-            </w:r>
-          </w:p>
-          <w:p>
-            <w:pPr>
-              <w:spacing w:before="120" w:after="20"/>
-            </w:pPr>
-            <w:r>
-              <w:rPr>
-                <w:b/>
-                <w:bCs/>
-                <w:color w:val="1F6B5E"/>
-                <w:sz w:val="28"/>
-                <w:szCs w:val="28"/>
-                <w:rFonts w:ascii="Calibri" w:cs="Calibri" w:eastAsia="Calibri" w:hAnsi="Calibri"/>
-              </w:rPr>
-              <w:t xml:space="preserve">Enjeux sûreté</w:t>
-            </w:r>
-          </w:p>
-          <w:p>
-            <w:r>
-              <w:rPr>
-                <w:color w:val="1F2937"/>
-                <w:sz w:val="26"/>
-                <w:szCs w:val="26"/>
-                <w:rFonts w:ascii="Calibri" w:cs="Calibri" w:eastAsia="Calibri" w:hAnsi="Calibri"/>
-              </w:rPr>
-              <w:t xml:space="preserve">Fait sécuritaire à suivre : vérifier son incidence sur les sites, les itinéraires et les personnels présents dans la zone.</w:t>
-            </w:r>
-          </w:p>
-          <w:p>
-            <w:pPr>
-              <w:spacing w:before="120"/>
-            </w:pPr>
-            <w:r>
-              <w:rPr>
-                <w:b/>
-                <w:bCs/>
-                <w:color w:val="1F2937"/>
-                <w:sz w:val="26"/>
-                <w:szCs w:val="26"/>
-                <w:rFonts w:ascii="Calibri" w:cs="Calibri" w:eastAsia="Calibri" w:hAnsi="Calibri"/>
-              </w:rPr>
-              <w:t xml:space="preserve">Source : </w:t>
-            </w:r>
-            <w:r>
-              <w:rPr>
-                <w:color w:val="1F2937"/>
-                <w:sz w:val="26"/>
-                <w:szCs w:val="26"/>
-                <w:rFonts w:ascii="Calibri" w:cs="Calibri" w:eastAsia="Calibri" w:hAnsi="Calibri"/>
-              </w:rPr>
-            </w:r>
-            <w:hyperlink w:history="1" r:id="rIdkbiysog8fyv8rpdgugrgr">
-              <w:r>
-                <w:rPr>
-                  <w:u w:val="single"/>
-                  <w:color w:val="1F6B5E"/>
-                  <w:sz w:val="26"/>
-                  <w:szCs w:val="26"/>
-                  <w:rFonts w:ascii="Calibri" w:cs="Calibri" w:eastAsia="Calibri" w:hAnsi="Calibri"/>
-                </w:rPr>
-                <w:t xml:space="preserve">Mali 24</w:t>
-              </w:r>
-            </w:hyperlink>
-            <w:r>
-              <w:rPr>
-                <w:color w:val="1F2937"/>
-                <w:sz w:val="26"/>
-                <w:szCs w:val="26"/>
-                <w:rFonts w:ascii="Calibri" w:cs="Calibri" w:eastAsia="Calibri" w:hAnsi="Calibri"/>
-              </w:rPr>
-              <w:t xml:space="preserve"> — 27 octobre 2026, 14 h UTC</w:t>
-            </w:r>
-            <w:r>
-              <w:rPr>
-                <w:b/>
-                <w:bCs/>
-                <w:color w:val="1F2937"/>
-                <w:sz w:val="26"/>
-                <w:szCs w:val="26"/>
-                <w:rFonts w:ascii="Calibri" w:cs="Calibri" w:eastAsia="Calibri" w:hAnsi="Calibri"/>
-              </w:rPr>
-              <w:t xml:space="preserve">   ·   Cotation : Non confirmé</w:t>
-            </w:r>
-          </w:p>
-        </w:tc>
-        <w:tc>
-          <w:tcPr>
-            <w:tcW w:type="dxa" w:w="6400"/>
-            <w:tcBorders>
-              <w:top w:val="none" w:color="FFFFFF" w:sz="0"/>
-              <w:left w:val="none" w:color="FFFFFF" w:sz="0"/>
-              <w:bottom w:val="none" w:color="FFFFFF" w:sz="0"/>
-              <w:right w:val="none" w:color="FFFFFF" w:sz="0"/>
-            </w:tcBorders>
-          </w:tcPr>
-          <w:p>
-            <w:pPr>
-              <w:spacing w:before="200"/>
-              <w:jc w:val="center"/>
-            </w:pPr>
-            <w:r>
-              <w:drawing>
-                <wp:inline distT="0" distB="0" distL="0" distR="0">
-                  <wp:extent cx="3390900" cy="2857500"/>
-                  <wp:effectExtent t="0" r="0" b="0" l="0"/>
-                  <wp:docPr id="1" name="" descr="" title=""/>
-                  <wp:cNvGraphicFramePr>
-                    <a:graphicFrameLocks xmlns:a="http://schemas.openxmlformats.org/drawingml/2006/main" noChangeAspect="1"/>
-                  </wp:cNvGraphicFramePr>
-                  <a:graphic xmlns:a="http://schemas.openxmlformats.org/drawingml/2006/main">
-                    <a:graphicData uri="http://schemas.openxmlformats.org/drawingml/2006/picture">
-                      <pic:pic xmlns:pic="http://schemas.openxmlformats.org/drawingml/2006/picture">
-                        <pic:nvPicPr>
-                          <pic:cNvPr id="0" name="" descr=""/>
-                          <pic:cNvPicPr>
-                            <a:picLocks noChangeAspect="1" noChangeArrowheads="1"/>
-                          </pic:cNvPicPr>
-                        </pic:nvPicPr>
-                        <pic:blipFill>
-                          <a:blip r:embed="rId10" cstate="none"/>
-                          <a:srcRect/>
-                          <a:stretch>
-                            <a:fillRect/>
-                          </a:stretch>
-                        </pic:blipFill>
-                        <pic:spPr bwMode="auto">
-                          <a:xfrm>
-                            <a:off x="0" y="0"/>
-                            <a:ext cx="3390900" cy="2857500"/>
-                          </a:xfrm>
-                          <a:prstGeom prst="rect">
-                            <a:avLst/>
-                          </a:prstGeom>
-                        </pic:spPr>
-                      </pic:pic>
-                    </a:graphicData>
-                  </a:graphic>
-                </wp:inline>
-              </w:drawing>
-            </w:r>
-          </w:p>
-          <w:p>
-            <w:pPr>
-              <w:jc w:val="right"/>
-            </w:pPr>
-            <w:hyperlink w:history="1" r:id="rId7pjkc7nrtfkwhptumzrzb">
-              <w:r>
-                <w:rPr>
-                  <w:u w:val="single"/>
-                  <w:color w:val="1F6B5E"/>
-                  <w:sz w:val="16"/>
-                  <w:szCs w:val="16"/>
-                  <w:rFonts w:ascii="Calibri" w:cs="Calibri" w:eastAsia="Calibri" w:hAnsi="Calibri"/>
-                </w:rPr>
-                <w:t xml:space="preserve">Photo : © mali24.info</w:t>
-              </w:r>
-            </w:hyperlink>
-          </w:p>
-        </w:tc>
-      </w:tr>
-    </w:tbl>
+        <w:t xml:space="preserve">Indice de confiance : moyenne (incident vérifié le plus récent : 121 jours ; 4 signaux du jour)</w:t>
+      </w:r>
+    </w:p>
+    <w:p>
+      <w:pPr>
+        <w:spacing w:before="120" w:after="60"/>
+      </w:pPr>
+      <w:r>
+        <w:rPr>
+          <w:b/>
+          <w:bCs/>
+          <w:color w:val="1F6B5E"/>
+          <w:sz w:val="40"/>
+          <w:szCs w:val="40"/>
+          <w:rFonts w:ascii="Arial Narrow" w:cs="Arial Narrow" w:eastAsia="Arial Narrow" w:hAnsi="Arial Narrow"/>
+        </w:rPr>
+        <w:t xml:space="preserve">Mali : Ce que l’on sait de la mort mystérieuse du jeune commerçant Bocar Ly</w:t>
+      </w:r>
+    </w:p>
+    <w:p>
+      <w:pPr>
+        <w:spacing w:before="120" w:after="20"/>
+      </w:pPr>
+      <w:r>
+        <w:rPr>
+          <w:b/>
+          <w:bCs/>
+          <w:color w:val="1F6B5E"/>
+          <w:sz w:val="28"/>
+          <w:szCs w:val="28"/>
+          <w:rFonts w:ascii="Calibri" w:cs="Calibri" w:eastAsia="Calibri" w:hAnsi="Calibri"/>
+        </w:rPr>
+        <w:t xml:space="preserve">Contexte</w:t>
+      </w:r>
+    </w:p>
+    <w:p>
+      <w:r>
+        <w:rPr>
+          <w:color w:val="1F2937"/>
+          <w:sz w:val="26"/>
+          <w:szCs w:val="26"/>
+          <w:rFonts w:ascii="Calibri" w:cs="Calibri" w:eastAsia="Calibri" w:hAnsi="Calibri"/>
+        </w:rPr>
+        <w:t xml:space="preserve">Fait rapporté le mardi 27 octobre 2026. Lieu : Mali. Actualité sécuritaire. Une seule source à ce stade (Mali 24) : à confirmer par un second média.</w:t>
+      </w:r>
+    </w:p>
+    <w:p>
+      <w:pPr>
+        <w:spacing w:before="120" w:after="20"/>
+      </w:pPr>
+      <w:r>
+        <w:rPr>
+          <w:b/>
+          <w:bCs/>
+          <w:color w:val="1F6B5E"/>
+          <w:sz w:val="28"/>
+          <w:szCs w:val="28"/>
+          <w:rFonts w:ascii="Calibri" w:cs="Calibri" w:eastAsia="Calibri" w:hAnsi="Calibri"/>
+        </w:rPr>
+        <w:t xml:space="preserve">Ce que rapportent les sources</w:t>
+      </w:r>
+    </w:p>
+    <w:p>
+      <w:pPr>
+        <w:spacing w:after="60"/>
+      </w:pPr>
+      <w:r>
+        <w:rPr>
+          <w:b/>
+          <w:bCs/>
+          <w:color w:val="1F2937"/>
+          <w:sz w:val="26"/>
+          <w:szCs w:val="26"/>
+          <w:rFonts w:ascii="Calibri" w:cs="Calibri" w:eastAsia="Calibri" w:hAnsi="Calibri"/>
+        </w:rPr>
+        <w:t xml:space="preserve">Mali 24 : </w:t>
+      </w:r>
+      <w:r>
+        <w:rPr>
+          <w:i/>
+          <w:iCs/>
+          <w:color w:val="1F2937"/>
+          <w:sz w:val="26"/>
+          <w:szCs w:val="26"/>
+          <w:rFonts w:ascii="Calibri" w:cs="Calibri" w:eastAsia="Calibri" w:hAnsi="Calibri"/>
+        </w:rPr>
+        <w:t xml:space="preserve">« Porté disparu depuis le vendredi 23 octobre 2026 à 19 heures, le corps sans vie du jeune Bocar Ly, commerçant L’article Mali : Ce que l’on sait de la mort mystérieuse du jeune commerçant Bocar Ly est apparu en premier sur Mali 24. »</w:t>
+      </w:r>
+    </w:p>
+    <w:p>
+      <w:pPr>
+        <w:spacing w:before="120" w:after="20"/>
+      </w:pPr>
+      <w:r>
+        <w:rPr>
+          <w:b/>
+          <w:bCs/>
+          <w:color w:val="1F6B5E"/>
+          <w:sz w:val="28"/>
+          <w:szCs w:val="28"/>
+          <w:rFonts w:ascii="Calibri" w:cs="Calibri" w:eastAsia="Calibri" w:hAnsi="Calibri"/>
+        </w:rPr>
+        <w:t xml:space="preserve">Enjeux sûreté</w:t>
+      </w:r>
+    </w:p>
+    <w:p>
+      <w:r>
+        <w:rPr>
+          <w:color w:val="1F2937"/>
+          <w:sz w:val="26"/>
+          <w:szCs w:val="26"/>
+          <w:rFonts w:ascii="Calibri" w:cs="Calibri" w:eastAsia="Calibri" w:hAnsi="Calibri"/>
+        </w:rPr>
+        <w:t xml:space="preserve">Fait sécuritaire à suivre : vérifier son incidence sur les sites, les itinéraires et les personnels présents dans la zone.</w:t>
+      </w:r>
+    </w:p>
+    <w:p>
+      <w:pPr>
+        <w:spacing w:before="120"/>
+      </w:pPr>
+      <w:r>
+        <w:rPr>
+          <w:b/>
+          <w:bCs/>
+          <w:color w:val="1F2937"/>
+          <w:sz w:val="26"/>
+          <w:szCs w:val="26"/>
+          <w:rFonts w:ascii="Calibri" w:cs="Calibri" w:eastAsia="Calibri" w:hAnsi="Calibri"/>
+        </w:rPr>
+        <w:t xml:space="preserve">Source : </w:t>
+      </w:r>
+      <w:r>
+        <w:rPr>
+          <w:color w:val="1F2937"/>
+          <w:sz w:val="26"/>
+          <w:szCs w:val="26"/>
+          <w:rFonts w:ascii="Calibri" w:cs="Calibri" w:eastAsia="Calibri" w:hAnsi="Calibri"/>
+        </w:rPr>
+      </w:r>
+      <w:hyperlink w:history="1" r:id="rIdt9qykickyjesuatjb8r6v">
+        <w:r>
+          <w:rPr>
+            <w:u w:val="single"/>
+            <w:color w:val="1F6B5E"/>
+            <w:sz w:val="26"/>
+            <w:szCs w:val="26"/>
+            <w:rFonts w:ascii="Calibri" w:cs="Calibri" w:eastAsia="Calibri" w:hAnsi="Calibri"/>
+          </w:rPr>
+          <w:t xml:space="preserve">Mali 24</w:t>
+        </w:r>
+      </w:hyperlink>
+      <w:r>
+        <w:rPr>
+          <w:color w:val="1F2937"/>
+          <w:sz w:val="26"/>
+          <w:szCs w:val="26"/>
+          <w:rFonts w:ascii="Calibri" w:cs="Calibri" w:eastAsia="Calibri" w:hAnsi="Calibri"/>
+        </w:rPr>
+        <w:t xml:space="preserve"> — 27 octobre 2026, 14 h UTC</w:t>
+      </w:r>
+      <w:r>
+        <w:rPr>
+          <w:b/>
+          <w:bCs/>
+          <w:color w:val="1F2937"/>
+          <w:sz w:val="26"/>
+          <w:szCs w:val="26"/>
+          <w:rFonts w:ascii="Calibri" w:cs="Calibri" w:eastAsia="Calibri" w:hAnsi="Calibri"/>
+        </w:rPr>
+        <w:t xml:space="preserve">   ·   Cotation : Non confirmé</w:t>
+      </w:r>
+    </w:p>
     <w:p>
       <w:pPr>
         <w:pageBreakBefore/>
@@ -6891,7 +6795,7 @@
         </w:rPr>
         <w:t xml:space="preserve">▪  Source : </w:t>
       </w:r>
-      <w:hyperlink w:history="1" r:id="rId-ylne54d65-bvaoycsztx">
+      <w:hyperlink w:history="1" r:id="rId1xas4mg_uhbmp6ko1iqmx">
         <w:r>
           <w:rPr>
             <w:u w:val="single"/>
@@ -6964,7 +6868,7 @@
         </w:rPr>
         <w:t xml:space="preserve">▪  Sources : </w:t>
       </w:r>
-      <w:hyperlink w:history="1" r:id="rIddauq-dhkcssa4xzcehoof">
+      <w:hyperlink w:history="1" r:id="rIdltwiftfpblcrhp785myru">
         <w:r>
           <w:rPr>
             <w:u w:val="single"/>
@@ -7037,7 +6941,7 @@
         </w:rPr>
         <w:t xml:space="preserve">▪  Source : </w:t>
       </w:r>
-      <w:hyperlink w:history="1" r:id="rIdi-ayq95jjecidplllthyg">
+      <w:hyperlink w:history="1" r:id="rId_hybpuzntzgocewmq5nue">
         <w:r>
           <w:rPr>
             <w:u w:val="single"/>
@@ -7099,7 +7003,7 @@
         </w:rPr>
         <w:t xml:space="preserve">▪  Source : </w:t>
       </w:r>
-      <w:hyperlink w:history="1" r:id="rIdjmudsyl_qwmy_oj6vjvhz">
+      <w:hyperlink w:history="1" r:id="rIdqluxkwzudjpqlkhjsgoun">
         <w:r>
           <w:rPr>
             <w:u w:val="single"/>
@@ -7161,7 +7065,7 @@
         </w:rPr>
         <w:t xml:space="preserve">▪  Source : </w:t>
       </w:r>
-      <w:hyperlink w:history="1" r:id="rIdm5iqt3lelsqx17q3adog7">
+      <w:hyperlink w:history="1" r:id="rIdlhejjo6g0mxblo6vpbe-d">
         <w:r>
           <w:rPr>
             <w:u w:val="single"/>
@@ -7423,7 +7327,7 @@
         </w:rPr>
         <w:t xml:space="preserve">▪  Source : </w:t>
       </w:r>
-      <w:hyperlink w:history="1" r:id="rIdsnxfvzh5pmolrbbl7fgyz">
+      <w:hyperlink w:history="1" r:id="rId3ocziv2ds2r5izeaqvwak">
         <w:r>
           <w:rPr>
             <w:u w:val="single"/>
@@ -7485,7 +7389,7 @@
         </w:rPr>
         <w:t xml:space="preserve">▪  Sources : </w:t>
       </w:r>
-      <w:hyperlink w:history="1" r:id="rId-waldko3ghqx3mmv9mpyn">
+      <w:hyperlink w:history="1" r:id="rIdcikunnkhookx0ht1i6weq">
         <w:r>
           <w:rPr>
             <w:u w:val="single"/>
@@ -7558,7 +7462,7 @@
         </w:rPr>
         <w:t xml:space="preserve">▪  Source : </w:t>
       </w:r>
-      <w:hyperlink w:history="1" r:id="rIdntki2khw4ggqihhxyxfzv">
+      <w:hyperlink w:history="1" r:id="rIdnwqobn8lirltj37l3_jec">
         <w:r>
           <w:rPr>
             <w:u w:val="single"/>
@@ -7620,7 +7524,7 @@
         </w:rPr>
         <w:t xml:space="preserve">▪  Source : </w:t>
       </w:r>
-      <w:hyperlink w:history="1" r:id="rIdk8anf20rtjtyc-cem13rr">
+      <w:hyperlink w:history="1" r:id="rId__uzwxje2yyxfbwah9d_8">
         <w:r>
           <w:rPr>
             <w:u w:val="single"/>
@@ -7874,7 +7778,7 @@
           <w:szCs w:val="22"/>
           <w:rFonts w:ascii="Calibri" w:cs="Calibri" w:eastAsia="Calibri" w:hAnsi="Calibri"/>
         </w:rPr>
-        <w:t xml:space="preserve">Indice de confiance : moyenne (incident vérifié le plus récent : 118 jours ; 3 signaux du jour)</w:t>
+        <w:t xml:space="preserve">Indice de confiance : faible (incident vérifié le plus récent : 119 jours ; aucun signal du jour)</w:t>
       </w:r>
     </w:p>
     <w:tbl>
@@ -7920,7 +7824,7 @@
                 <w:szCs w:val="40"/>
                 <w:rFonts w:ascii="Arial Narrow" w:cs="Arial Narrow" w:eastAsia="Arial Narrow" w:hAnsi="Arial Narrow"/>
               </w:rPr>
-              <w:t xml:space="preserve">Tchad-Niger : une nouvelle escalade entre Mahamat Idriss Déby et Abdourahamane Tiani</w:t>
+              <w:t xml:space="preserve">Frappe de drone à Agadez : le Niger convoque l’ambassadeur du Tchad et annonce des recours internationaux</w:t>
             </w:r>
           </w:p>
           <w:p>
@@ -7947,7 +7851,7 @@
                 <w:szCs w:val="26"/>
                 <w:rFonts w:ascii="Calibri" w:cs="Calibri" w:eastAsia="Calibri" w:hAnsi="Calibri"/>
               </w:rPr>
-              <w:t xml:space="preserve">Fait rapporté le mardi 27 octobre 2026. Lieu : Niamey, Niger. Actualité politique. Une seule source à ce stade (Jeune Afrique) : à confirmer par un second média.</w:t>
+              <w:t xml:space="preserve">Fait rapporté le mercredi 28 octobre 2026. Lieu : Niamey, Niger. Actualité politique. Repris par 8 médias distincts (Maliactu, RFI Afrique, Malijet, ANP — Agence Nigérienne Presse, Journal du Tchad, Tchadinfos, Africanews — Chaine panafricaine, Africanews) : le fait est recoupé.</w:t>
             </w:r>
           </w:p>
           <w:p>
@@ -7979,7 +7883,7 @@
                 <w:szCs w:val="26"/>
                 <w:rFonts w:ascii="Calibri" w:cs="Calibri" w:eastAsia="Calibri" w:hAnsi="Calibri"/>
               </w:rPr>
-              <w:t xml:space="preserve">Jeune Afrique : </w:t>
+              <w:t xml:space="preserve">Maliactu : </w:t>
             </w:r>
             <w:r>
               <w:rPr>
@@ -7990,7 +7894,34 @@
                 <w:szCs w:val="26"/>
                 <w:rFonts w:ascii="Calibri" w:cs="Calibri" w:eastAsia="Calibri" w:hAnsi="Calibri"/>
               </w:rPr>
-              <w:t xml:space="preserve">« Niamey accuse N’Djamena d’avoir lancé une frappe de drone sur son territoire, avec le soutien de la France. Une charge qui ravive la méfiance entre les deux voisins. »</w:t>
+              <w:t xml:space="preserve">« Mali Actu - maliactu.net - Mali Actualités, Les Actus et Informations sur le Mali Mali Actu Frappe de drone à Agadez : le Niger convoque l’ambassadeur du Tchad et annonce des recours internationaux Les relations entre Niamey et N’Djamena connaissent une nouvelle tension après une frappe de drone signalée le 24 octobre dans la région nigérienne d’Agadez. »</w:t>
+            </w:r>
+          </w:p>
+          <w:p>
+            <w:pPr>
+              <w:spacing w:after="60"/>
+            </w:pPr>
+            <w:r>
+              <w:rPr>
+                <w:b/>
+                <w:bCs/>
+                <w:color w:val="1F2937"/>
+                <w:sz w:val="26"/>
+                <w:szCs w:val="26"/>
+                <w:rFonts w:ascii="Calibri" w:cs="Calibri" w:eastAsia="Calibri" w:hAnsi="Calibri"/>
+              </w:rPr>
+              <w:t xml:space="preserve">RFI Afrique : </w:t>
+            </w:r>
+            <w:r>
+              <w:rPr>
+                <w:i/>
+                <w:iCs/>
+                <w:color w:val="1F2937"/>
+                <w:sz w:val="26"/>
+                <w:szCs w:val="26"/>
+                <w:rFonts w:ascii="Calibri" w:cs="Calibri" w:eastAsia="Calibri" w:hAnsi="Calibri"/>
+              </w:rPr>
+              <w:t xml:space="preserve">« Le Niger accuse son voisin d’avoir mené « une frappe aérienne par drone menée depuis le territoire du Tchad » et à laquelle aurait, selon lui, participé la France. L’incident aurait eu lieu le 24 octobre à 1 heure du matin à l’est d’Emi Lulu, non loin des frontières algérienne et libyenne. »</w:t>
             </w:r>
           </w:p>
           <w:p>
@@ -8033,7 +7964,7 @@
                 <w:szCs w:val="26"/>
                 <w:rFonts w:ascii="Calibri" w:cs="Calibri" w:eastAsia="Calibri" w:hAnsi="Calibri"/>
               </w:rPr>
-              <w:t xml:space="preserve">Source : </w:t>
+              <w:t xml:space="preserve">Sources : </w:t>
             </w:r>
             <w:r>
               <w:rPr>
@@ -8043,7 +7974,7 @@
                 <w:rFonts w:ascii="Calibri" w:cs="Calibri" w:eastAsia="Calibri" w:hAnsi="Calibri"/>
               </w:rPr>
             </w:r>
-            <w:hyperlink w:history="1" r:id="rIdwdbzbfrfp_uvxzulvuopo">
+            <w:hyperlink w:history="1" r:id="rId43hsxnqxrsblrdfgc2xgp">
               <w:r>
                 <w:rPr>
                   <w:u w:val="single"/>
@@ -8052,7 +7983,7 @@
                   <w:szCs w:val="26"/>
                   <w:rFonts w:ascii="Calibri" w:cs="Calibri" w:eastAsia="Calibri" w:hAnsi="Calibri"/>
                 </w:rPr>
-                <w:t xml:space="preserve">Jeune Afrique</w:t>
+                <w:t xml:space="preserve">Maliactu</w:t>
               </w:r>
             </w:hyperlink>
             <w:r>
@@ -8062,7 +7993,70 @@
                 <w:szCs w:val="26"/>
                 <w:rFonts w:ascii="Calibri" w:cs="Calibri" w:eastAsia="Calibri" w:hAnsi="Calibri"/>
               </w:rPr>
-              <w:t xml:space="preserve"> — 27 octobre 2026, 16 h UTC</w:t>
+              <w:t xml:space="preserve"> · </w:t>
+            </w:r>
+            <w:hyperlink w:history="1" r:id="rId3ketzojwokcasbbvcyx45">
+              <w:r>
+                <w:rPr>
+                  <w:u w:val="single"/>
+                  <w:color w:val="1F6B5E"/>
+                  <w:sz w:val="26"/>
+                  <w:szCs w:val="26"/>
+                  <w:rFonts w:ascii="Calibri" w:cs="Calibri" w:eastAsia="Calibri" w:hAnsi="Calibri"/>
+                </w:rPr>
+                <w:t xml:space="preserve">RFI Afrique</w:t>
+              </w:r>
+            </w:hyperlink>
+            <w:r>
+              <w:rPr>
+                <w:color w:val="1F2937"/>
+                <w:sz w:val="26"/>
+                <w:szCs w:val="26"/>
+                <w:rFonts w:ascii="Calibri" w:cs="Calibri" w:eastAsia="Calibri" w:hAnsi="Calibri"/>
+              </w:rPr>
+              <w:t xml:space="preserve"> · </w:t>
+            </w:r>
+            <w:hyperlink w:history="1" r:id="rIdpm3cpjzimo58_lll8wgcx">
+              <w:r>
+                <w:rPr>
+                  <w:u w:val="single"/>
+                  <w:color w:val="1F6B5E"/>
+                  <w:sz w:val="26"/>
+                  <w:szCs w:val="26"/>
+                  <w:rFonts w:ascii="Calibri" w:cs="Calibri" w:eastAsia="Calibri" w:hAnsi="Calibri"/>
+                </w:rPr>
+                <w:t xml:space="preserve">Malijet</w:t>
+              </w:r>
+            </w:hyperlink>
+            <w:r>
+              <w:rPr>
+                <w:color w:val="1F2937"/>
+                <w:sz w:val="26"/>
+                <w:szCs w:val="26"/>
+                <w:rFonts w:ascii="Calibri" w:cs="Calibri" w:eastAsia="Calibri" w:hAnsi="Calibri"/>
+              </w:rPr>
+              <w:t xml:space="preserve"> · </w:t>
+            </w:r>
+            <w:hyperlink w:history="1" r:id="rIdlqa9ljrp3qgyaozfcteck">
+              <w:r>
+                <w:rPr>
+                  <w:u w:val="single"/>
+                  <w:color w:val="1F6B5E"/>
+                  <w:sz w:val="26"/>
+                  <w:szCs w:val="26"/>
+                  <w:rFonts w:ascii="Calibri" w:cs="Calibri" w:eastAsia="Calibri" w:hAnsi="Calibri"/>
+                </w:rPr>
+                <w:t xml:space="preserve">ANP — Agence Nigérienne Presse</w:t>
+              </w:r>
+            </w:hyperlink>
+            <w:r>
+              <w:rPr>
+                <w:color w:val="1F2937"/>
+                <w:sz w:val="26"/>
+                <w:szCs w:val="26"/>
+                <w:rFonts w:ascii="Calibri" w:cs="Calibri" w:eastAsia="Calibri" w:hAnsi="Calibri"/>
+              </w:rPr>
+              <w:t xml:space="preserve"> · Journal du Tchad · Tchadinfos · Africanews — Chaine panafricaine · Africanews — 28 octobre 2026, 7 h UTC</w:t>
             </w:r>
             <w:r>
               <w:rPr>
@@ -8073,7 +8067,7 @@
                 <w:szCs w:val="26"/>
                 <w:rFonts w:ascii="Calibri" w:cs="Calibri" w:eastAsia="Calibri" w:hAnsi="Calibri"/>
               </w:rPr>
-              <w:t xml:space="preserve">   ·   Cotation : Probable</w:t>
+              <w:t xml:space="preserve">   ·   Cotation : Confirmé</w:t>
             </w:r>
           </w:p>
         </w:tc>
@@ -8111,7 +8105,7 @@
                           </pic:cNvPicPr>
                         </pic:nvPicPr>
                         <pic:blipFill>
-                          <a:blip r:embed="rId11" cstate="none"/>
+                          <a:blip r:embed="rId10" cstate="none"/>
                           <a:srcRect/>
                           <a:stretch>
                             <a:fillRect/>
@@ -8137,7 +8131,7 @@
             <w:pPr>
               <w:jc w:val="right"/>
             </w:pPr>
-            <w:hyperlink w:history="1" r:id="rIdo26y1apjudzqz5b0xm980">
+            <w:hyperlink w:history="1" r:id="rId2-pfklxfenjfqws2xbhrm">
               <w:r>
                 <w:rPr>
                   <w:u w:val="single"/>
@@ -8146,7 +8140,7 @@
                   <w:szCs w:val="16"/>
                   <w:rFonts w:ascii="Calibri" w:cs="Calibri" w:eastAsia="Calibri" w:hAnsi="Calibri"/>
                 </w:rPr>
-                <w:t xml:space="preserve">Photo : © jeuneafrique.com</w:t>
+                <w:t xml:space="preserve">Photo : © maliactu.net</w:t>
               </w:r>
             </w:hyperlink>
           </w:p>
@@ -8385,7 +8379,7 @@
           <w:szCs w:val="28"/>
           <w:rFonts w:ascii="Calibri" w:cs="Calibri" w:eastAsia="Calibri" w:hAnsi="Calibri"/>
         </w:rPr>
-        <w:t xml:space="preserve">FRAPPE DE DRONE AU NIGER : NIAMEY ACCUSE LE TCHAD, N’DJAMENA REJETTE LES ACCUSATIONS</w:t>
+        <w:t xml:space="preserve">NIGER GOVERNOR’S CONVOY CRASH KILLS FOUR STUDENTS, DRIVER</w:t>
       </w:r>
     </w:p>
     <w:p>
@@ -8401,7 +8395,7 @@
         </w:rPr>
         <w:t xml:space="preserve">▪  Sources : </w:t>
       </w:r>
-      <w:hyperlink w:history="1" r:id="rIde6zvdyu63rgbejgk03se1">
+      <w:hyperlink w:history="1" r:id="rIdvchbbg47sdaxga17ngyvh">
         <w:r>
           <w:rPr>
             <w:u w:val="single"/>
@@ -8410,7 +8404,7 @@
             <w:szCs w:val="26"/>
             <w:rFonts w:ascii="Calibri" w:cs="Calibri" w:eastAsia="Calibri" w:hAnsi="Calibri"/>
           </w:rPr>
-          <w:t xml:space="preserve">Journal du Tchad · Tchadinfos · ANP — Agence Nigérienne Presse</w:t>
+          <w:t xml:space="preserve">Premium Times · Vanguard</w:t>
         </w:r>
       </w:hyperlink>
       <w:r>
@@ -8420,7 +8414,7 @@
           <w:szCs w:val="26"/>
           <w:rFonts w:ascii="Calibri" w:cs="Calibri" w:eastAsia="Calibri" w:hAnsi="Calibri"/>
         </w:rPr>
-        <w:t xml:space="preserve"> — 27 octobre 2026, 13 h UTC</w:t>
+        <w:t xml:space="preserve"> — 28 octobre 2026, 6 h UTC</w:t>
       </w:r>
       <w:r>
         <w:rPr>
@@ -8458,7 +8452,7 @@
           <w:szCs w:val="28"/>
           <w:rFonts w:ascii="Calibri" w:cs="Calibri" w:eastAsia="Calibri" w:hAnsi="Calibri"/>
         </w:rPr>
-        <w:t xml:space="preserve">LE NIGER AFFIRME QU'UNE FRAPPE DE DRONE DU TCHAD A TUÉ DEUX CIVILS</w:t>
+        <w:t xml:space="preserve">TCHAD-NIGER : UNE NOUVELLE ESCALADE ENTRE MAHAMAT IDRISS DÉBY ET ABDOURAHAMANE TIANI</w:t>
       </w:r>
     </w:p>
     <w:p>
@@ -8472,9 +8466,9 @@
           <w:szCs w:val="26"/>
           <w:rFonts w:ascii="Calibri" w:cs="Calibri" w:eastAsia="Calibri" w:hAnsi="Calibri"/>
         </w:rPr>
-        <w:t xml:space="preserve">▪  Sources : </w:t>
-      </w:r>
-      <w:hyperlink w:history="1" r:id="rIdrznsss8hxul_-gpsn8x_0">
+        <w:t xml:space="preserve">▪  Source : </w:t>
+      </w:r>
+      <w:hyperlink w:history="1" r:id="rId9an2o3h0hgj2ucbbscent">
         <w:r>
           <w:rPr>
             <w:u w:val="single"/>
@@ -8483,7 +8477,7 @@
             <w:szCs w:val="26"/>
             <w:rFonts w:ascii="Calibri" w:cs="Calibri" w:eastAsia="Calibri" w:hAnsi="Calibri"/>
           </w:rPr>
-          <w:t xml:space="preserve">Africanews — Chaine panafricaine · Africanews</w:t>
+          <w:t xml:space="preserve">Jeune Afrique</w:t>
         </w:r>
       </w:hyperlink>
       <w:r>
@@ -8493,7 +8487,7 @@
           <w:szCs w:val="26"/>
           <w:rFonts w:ascii="Calibri" w:cs="Calibri" w:eastAsia="Calibri" w:hAnsi="Calibri"/>
         </w:rPr>
-        <w:t xml:space="preserve"> — 27 octobre 2026, 9 h UTC</w:t>
+        <w:t xml:space="preserve"> — 27 octobre 2026, 16 h UTC</w:t>
       </w:r>
       <w:r>
         <w:rPr>
@@ -8504,7 +8498,7 @@
           <w:szCs w:val="26"/>
           <w:rFonts w:ascii="Calibri" w:cs="Calibri" w:eastAsia="Calibri" w:hAnsi="Calibri"/>
         </w:rPr>
-        <w:t xml:space="preserve">   ·   Cotation : Confirmé</w:t>
+        <w:t xml:space="preserve">   ·   Cotation : Probable</w:t>
       </w:r>
     </w:p>
     <w:p>
@@ -8531,7 +8525,7 @@
           <w:szCs w:val="28"/>
           <w:rFonts w:ascii="Calibri" w:cs="Calibri" w:eastAsia="Calibri" w:hAnsi="Calibri"/>
         </w:rPr>
-        <w:t xml:space="preserve">LE NIGER DÉNONCE UNE ATTAQUE DE DRONE DU TCHAD AVEC «L’APPUI DE LA FRANCE»</w:t>
+        <w:t xml:space="preserve">LE PAYS DÉNONCE UNE ATTAQUE DE DRONE DU TCHAD AVEC «L'APPUI DE LA FRANCE»</w:t>
       </w:r>
     </w:p>
     <w:p>
@@ -8545,9 +8539,9 @@
           <w:szCs w:val="26"/>
           <w:rFonts w:ascii="Calibri" w:cs="Calibri" w:eastAsia="Calibri" w:hAnsi="Calibri"/>
         </w:rPr>
-        <w:t xml:space="preserve">▪  Source : </w:t>
-      </w:r>
-      <w:hyperlink w:history="1" r:id="rId4e7mk8c8v7qowzehuweup">
+        <w:t xml:space="preserve">▪  Sources : </w:t>
+      </w:r>
+      <w:hyperlink w:history="1" r:id="rIdlukcutkqa2mmaio0ot-nk">
         <w:r>
           <w:rPr>
             <w:u w:val="single"/>
@@ -8556,7 +8550,7 @@
             <w:szCs w:val="26"/>
             <w:rFonts w:ascii="Calibri" w:cs="Calibri" w:eastAsia="Calibri" w:hAnsi="Calibri"/>
           </w:rPr>
-          <w:t xml:space="preserve">RFI Afrique</w:t>
+          <w:t xml:space="preserve">AllAfrica (NE) · RFI Afrique</w:t>
         </w:r>
       </w:hyperlink>
       <w:r>
@@ -8566,7 +8560,7 @@
           <w:szCs w:val="26"/>
           <w:rFonts w:ascii="Calibri" w:cs="Calibri" w:eastAsia="Calibri" w:hAnsi="Calibri"/>
         </w:rPr>
-        <w:t xml:space="preserve"> — 27 octobre 2026, 5 h UTC</w:t>
+        <w:t xml:space="preserve"> — 27 octobre 2026, 9 h UTC</w:t>
       </w:r>
       <w:r>
         <w:rPr>
@@ -8620,7 +8614,7 @@
         </w:rPr>
         <w:t xml:space="preserve">▪  Source : </w:t>
       </w:r>
-      <w:hyperlink w:history="1" r:id="rIdz6bzhlvbycy7iethty3nk">
+      <w:hyperlink w:history="1" r:id="rIdz-eiqmf2_nx_4rlm7cwkz">
         <w:r>
           <w:rPr>
             <w:u w:val="single"/>
@@ -8682,7 +8676,7 @@
         </w:rPr>
         <w:t xml:space="preserve">▪  Source : </w:t>
       </w:r>
-      <w:hyperlink w:history="1" r:id="rId4_rh-gp-7kzyuym5ohb5w">
+      <w:hyperlink w:history="1" r:id="rIduxlvywum1fi6xsdevoqf_">
         <w:r>
           <w:rPr>
             <w:u w:val="single"/>
@@ -8947,7 +8941,7 @@
           <w:szCs w:val="28"/>
           <w:rFonts w:ascii="Calibri" w:cs="Calibri" w:eastAsia="Calibri" w:hAnsi="Calibri"/>
         </w:rPr>
-        <w:t xml:space="preserve">4 STUDENTS, ONE LADY KILLED IN NIGER GOVERNOR’S CONVOY ROAD CRASH</w:t>
+        <w:t xml:space="preserve">POURQUOI N’DJAMÉNA SORT ENFIN DE SON SILENCE FACE À NIAMEY ?</w:t>
       </w:r>
     </w:p>
     <w:p>
@@ -8963,80 +8957,7 @@
         </w:rPr>
         <w:t xml:space="preserve">▪  Source : </w:t>
       </w:r>
-      <w:hyperlink w:history="1" r:id="rId1qpqkhke5mfg6duuygi96">
-        <w:r>
-          <w:rPr>
-            <w:u w:val="single"/>
-            <w:color w:val="1F6B5E"/>
-            <w:sz w:val="26"/>
-            <w:szCs w:val="26"/>
-            <w:rFonts w:ascii="Calibri" w:cs="Calibri" w:eastAsia="Calibri" w:hAnsi="Calibri"/>
-          </w:rPr>
-          <w:t xml:space="preserve">Vanguard</w:t>
-        </w:r>
-      </w:hyperlink>
-      <w:r>
-        <w:rPr>
-          <w:color w:val="1F2937"/>
-          <w:sz w:val="26"/>
-          <w:szCs w:val="26"/>
-          <w:rFonts w:ascii="Calibri" w:cs="Calibri" w:eastAsia="Calibri" w:hAnsi="Calibri"/>
-        </w:rPr>
-        <w:t xml:space="preserve"> — 27 octobre 2026, 19 h UTC</w:t>
-      </w:r>
-      <w:r>
-        <w:rPr>
-          <w:b/>
-          <w:bCs/>
-          <w:color w:val="1F2937"/>
-          <w:sz w:val="26"/>
-          <w:szCs w:val="26"/>
-          <w:rFonts w:ascii="Calibri" w:cs="Calibri" w:eastAsia="Calibri" w:hAnsi="Calibri"/>
-        </w:rPr>
-        <w:t xml:space="preserve">   ·   Cotation : Probable</w:t>
-      </w:r>
-    </w:p>
-    <w:p>
-      <w:pPr>
-        <w:spacing w:before="160"/>
-        <w:ind w:left="360"/>
-      </w:pPr>
-      <w:r>
-        <w:rPr>
-          <w:color w:val="1F6B5E"/>
-          <w:sz w:val="28"/>
-          <w:szCs w:val="28"/>
-          <w:rFonts w:ascii="Calibri" w:cs="Calibri" w:eastAsia="Calibri" w:hAnsi="Calibri"/>
-        </w:rPr>
-        <w:t xml:space="preserve">❑  </w:t>
-      </w:r>
-      <w:r>
-        <w:rPr>
-          <w:b/>
-          <w:bCs/>
-          <w:u w:val="single"/>
-          <w:color w:val="1F6B5E"/>
-          <w:sz w:val="28"/>
-          <w:szCs w:val="28"/>
-          <w:rFonts w:ascii="Calibri" w:cs="Calibri" w:eastAsia="Calibri" w:hAnsi="Calibri"/>
-        </w:rPr>
-        <w:t xml:space="preserve">POURQUOI N’DJAMÉNA SORT ENFIN DE SON SILENCE FACE À NIAMEY ?</w:t>
-      </w:r>
-    </w:p>
-    <w:p>
-      <w:pPr>
-        <w:ind w:left="720"/>
-      </w:pPr>
-      <w:r>
-        <w:rPr>
-          <w:color w:val="1F2937"/>
-          <w:sz w:val="26"/>
-          <w:szCs w:val="26"/>
-          <w:rFonts w:ascii="Calibri" w:cs="Calibri" w:eastAsia="Calibri" w:hAnsi="Calibri"/>
-        </w:rPr>
-        <w:t xml:space="preserve">▪  Source : </w:t>
-      </w:r>
-      <w:hyperlink w:history="1" r:id="rIdg9yz5hfvsmpagcospkgwq">
+      <w:hyperlink w:history="1" r:id="rId4y8v-kdmsvq4webuodx7o">
         <w:r>
           <w:rPr>
             <w:u w:val="single"/>
@@ -9109,7 +9030,7 @@
         </w:rPr>
         <w:t xml:space="preserve">▪  Source : </w:t>
       </w:r>
-      <w:hyperlink w:history="1" r:id="rId5xikpow4sa5jn1rrbnhzq">
+      <w:hyperlink w:history="1" r:id="rIdz-b5pw0rpzexeicw3xsps">
         <w:r>
           <w:rPr>
             <w:u w:val="single"/>
@@ -9182,7 +9103,7 @@
         </w:rPr>
         <w:t xml:space="preserve">▪  Source : </w:t>
       </w:r>
-      <w:hyperlink w:history="1" r:id="rIdhfvcq9qr-lldytvgsvqvn">
+      <w:hyperlink w:history="1" r:id="rIdx2qd3dy8msgfz7szktogm">
         <w:r>
           <w:rPr>
             <w:u w:val="single"/>
@@ -9213,6 +9134,68 @@
           <w:rFonts w:ascii="Calibri" w:cs="Calibri" w:eastAsia="Calibri" w:hAnsi="Calibri"/>
         </w:rPr>
         <w:t xml:space="preserve">   ·   Cotation : Probable</w:t>
+      </w:r>
+    </w:p>
+    <w:p>
+      <w:pPr>
+        <w:spacing w:before="160"/>
+        <w:ind w:left="360"/>
+      </w:pPr>
+      <w:r>
+        <w:rPr>
+          <w:color w:val="1F6B5E"/>
+          <w:sz w:val="28"/>
+          <w:szCs w:val="28"/>
+          <w:rFonts w:ascii="Calibri" w:cs="Calibri" w:eastAsia="Calibri" w:hAnsi="Calibri"/>
+        </w:rPr>
+        <w:t xml:space="preserve">❑  </w:t>
+      </w:r>
+      <w:r>
+        <w:rPr>
+          <w:b/>
+          <w:bCs/>
+          <w:u w:val="single"/>
+          <w:color w:val="1F6B5E"/>
+          <w:sz w:val="28"/>
+          <w:szCs w:val="28"/>
+          <w:rFonts w:ascii="Calibri" w:cs="Calibri" w:eastAsia="Calibri" w:hAnsi="Calibri"/>
+        </w:rPr>
+        <w:t xml:space="preserve">ALERTE – LA PRÉSIDENCE ANNONCE L’ENVOI D’UNITÉS DE L’ARMÉE NATIONALE AU NIGER</w:t>
+      </w:r>
+    </w:p>
+    <w:p>
+      <w:pPr>
+        <w:ind w:left="720"/>
+      </w:pPr>
+      <w:r>
+        <w:rPr>
+          <w:color w:val="1F2937"/>
+          <w:sz w:val="26"/>
+          <w:szCs w:val="26"/>
+          <w:rFonts w:ascii="Calibri" w:cs="Calibri" w:eastAsia="Calibri" w:hAnsi="Calibri"/>
+        </w:rPr>
+        <w:t xml:space="preserve">▪  Source : </w:t>
+      </w:r>
+      <w:hyperlink w:history="1" r:id="rIdlnexvd083baqhvqncwglq">
+        <w:r>
+          <w:rPr>
+            <w:u w:val="single"/>
+            <w:color w:val="1F6B5E"/>
+            <w:sz w:val="26"/>
+            <w:szCs w:val="26"/>
+            <w:rFonts w:ascii="Calibri" w:cs="Calibri" w:eastAsia="Calibri" w:hAnsi="Calibri"/>
+          </w:rPr>
+          <w:t xml:space="preserve">tsa-algerie.com</w:t>
+        </w:r>
+      </w:hyperlink>
+      <w:r>
+        <w:rPr>
+          <w:color w:val="1F2937"/>
+          <w:sz w:val="26"/>
+          <w:szCs w:val="26"/>
+          <w:rFonts w:ascii="Calibri" w:cs="Calibri" w:eastAsia="Calibri" w:hAnsi="Calibri"/>
+        </w:rPr>
+        <w:t xml:space="preserve"> — 26 octobre 2026, 15 h UTC</w:t>
       </w:r>
     </w:p>
     <w:p>
@@ -9436,7 +9419,7 @@
           <w:szCs w:val="22"/>
           <w:rFonts w:ascii="Calibri" w:cs="Calibri" w:eastAsia="Calibri" w:hAnsi="Calibri"/>
         </w:rPr>
-        <w:t xml:space="preserve">Indice de confiance : moyenne (incident vérifié le plus récent : 120 jours ; 2 signaux du jour)</w:t>
+        <w:t xml:space="preserve">Indice de confiance : faible (incident vérifié le plus récent : 121 jours ; aucun signal du jour)</w:t>
       </w:r>
     </w:p>
     <w:tbl>
@@ -9482,7 +9465,7 @@
                 <w:szCs w:val="40"/>
                 <w:rFonts w:ascii="Arial Narrow" w:cs="Arial Narrow" w:eastAsia="Arial Narrow" w:hAnsi="Arial Narrow"/>
               </w:rPr>
-              <w:t xml:space="preserve">Seven shot dead by gunmen at church funeral in Jordan, officials say</w:t>
+              <w:t xml:space="preserve">Woman killed by Tema-Afienya train as residents demand footbridge</w:t>
             </w:r>
           </w:p>
           <w:p>
@@ -9509,7 +9492,7 @@
                 <w:szCs w:val="26"/>
                 <w:rFonts w:ascii="Calibri" w:cs="Calibri" w:eastAsia="Calibri" w:hAnsi="Calibri"/>
               </w:rPr>
-              <w:t xml:space="preserve">Fait rapporté le vendredi 23 octobre 2026. Lieu : Ghana. Actualité sécuritaire. Une seule source à ce stade (JoyOnline) : à confirmer par un second média.</w:t>
+              <w:t xml:space="preserve">Fait rapporté le mercredi 28 octobre 2026. Lieu : Ghana. Actualité sécuritaire. Une seule source à ce stade (JoyOnline) : à confirmer par un second média.</w:t>
             </w:r>
           </w:p>
           <w:p>
@@ -9529,16 +9512,30 @@
             </w:r>
           </w:p>
           <w:p>
-            <w:r>
-              <w:rPr>
-                <w:i/>
-                <w:iCs/>
-                <w:color w:val="6B7280"/>
+            <w:pPr>
+              <w:spacing w:after="60"/>
+            </w:pPr>
+            <w:r>
+              <w:rPr>
+                <w:b/>
+                <w:bCs/>
+                <w:color w:val="1F2937"/>
                 <w:sz w:val="26"/>
                 <w:szCs w:val="26"/>
                 <w:rFonts w:ascii="Calibri" w:cs="Calibri" w:eastAsia="Calibri" w:hAnsi="Calibri"/>
               </w:rPr>
-              <w:t xml:space="preserve">Les médias n'en publient que le titre dans leur flux : le détail est à lire dans l'article (lien ci-dessous).</w:t>
+              <w:t xml:space="preserve">JoyOnline : </w:t>
+            </w:r>
+            <w:r>
+              <w:rPr>
+                <w:i/>
+                <w:iCs/>
+                <w:color w:val="1F2937"/>
+                <w:sz w:val="26"/>
+                <w:szCs w:val="26"/>
+                <w:rFonts w:ascii="Calibri" w:cs="Calibri" w:eastAsia="Calibri" w:hAnsi="Calibri"/>
+              </w:rPr>
+              <w:t xml:space="preserve">« Une femme non identifiée a été tuée après avoir été heurtée par un train de voyageurs sur la ligne ferroviaire Tema-Afienya à Mataheko-Sebrepo, incitant les habitants à renouveler leurs appels en faveur d'une passerelle pour assurer une traversée plus sûre entre les communautés de la région. »</w:t>
             </w:r>
           </w:p>
           <w:p>
@@ -9565,7 +9562,7 @@
                 <w:szCs w:val="26"/>
                 <w:rFonts w:ascii="Calibri" w:cs="Calibri" w:eastAsia="Calibri" w:hAnsi="Calibri"/>
               </w:rPr>
-              <w:t xml:space="preserve">Menace armée sur les axes et localités de la zone : réévaluer les déplacements terrestres (horaires, convois, itinéraires de repli) et les consignes des sites et des personnels présents à proximité.</w:t>
+              <w:t xml:space="preserve">Fait sécuritaire à suivre : vérifier son incidence sur les sites, les itinéraires et les personnels présents dans la zone.</w:t>
             </w:r>
           </w:p>
           <w:p>
@@ -9591,7 +9588,7 @@
                 <w:rFonts w:ascii="Calibri" w:cs="Calibri" w:eastAsia="Calibri" w:hAnsi="Calibri"/>
               </w:rPr>
             </w:r>
-            <w:hyperlink w:history="1" r:id="rIdt65ldiufulecte_hrmwxx">
+            <w:hyperlink w:history="1" r:id="rId3ykljmfftm9qlquqommyw">
               <w:r>
                 <w:rPr>
                   <w:u w:val="single"/>
@@ -9610,7 +9607,18 @@
                 <w:szCs w:val="26"/>
                 <w:rFonts w:ascii="Calibri" w:cs="Calibri" w:eastAsia="Calibri" w:hAnsi="Calibri"/>
               </w:rPr>
-              <w:t xml:space="preserve"> — 23 octobre 2026, 18 h UTC</w:t>
+              <w:t xml:space="preserve"> — 28 octobre 2026, 7 h UTC</w:t>
+            </w:r>
+            <w:r>
+              <w:rPr>
+                <w:b/>
+                <w:bCs/>
+                <w:color w:val="1F2937"/>
+                <w:sz w:val="26"/>
+                <w:szCs w:val="26"/>
+                <w:rFonts w:ascii="Calibri" w:cs="Calibri" w:eastAsia="Calibri" w:hAnsi="Calibri"/>
+              </w:rPr>
+              <w:t xml:space="preserve">   ·   Cotation : Probable</w:t>
             </w:r>
           </w:p>
         </w:tc>
@@ -9632,7 +9640,7 @@
             <w:r>
               <w:drawing>
                 <wp:inline distT="0" distB="0" distL="0" distR="0">
-                  <wp:extent cx="3810000" cy="2000250"/>
+                  <wp:extent cx="3810000" cy="2286000"/>
                   <wp:effectExtent t="0" r="0" b="0" l="0"/>
                   <wp:docPr id="1" name="" descr="" title=""/>
                   <wp:cNvGraphicFramePr>
@@ -9648,7 +9656,7 @@
                           </pic:cNvPicPr>
                         </pic:nvPicPr>
                         <pic:blipFill>
-                          <a:blip r:embed="rId12" cstate="none"/>
+                          <a:blip r:embed="rId11" cstate="none"/>
                           <a:srcRect/>
                           <a:stretch>
                             <a:fillRect/>
@@ -9657,7 +9665,7 @@
                         <pic:spPr bwMode="auto">
                           <a:xfrm>
                             <a:off x="0" y="0"/>
-                            <a:ext cx="3810000" cy="2000250"/>
+                            <a:ext cx="3810000" cy="2286000"/>
                           </a:xfrm>
                           <a:prstGeom prst="rect">
                             <a:avLst/>
@@ -9674,7 +9682,7 @@
             <w:pPr>
               <w:jc w:val="right"/>
             </w:pPr>
-            <w:hyperlink w:history="1" r:id="rId0yxdf4ctuxzgb5pvfffp8">
+            <w:hyperlink w:history="1" r:id="rIddfk5rr9bl0xqqjgc4geb_">
               <w:r>
                 <w:rPr>
                   <w:u w:val="single"/>
@@ -9922,7 +9930,7 @@
           <w:szCs w:val="28"/>
           <w:rFonts w:ascii="Calibri" w:cs="Calibri" w:eastAsia="Calibri" w:hAnsi="Calibri"/>
         </w:rPr>
-        <w:t xml:space="preserve">NPP WALEWALE CONSTITUENCY CONDEMNS PERSONAL ATTACKS AGAINST MP, URGES PARTY DISCIPLINE</w:t>
+        <w:t xml:space="preserve">SEVEN SHOT DEAD BY GUNMEN AT CHURCH FUNERAL IN JORDAN, OFFICIALS SAY</w:t>
       </w:r>
     </w:p>
     <w:p>
@@ -9938,7 +9946,7 @@
         </w:rPr>
         <w:t xml:space="preserve">▪  Source : </w:t>
       </w:r>
-      <w:hyperlink w:history="1" r:id="rIdlph0csbk2hsldajxg44f9">
+      <w:hyperlink w:history="1" r:id="rId-dbvrmrtjix0z2uwh4ymb">
         <w:r>
           <w:rPr>
             <w:u w:val="single"/>
@@ -9957,7 +9965,7 @@
           <w:szCs w:val="26"/>
           <w:rFonts w:ascii="Calibri" w:cs="Calibri" w:eastAsia="Calibri" w:hAnsi="Calibri"/>
         </w:rPr>
-        <w:t xml:space="preserve"> — 23 octobre 2026, 15 h UTC</w:t>
+        <w:t xml:space="preserve"> — 23 octobre 2026, 18 h UTC</w:t>
       </w:r>
     </w:p>
     <w:p>
@@ -9984,7 +9992,7 @@
           <w:szCs w:val="28"/>
           <w:rFonts w:ascii="Calibri" w:cs="Calibri" w:eastAsia="Calibri" w:hAnsi="Calibri"/>
         </w:rPr>
-        <w:t xml:space="preserve">GAF TO STAGE LAND COMBAT FIREPOWER DEMONSTRATION AT BUNDASE ON OCTOBER 30</w:t>
+        <w:t xml:space="preserve">NPP WALEWALE CONSTITUENCY CONDEMNS PERSONAL ATTACKS AGAINST MP, URGES PARTY DISCIPLINE</w:t>
       </w:r>
     </w:p>
     <w:p>
@@ -10000,7 +10008,7 @@
         </w:rPr>
         <w:t xml:space="preserve">▪  Source : </w:t>
       </w:r>
-      <w:hyperlink w:history="1" r:id="rId5dylvuslaqpyl1jvbavo_">
+      <w:hyperlink w:history="1" r:id="rIdxqm4cte5tt9fvw9nc2spc">
         <w:r>
           <w:rPr>
             <w:u w:val="single"/>
@@ -10019,7 +10027,7 @@
           <w:szCs w:val="26"/>
           <w:rFonts w:ascii="Calibri" w:cs="Calibri" w:eastAsia="Calibri" w:hAnsi="Calibri"/>
         </w:rPr>
-        <w:t xml:space="preserve"> — 23 octobre 2026, 16 h UTC</w:t>
+        <w:t xml:space="preserve"> — 23 octobre 2026, 15 h UTC</w:t>
       </w:r>
     </w:p>
     <w:p>
@@ -10046,6 +10054,68 @@
           <w:szCs w:val="28"/>
           <w:rFonts w:ascii="Calibri" w:cs="Calibri" w:eastAsia="Calibri" w:hAnsi="Calibri"/>
         </w:rPr>
+        <w:t xml:space="preserve">GAF TO STAGE LAND COMBAT FIREPOWER DEMONSTRATION AT BUNDASE ON OCTOBER 30</w:t>
+      </w:r>
+    </w:p>
+    <w:p>
+      <w:pPr>
+        <w:ind w:left="720"/>
+      </w:pPr>
+      <w:r>
+        <w:rPr>
+          <w:color w:val="1F2937"/>
+          <w:sz w:val="26"/>
+          <w:szCs w:val="26"/>
+          <w:rFonts w:ascii="Calibri" w:cs="Calibri" w:eastAsia="Calibri" w:hAnsi="Calibri"/>
+        </w:rPr>
+        <w:t xml:space="preserve">▪  Source : </w:t>
+      </w:r>
+      <w:hyperlink w:history="1" r:id="rIdz_oytmzo1pwjqeihcgc8p">
+        <w:r>
+          <w:rPr>
+            <w:u w:val="single"/>
+            <w:color w:val="1F6B5E"/>
+            <w:sz w:val="26"/>
+            <w:szCs w:val="26"/>
+            <w:rFonts w:ascii="Calibri" w:cs="Calibri" w:eastAsia="Calibri" w:hAnsi="Calibri"/>
+          </w:rPr>
+          <w:t xml:space="preserve">JoyOnline</w:t>
+        </w:r>
+      </w:hyperlink>
+      <w:r>
+        <w:rPr>
+          <w:color w:val="1F2937"/>
+          <w:sz w:val="26"/>
+          <w:szCs w:val="26"/>
+          <w:rFonts w:ascii="Calibri" w:cs="Calibri" w:eastAsia="Calibri" w:hAnsi="Calibri"/>
+        </w:rPr>
+        <w:t xml:space="preserve"> — 23 octobre 2026, 16 h UTC</w:t>
+      </w:r>
+    </w:p>
+    <w:p>
+      <w:pPr>
+        <w:spacing w:before="160"/>
+        <w:ind w:left="360"/>
+      </w:pPr>
+      <w:r>
+        <w:rPr>
+          <w:color w:val="1F6B5E"/>
+          <w:sz w:val="28"/>
+          <w:szCs w:val="28"/>
+          <w:rFonts w:ascii="Calibri" w:cs="Calibri" w:eastAsia="Calibri" w:hAnsi="Calibri"/>
+        </w:rPr>
+        <w:t xml:space="preserve">❑  </w:t>
+      </w:r>
+      <w:r>
+        <w:rPr>
+          <w:b/>
+          <w:bCs/>
+          <w:u w:val="single"/>
+          <w:color w:val="1F6B5E"/>
+          <w:sz w:val="28"/>
+          <w:szCs w:val="28"/>
+          <w:rFonts w:ascii="Calibri" w:cs="Calibri" w:eastAsia="Calibri" w:hAnsi="Calibri"/>
+        </w:rPr>
         <w:t xml:space="preserve">LES FORTES PLUIES, PRINCIPALE MENACE POUR LA CULTURE DU CACAO</w:t>
       </w:r>
     </w:p>
@@ -10062,7 +10132,7 @@
         </w:rPr>
         <w:t xml:space="preserve">▪  Source : </w:t>
       </w:r>
-      <w:hyperlink w:history="1" r:id="rIdzpqy1de9u2fmyzagyprwk">
+      <w:hyperlink w:history="1" r:id="rIdfzkgwsj6keo7afcxe205-">
         <w:r>
           <w:rPr>
             <w:u w:val="single"/>
@@ -10119,7 +10189,7 @@
           <w:szCs w:val="28"/>
           <w:rFonts w:ascii="Calibri" w:cs="Calibri" w:eastAsia="Calibri" w:hAnsi="Calibri"/>
         </w:rPr>
-        <w:t xml:space="preserve">(EN) GRASAG PRESIDENT CALLS FOR SUSTAINABLE FUNDING FOR AGRICULTURAL RESEARCH IN AFRICA</w:t>
+        <w:t xml:space="preserve">LE PRÉSIDENT DU GRASAG APPELLE À UN FINANCEMENT DURABLE DE LA RECHERCHE AGRICOLE EN AFRIQUE</w:t>
       </w:r>
     </w:p>
     <w:p>
@@ -10135,7 +10205,7 @@
         </w:rPr>
         <w:t xml:space="preserve">▪  Source : </w:t>
       </w:r>
-      <w:hyperlink w:history="1" r:id="rId39q_ce0qfd8xacu9w-p_j">
+      <w:hyperlink w:history="1" r:id="rIdguh6um1uc-wdmi_oeaswp">
         <w:r>
           <w:rPr>
             <w:u w:val="single"/>
@@ -10155,79 +10225,6 @@
           <w:rFonts w:ascii="Calibri" w:cs="Calibri" w:eastAsia="Calibri" w:hAnsi="Calibri"/>
         </w:rPr>
         <w:t xml:space="preserve"> — 27 octobre 2026, 19 h UTC</w:t>
-      </w:r>
-      <w:r>
-        <w:rPr>
-          <w:b/>
-          <w:bCs/>
-          <w:color w:val="1F2937"/>
-          <w:sz w:val="26"/>
-          <w:szCs w:val="26"/>
-          <w:rFonts w:ascii="Calibri" w:cs="Calibri" w:eastAsia="Calibri" w:hAnsi="Calibri"/>
-        </w:rPr>
-        <w:t xml:space="preserve">   ·   Cotation : Probable</w:t>
-      </w:r>
-    </w:p>
-    <w:p>
-      <w:pPr>
-        <w:spacing w:before="160"/>
-        <w:ind w:left="360"/>
-      </w:pPr>
-      <w:r>
-        <w:rPr>
-          <w:color w:val="1F6B5E"/>
-          <w:sz w:val="28"/>
-          <w:szCs w:val="28"/>
-          <w:rFonts w:ascii="Calibri" w:cs="Calibri" w:eastAsia="Calibri" w:hAnsi="Calibri"/>
-        </w:rPr>
-        <w:t xml:space="preserve">❑  </w:t>
-      </w:r>
-      <w:r>
-        <w:rPr>
-          <w:b/>
-          <w:bCs/>
-          <w:u w:val="single"/>
-          <w:color w:val="1F6B5E"/>
-          <w:sz w:val="28"/>
-          <w:szCs w:val="28"/>
-          <w:rFonts w:ascii="Calibri" w:cs="Calibri" w:eastAsia="Calibri" w:hAnsi="Calibri"/>
-        </w:rPr>
-        <w:t xml:space="preserve">(EN) GHANA DEVELOPING FIRST NATIONAL ACTION PLAN ON YOUTH, PEACE AND SECURITY – OSMAN AYARIGA</w:t>
-      </w:r>
-    </w:p>
-    <w:p>
-      <w:pPr>
-        <w:ind w:left="720"/>
-      </w:pPr>
-      <w:r>
-        <w:rPr>
-          <w:color w:val="1F2937"/>
-          <w:sz w:val="26"/>
-          <w:szCs w:val="26"/>
-          <w:rFonts w:ascii="Calibri" w:cs="Calibri" w:eastAsia="Calibri" w:hAnsi="Calibri"/>
-        </w:rPr>
-        <w:t xml:space="preserve">▪  Source : </w:t>
-      </w:r>
-      <w:hyperlink w:history="1" r:id="rIdiqy0kb0pxddlaw8jn1qfk">
-        <w:r>
-          <w:rPr>
-            <w:u w:val="single"/>
-            <w:color w:val="1F6B5E"/>
-            <w:sz w:val="26"/>
-            <w:szCs w:val="26"/>
-            <w:rFonts w:ascii="Calibri" w:cs="Calibri" w:eastAsia="Calibri" w:hAnsi="Calibri"/>
-          </w:rPr>
-          <w:t xml:space="preserve">JoyOnline</w:t>
-        </w:r>
-      </w:hyperlink>
-      <w:r>
-        <w:rPr>
-          <w:color w:val="1F2937"/>
-          <w:sz w:val="26"/>
-          <w:szCs w:val="26"/>
-          <w:rFonts w:ascii="Calibri" w:cs="Calibri" w:eastAsia="Calibri" w:hAnsi="Calibri"/>
-        </w:rPr>
-        <w:t xml:space="preserve"> — 27 octobre 2026, 18 h UTC</w:t>
       </w:r>
       <w:r>
         <w:rPr>
@@ -10473,7 +10470,7 @@
           <w:szCs w:val="28"/>
           <w:rFonts w:ascii="Calibri" w:cs="Calibri" w:eastAsia="Calibri" w:hAnsi="Calibri"/>
         </w:rPr>
-        <w:t xml:space="preserve">THREE ARRESTED IN ATEWA FOREST AS NAIMOS LAUNCHES OPERATION GREEN SHIELD</w:t>
+        <w:t xml:space="preserve">LE GHANA ÉLABORE SON PREMIER PLAN D’ACTION NATIONAL SUR LA JEUNESSE, LA PAIX ET LA SÉCURITÉ – OSMAN AYARIGA</w:t>
       </w:r>
     </w:p>
     <w:p>
@@ -10489,7 +10486,7 @@
         </w:rPr>
         <w:t xml:space="preserve">▪  Source : </w:t>
       </w:r>
-      <w:hyperlink w:history="1" r:id="rIdu_ekwdblwyaqwsc25tg_1">
+      <w:hyperlink w:history="1" r:id="rId75hfnospm9gj7_ybtdmnh">
         <w:r>
           <w:rPr>
             <w:u w:val="single"/>
@@ -10508,7 +10505,7 @@
           <w:szCs w:val="26"/>
           <w:rFonts w:ascii="Calibri" w:cs="Calibri" w:eastAsia="Calibri" w:hAnsi="Calibri"/>
         </w:rPr>
-        <w:t xml:space="preserve"> — 27 octobre 2026, 17 h UTC</w:t>
+        <w:t xml:space="preserve"> — 27 octobre 2026, 18 h UTC</w:t>
       </w:r>
       <w:r>
         <w:rPr>
@@ -10546,6 +10543,79 @@
           <w:szCs w:val="28"/>
           <w:rFonts w:ascii="Calibri" w:cs="Calibri" w:eastAsia="Calibri" w:hAnsi="Calibri"/>
         </w:rPr>
+        <w:t xml:space="preserve">THREE ARRESTED IN ATEWA FOREST AS NAIMOS LAUNCHES OPERATION GREEN SHIELD</w:t>
+      </w:r>
+    </w:p>
+    <w:p>
+      <w:pPr>
+        <w:ind w:left="720"/>
+      </w:pPr>
+      <w:r>
+        <w:rPr>
+          <w:color w:val="1F2937"/>
+          <w:sz w:val="26"/>
+          <w:szCs w:val="26"/>
+          <w:rFonts w:ascii="Calibri" w:cs="Calibri" w:eastAsia="Calibri" w:hAnsi="Calibri"/>
+        </w:rPr>
+        <w:t xml:space="preserve">▪  Source : </w:t>
+      </w:r>
+      <w:hyperlink w:history="1" r:id="rId3lqd-zm6jjuohmwbf-xk3">
+        <w:r>
+          <w:rPr>
+            <w:u w:val="single"/>
+            <w:color w:val="1F6B5E"/>
+            <w:sz w:val="26"/>
+            <w:szCs w:val="26"/>
+            <w:rFonts w:ascii="Calibri" w:cs="Calibri" w:eastAsia="Calibri" w:hAnsi="Calibri"/>
+          </w:rPr>
+          <w:t xml:space="preserve">JoyOnline</w:t>
+        </w:r>
+      </w:hyperlink>
+      <w:r>
+        <w:rPr>
+          <w:color w:val="1F2937"/>
+          <w:sz w:val="26"/>
+          <w:szCs w:val="26"/>
+          <w:rFonts w:ascii="Calibri" w:cs="Calibri" w:eastAsia="Calibri" w:hAnsi="Calibri"/>
+        </w:rPr>
+        <w:t xml:space="preserve"> — 27 octobre 2026, 17 h UTC</w:t>
+      </w:r>
+      <w:r>
+        <w:rPr>
+          <w:b/>
+          <w:bCs/>
+          <w:color w:val="1F2937"/>
+          <w:sz w:val="26"/>
+          <w:szCs w:val="26"/>
+          <w:rFonts w:ascii="Calibri" w:cs="Calibri" w:eastAsia="Calibri" w:hAnsi="Calibri"/>
+        </w:rPr>
+        <w:t xml:space="preserve">   ·   Cotation : Probable</w:t>
+      </w:r>
+    </w:p>
+    <w:p>
+      <w:pPr>
+        <w:spacing w:before="160"/>
+        <w:ind w:left="360"/>
+      </w:pPr>
+      <w:r>
+        <w:rPr>
+          <w:color w:val="1F6B5E"/>
+          <w:sz w:val="28"/>
+          <w:szCs w:val="28"/>
+          <w:rFonts w:ascii="Calibri" w:cs="Calibri" w:eastAsia="Calibri" w:hAnsi="Calibri"/>
+        </w:rPr>
+        <w:t xml:space="preserve">❑  </w:t>
+      </w:r>
+      <w:r>
+        <w:rPr>
+          <w:b/>
+          <w:bCs/>
+          <w:u w:val="single"/>
+          <w:color w:val="1F6B5E"/>
+          <w:sz w:val="28"/>
+          <w:szCs w:val="28"/>
+          <w:rFonts w:ascii="Calibri" w:cs="Calibri" w:eastAsia="Calibri" w:hAnsi="Calibri"/>
+        </w:rPr>
         <w:t xml:space="preserve">GHANA CHALLENGES UN TO TURN HISTORICAL JUSTICE PROMISES INTO ACTION</w:t>
       </w:r>
     </w:p>
@@ -10562,7 +10632,7 @@
         </w:rPr>
         <w:t xml:space="preserve">▪  Source : </w:t>
       </w:r>
-      <w:hyperlink w:history="1" r:id="rIdpxly8xc5equtoj_eecp39">
+      <w:hyperlink w:history="1" r:id="rIda6szcc_ds83qvbhdhfuyf">
         <w:r>
           <w:rPr>
             <w:u w:val="single"/>
@@ -10619,7 +10689,7 @@
           <w:szCs w:val="28"/>
           <w:rFonts w:ascii="Calibri" w:cs="Calibri" w:eastAsia="Calibri" w:hAnsi="Calibri"/>
         </w:rPr>
-        <w:t xml:space="preserve">(EN) GALAMSEY WILL PERSIST IF FINANCIERS GO UNTOUCHED — SECURITY ANALYST</w:t>
+        <w:t xml:space="preserve">GALAMSEY PERSISTERA SI LES FINANCIERS NE SONT PAS TOUCHÉS — ANALYSTE EN SÉCURITÉ</w:t>
       </w:r>
     </w:p>
     <w:p>
@@ -10635,7 +10705,7 @@
         </w:rPr>
         <w:t xml:space="preserve">▪  Source : </w:t>
       </w:r>
-      <w:hyperlink w:history="1" r:id="rIdylz4wsbechsynkpfbhg7v">
+      <w:hyperlink w:history="1" r:id="rId4_dt1zeyykxsyf7dd2sal">
         <w:r>
           <w:rPr>
             <w:u w:val="single"/>
@@ -10655,79 +10725,6 @@
           <w:rFonts w:ascii="Calibri" w:cs="Calibri" w:eastAsia="Calibri" w:hAnsi="Calibri"/>
         </w:rPr>
         <w:t xml:space="preserve"> — 27 octobre 2026, 12 h UTC</w:t>
-      </w:r>
-    </w:p>
-    <w:p>
-      <w:pPr>
-        <w:spacing w:before="160"/>
-        <w:ind w:left="360"/>
-      </w:pPr>
-      <w:r>
-        <w:rPr>
-          <w:color w:val="1F6B5E"/>
-          <w:sz w:val="28"/>
-          <w:szCs w:val="28"/>
-          <w:rFonts w:ascii="Calibri" w:cs="Calibri" w:eastAsia="Calibri" w:hAnsi="Calibri"/>
-        </w:rPr>
-        <w:t xml:space="preserve">❑  </w:t>
-      </w:r>
-      <w:r>
-        <w:rPr>
-          <w:b/>
-          <w:bCs/>
-          <w:u w:val="single"/>
-          <w:color w:val="1F6B5E"/>
-          <w:sz w:val="28"/>
-          <w:szCs w:val="28"/>
-          <w:rFonts w:ascii="Calibri" w:cs="Calibri" w:eastAsia="Calibri" w:hAnsi="Calibri"/>
-        </w:rPr>
-        <w:t xml:space="preserve">GHANA MUST OWN DIGITAL INFRASTRUCTURE TO ENSURE DATA SECURITY — APAAK</w:t>
-      </w:r>
-    </w:p>
-    <w:p>
-      <w:pPr>
-        <w:ind w:left="720"/>
-      </w:pPr>
-      <w:r>
-        <w:rPr>
-          <w:color w:val="1F2937"/>
-          <w:sz w:val="26"/>
-          <w:szCs w:val="26"/>
-          <w:rFonts w:ascii="Calibri" w:cs="Calibri" w:eastAsia="Calibri" w:hAnsi="Calibri"/>
-        </w:rPr>
-        <w:t xml:space="preserve">▪  Source : </w:t>
-      </w:r>
-      <w:hyperlink w:history="1" r:id="rId7kyizeiqcaawqjwr2xp2k">
-        <w:r>
-          <w:rPr>
-            <w:u w:val="single"/>
-            <w:color w:val="1F6B5E"/>
-            <w:sz w:val="26"/>
-            <w:szCs w:val="26"/>
-            <w:rFonts w:ascii="Calibri" w:cs="Calibri" w:eastAsia="Calibri" w:hAnsi="Calibri"/>
-          </w:rPr>
-          <w:t xml:space="preserve">Ghanaian Times</w:t>
-        </w:r>
-      </w:hyperlink>
-      <w:r>
-        <w:rPr>
-          <w:color w:val="1F2937"/>
-          <w:sz w:val="26"/>
-          <w:szCs w:val="26"/>
-          <w:rFonts w:ascii="Calibri" w:cs="Calibri" w:eastAsia="Calibri" w:hAnsi="Calibri"/>
-        </w:rPr>
-        <w:t xml:space="preserve"> — 27 octobre 2026, 8 h UTC</w:t>
-      </w:r>
-      <w:r>
-        <w:rPr>
-          <w:b/>
-          <w:bCs/>
-          <w:color w:val="1F2937"/>
-          <w:sz w:val="26"/>
-          <w:szCs w:val="26"/>
-          <w:rFonts w:ascii="Calibri" w:cs="Calibri" w:eastAsia="Calibri" w:hAnsi="Calibri"/>
-        </w:rPr>
-        <w:t xml:space="preserve">   ·   Cotation : Non confirmé</w:t>
       </w:r>
     </w:p>
     <w:p>
@@ -11005,7 +11002,7 @@
           <w:szCs w:val="22"/>
           <w:rFonts w:ascii="Calibri" w:cs="Calibri" w:eastAsia="Calibri" w:hAnsi="Calibri"/>
         </w:rPr>
-        <w:t xml:space="preserve">Indice de confiance : moyenne (incident vérifié le plus récent : 121 jours ; 1 signal du jour)</w:t>
+        <w:t xml:space="preserve">Indice de confiance : faible (incident vérifié le plus récent : 122 jours ; aucun signal du jour)</w:t>
       </w:r>
     </w:p>
     <w:tbl>
@@ -11174,7 +11171,7 @@
                 <w:rFonts w:ascii="Calibri" w:cs="Calibri" w:eastAsia="Calibri" w:hAnsi="Calibri"/>
               </w:rPr>
             </w:r>
-            <w:hyperlink w:history="1" r:id="rIdmpmktzgni1rttc-w_68ta">
+            <w:hyperlink w:history="1" r:id="rIdredvtserzvh-qem06mop-">
               <w:r>
                 <w:rPr>
                   <w:u w:val="single"/>
@@ -11242,7 +11239,7 @@
                           </pic:cNvPicPr>
                         </pic:nvPicPr>
                         <pic:blipFill>
-                          <a:blip r:embed="rId13" cstate="none"/>
+                          <a:blip r:embed="rId12" cstate="none"/>
                           <a:srcRect/>
                           <a:stretch>
                             <a:fillRect/>
@@ -11268,7 +11265,7 @@
             <w:pPr>
               <w:jc w:val="right"/>
             </w:pPr>
-            <w:hyperlink w:history="1" r:id="rId7tq3gv-4uaostg-ft2fry">
+            <w:hyperlink w:history="1" r:id="rIdeakatzpmsxxhjvurvib1o">
               <w:r>
                 <w:rPr>
                   <w:u w:val="single"/>
@@ -11586,7 +11583,7 @@
         </w:rPr>
         <w:t xml:space="preserve">▪  Source : </w:t>
       </w:r>
-      <w:hyperlink w:history="1" r:id="rIdw1e9f0gvdqzfbkfcddqmg">
+      <w:hyperlink w:history="1" r:id="rIdtxunxfobqh3ijicczxb_j">
         <w:r>
           <w:rPr>
             <w:u w:val="single"/>
@@ -11632,6 +11629,152 @@
           <w:szCs w:val="28"/>
           <w:rFonts w:ascii="Calibri" w:cs="Calibri" w:eastAsia="Calibri" w:hAnsi="Calibri"/>
         </w:rPr>
+        <w:t xml:space="preserve">GÉNIE IMHOTEP SAISON 3 : LE LYCÉE ZÉBÉVI STOPPE LE LYCÉE TOKOIN2 DANS SON ÉLAN</w:t>
+      </w:r>
+    </w:p>
+    <w:p>
+      <w:pPr>
+        <w:ind w:left="720"/>
+      </w:pPr>
+      <w:r>
+        <w:rPr>
+          <w:color w:val="1F2937"/>
+          <w:sz w:val="26"/>
+          <w:szCs w:val="26"/>
+          <w:rFonts w:ascii="Calibri" w:cs="Calibri" w:eastAsia="Calibri" w:hAnsi="Calibri"/>
+        </w:rPr>
+        <w:t xml:space="preserve">▪  Source : </w:t>
+      </w:r>
+      <w:hyperlink w:history="1" r:id="rIdnxmh8yhoqnzk3wjminy_-">
+        <w:r>
+          <w:rPr>
+            <w:u w:val="single"/>
+            <w:color w:val="1F6B5E"/>
+            <w:sz w:val="26"/>
+            <w:szCs w:val="26"/>
+            <w:rFonts w:ascii="Calibri" w:cs="Calibri" w:eastAsia="Calibri" w:hAnsi="Calibri"/>
+          </w:rPr>
+          <w:t xml:space="preserve">Le Nouveau Reporter</w:t>
+        </w:r>
+      </w:hyperlink>
+      <w:r>
+        <w:rPr>
+          <w:color w:val="1F2937"/>
+          <w:sz w:val="26"/>
+          <w:szCs w:val="26"/>
+          <w:rFonts w:ascii="Calibri" w:cs="Calibri" w:eastAsia="Calibri" w:hAnsi="Calibri"/>
+        </w:rPr>
+        <w:t xml:space="preserve"> — 28 octobre 2026, 8 h UTC</w:t>
+      </w:r>
+      <w:r>
+        <w:rPr>
+          <w:b/>
+          <w:bCs/>
+          <w:color w:val="1F2937"/>
+          <w:sz w:val="26"/>
+          <w:szCs w:val="26"/>
+          <w:rFonts w:ascii="Calibri" w:cs="Calibri" w:eastAsia="Calibri" w:hAnsi="Calibri"/>
+        </w:rPr>
+        <w:t xml:space="preserve">   ·   Cotation : Non confirmé</w:t>
+      </w:r>
+    </w:p>
+    <w:p>
+      <w:pPr>
+        <w:spacing w:before="160"/>
+        <w:ind w:left="360"/>
+      </w:pPr>
+      <w:r>
+        <w:rPr>
+          <w:color w:val="1F6B5E"/>
+          <w:sz w:val="28"/>
+          <w:szCs w:val="28"/>
+          <w:rFonts w:ascii="Calibri" w:cs="Calibri" w:eastAsia="Calibri" w:hAnsi="Calibri"/>
+        </w:rPr>
+        <w:t xml:space="preserve">❑  </w:t>
+      </w:r>
+      <w:r>
+        <w:rPr>
+          <w:b/>
+          <w:bCs/>
+          <w:u w:val="single"/>
+          <w:color w:val="1F6B5E"/>
+          <w:sz w:val="28"/>
+          <w:szCs w:val="28"/>
+          <w:rFonts w:ascii="Calibri" w:cs="Calibri" w:eastAsia="Calibri" w:hAnsi="Calibri"/>
+        </w:rPr>
+        <w:t xml:space="preserve">TOGO : LA SÉCURITÉ RENFORCÉE SUR LE LITTORAL DE LOMÉ APRÈS LE DÉMANTÈLEMENT DES INSTALLATIONS ILLÉGALES</w:t>
+      </w:r>
+    </w:p>
+    <w:p>
+      <w:pPr>
+        <w:ind w:left="720"/>
+      </w:pPr>
+      <w:r>
+        <w:rPr>
+          <w:color w:val="1F2937"/>
+          <w:sz w:val="26"/>
+          <w:szCs w:val="26"/>
+          <w:rFonts w:ascii="Calibri" w:cs="Calibri" w:eastAsia="Calibri" w:hAnsi="Calibri"/>
+        </w:rPr>
+        <w:t xml:space="preserve">▪  Sources : </w:t>
+      </w:r>
+      <w:hyperlink w:history="1" r:id="rId1yt27wcicz37hh37xoutc">
+        <w:r>
+          <w:rPr>
+            <w:u w:val="single"/>
+            <w:color w:val="1F6B5E"/>
+            <w:sz w:val="26"/>
+            <w:szCs w:val="26"/>
+            <w:rFonts w:ascii="Calibri" w:cs="Calibri" w:eastAsia="Calibri" w:hAnsi="Calibri"/>
+          </w:rPr>
+          <w:t xml:space="preserve">24heureinfo.com · Togo Actualite · Icilome</w:t>
+        </w:r>
+      </w:hyperlink>
+      <w:r>
+        <w:rPr>
+          <w:color w:val="1F2937"/>
+          <w:sz w:val="26"/>
+          <w:szCs w:val="26"/>
+          <w:rFonts w:ascii="Calibri" w:cs="Calibri" w:eastAsia="Calibri" w:hAnsi="Calibri"/>
+        </w:rPr>
+        <w:t xml:space="preserve"> — 28 octobre 2026, 7 h UTC</w:t>
+      </w:r>
+      <w:r>
+        <w:rPr>
+          <w:b/>
+          <w:bCs/>
+          <w:color w:val="1F2937"/>
+          <w:sz w:val="26"/>
+          <w:szCs w:val="26"/>
+          <w:rFonts w:ascii="Calibri" w:cs="Calibri" w:eastAsia="Calibri" w:hAnsi="Calibri"/>
+        </w:rPr>
+        <w:t xml:space="preserve">   ·   Cotation : Confirmé</w:t>
+      </w:r>
+    </w:p>
+    <w:p>
+      <w:pPr>
+        <w:spacing w:before="160"/>
+        <w:ind w:left="360"/>
+      </w:pPr>
+      <w:r>
+        <w:rPr>
+          <w:color w:val="1F6B5E"/>
+          <w:sz w:val="28"/>
+          <w:szCs w:val="28"/>
+          <w:rFonts w:ascii="Calibri" w:cs="Calibri" w:eastAsia="Calibri" w:hAnsi="Calibri"/>
+        </w:rPr>
+        <w:t xml:space="preserve">❑  </w:t>
+      </w:r>
+      <w:r>
+        <w:rPr>
+          <w:b/>
+          <w:bCs/>
+          <w:u w:val="single"/>
+          <w:color w:val="1F6B5E"/>
+          <w:sz w:val="28"/>
+          <w:szCs w:val="28"/>
+          <w:rFonts w:ascii="Calibri" w:cs="Calibri" w:eastAsia="Calibri" w:hAnsi="Calibri"/>
+        </w:rPr>
         <w:t xml:space="preserve">SOUTENU PAR L’UNION AFRICAINE, LE TOGOLAIS GILBERT HOUNGBO RÉUSSIRA-T-IL À CONSERVER LA TÊTE DE L’OIT ?</w:t>
       </w:r>
     </w:p>
@@ -11648,7 +11791,7 @@
         </w:rPr>
         <w:t xml:space="preserve">▪  Source : </w:t>
       </w:r>
-      <w:hyperlink w:history="1" r:id="rIddtehmshhhsy_bt_x4vceq">
+      <w:hyperlink w:history="1" r:id="rIdjx49ahiqwtuooehcjlfec">
         <w:r>
           <w:rPr>
             <w:u w:val="single"/>
@@ -11721,7 +11864,7 @@
         </w:rPr>
         <w:t xml:space="preserve">▪  Source : </w:t>
       </w:r>
-      <w:hyperlink w:history="1" r:id="rIdgtlj4utfitozxcmt0wgwv">
+      <w:hyperlink w:history="1" r:id="rIdbwn1logvg-k55a5gqbeiv">
         <w:r>
           <w:rPr>
             <w:u w:val="single"/>
@@ -11741,141 +11884,6 @@
           <w:rFonts w:ascii="Calibri" w:cs="Calibri" w:eastAsia="Calibri" w:hAnsi="Calibri"/>
         </w:rPr>
         <w:t xml:space="preserve"> — 26 octobre 2026, 15 h UTC</w:t>
-      </w:r>
-    </w:p>
-    <w:p>
-      <w:pPr>
-        <w:spacing w:before="160"/>
-        <w:ind w:left="360"/>
-      </w:pPr>
-      <w:r>
-        <w:rPr>
-          <w:color w:val="1F6B5E"/>
-          <w:sz w:val="28"/>
-          <w:szCs w:val="28"/>
-          <w:rFonts w:ascii="Calibri" w:cs="Calibri" w:eastAsia="Calibri" w:hAnsi="Calibri"/>
-        </w:rPr>
-        <w:t xml:space="preserve">❑  </w:t>
-      </w:r>
-      <w:r>
-        <w:rPr>
-          <w:b/>
-          <w:bCs/>
-          <w:u w:val="single"/>
-          <w:color w:val="1F6B5E"/>
-          <w:sz w:val="28"/>
-          <w:szCs w:val="28"/>
-          <w:rFonts w:ascii="Calibri" w:cs="Calibri" w:eastAsia="Calibri" w:hAnsi="Calibri"/>
-        </w:rPr>
-        <w:t xml:space="preserve">LITTORAL DE LOMÉ : UN DISPOSITIF SÉCURITAIRE RENFORCÉ APRÈS LE DÉMANTÈLEMENT DES INSTALLATIONS ILLÉGALES</w:t>
-      </w:r>
-    </w:p>
-    <w:p>
-      <w:pPr>
-        <w:ind w:left="720"/>
-      </w:pPr>
-      <w:r>
-        <w:rPr>
-          <w:color w:val="1F2937"/>
-          <w:sz w:val="26"/>
-          <w:szCs w:val="26"/>
-          <w:rFonts w:ascii="Calibri" w:cs="Calibri" w:eastAsia="Calibri" w:hAnsi="Calibri"/>
-        </w:rPr>
-        <w:t xml:space="preserve">▪  Sources : </w:t>
-      </w:r>
-      <w:hyperlink w:history="1" r:id="rIddib6znlvs4ldwdvcg6kpi">
-        <w:r>
-          <w:rPr>
-            <w:u w:val="single"/>
-            <w:color w:val="1F6B5E"/>
-            <w:sz w:val="26"/>
-            <w:szCs w:val="26"/>
-            <w:rFonts w:ascii="Calibri" w:cs="Calibri" w:eastAsia="Calibri" w:hAnsi="Calibri"/>
-          </w:rPr>
-          <w:t xml:space="preserve">Togo Actualite · Icilome</w:t>
-        </w:r>
-      </w:hyperlink>
-      <w:r>
-        <w:rPr>
-          <w:color w:val="1F2937"/>
-          <w:sz w:val="26"/>
-          <w:szCs w:val="26"/>
-          <w:rFonts w:ascii="Calibri" w:cs="Calibri" w:eastAsia="Calibri" w:hAnsi="Calibri"/>
-        </w:rPr>
-        <w:t xml:space="preserve"> — 26 octobre 2026, 15 h UTC</w:t>
-      </w:r>
-      <w:r>
-        <w:rPr>
-          <w:b/>
-          <w:bCs/>
-          <w:color w:val="1F2937"/>
-          <w:sz w:val="26"/>
-          <w:szCs w:val="26"/>
-          <w:rFonts w:ascii="Calibri" w:cs="Calibri" w:eastAsia="Calibri" w:hAnsi="Calibri"/>
-        </w:rPr>
-        <w:t xml:space="preserve">   ·   Cotation : Confirmé</w:t>
-      </w:r>
-    </w:p>
-    <w:p>
-      <w:pPr>
-        <w:spacing w:before="160"/>
-        <w:ind w:left="360"/>
-      </w:pPr>
-      <w:r>
-        <w:rPr>
-          <w:color w:val="1F6B5E"/>
-          <w:sz w:val="28"/>
-          <w:szCs w:val="28"/>
-          <w:rFonts w:ascii="Calibri" w:cs="Calibri" w:eastAsia="Calibri" w:hAnsi="Calibri"/>
-        </w:rPr>
-        <w:t xml:space="preserve">❑  </w:t>
-      </w:r>
-      <w:r>
-        <w:rPr>
-          <w:b/>
-          <w:bCs/>
-          <w:u w:val="single"/>
-          <w:color w:val="1F6B5E"/>
-          <w:sz w:val="28"/>
-          <w:szCs w:val="28"/>
-          <w:rFonts w:ascii="Calibri" w:cs="Calibri" w:eastAsia="Calibri" w:hAnsi="Calibri"/>
-        </w:rPr>
-        <w:t xml:space="preserve">STOCKS DE SÉCURITÉ - RECORD DE 31 000 TONNES COLLECTÉES EN 2025</w:t>
-      </w:r>
-    </w:p>
-    <w:p>
-      <w:pPr>
-        <w:ind w:left="720"/>
-      </w:pPr>
-      <w:r>
-        <w:rPr>
-          <w:color w:val="1F2937"/>
-          <w:sz w:val="26"/>
-          <w:szCs w:val="26"/>
-          <w:rFonts w:ascii="Calibri" w:cs="Calibri" w:eastAsia="Calibri" w:hAnsi="Calibri"/>
-        </w:rPr>
-        <w:t xml:space="preserve">▪  Source : </w:t>
-      </w:r>
-      <w:hyperlink w:history="1" r:id="rIdhkfj35yofhw1ufm4wplng">
-        <w:r>
-          <w:rPr>
-            <w:u w:val="single"/>
-            <w:color w:val="1F6B5E"/>
-            <w:sz w:val="26"/>
-            <w:szCs w:val="26"/>
-            <w:rFonts w:ascii="Calibri" w:cs="Calibri" w:eastAsia="Calibri" w:hAnsi="Calibri"/>
-          </w:rPr>
-          <w:t xml:space="preserve">AllAfrica (TG)</w:t>
-        </w:r>
-      </w:hyperlink>
-      <w:r>
-        <w:rPr>
-          <w:color w:val="1F2937"/>
-          <w:sz w:val="26"/>
-          <w:szCs w:val="26"/>
-          <w:rFonts w:ascii="Calibri" w:cs="Calibri" w:eastAsia="Calibri" w:hAnsi="Calibri"/>
-        </w:rPr>
-        <w:t xml:space="preserve"> — 26 octobre 2026, 11 h UTC</w:t>
       </w:r>
     </w:p>
     <w:p>
@@ -12164,7 +12172,7 @@
           <w:szCs w:val="28"/>
           <w:rFonts w:ascii="Calibri" w:cs="Calibri" w:eastAsia="Calibri" w:hAnsi="Calibri"/>
         </w:rPr>
-        <w:t xml:space="preserve">LA PLAGE DE LOMÉ SOUS SURVEILLANCE</w:t>
+        <w:t xml:space="preserve">STOCKS DE SÉCURITÉ - RECORD DE 31 000 TONNES COLLECTÉES EN 2025</w:t>
       </w:r>
     </w:p>
     <w:p>
@@ -12180,7 +12188,7 @@
         </w:rPr>
         <w:t xml:space="preserve">▪  Source : </w:t>
       </w:r>
-      <w:hyperlink w:history="1" r:id="rId2obzjv1r7qbubw15_kebw">
+      <w:hyperlink w:history="1" r:id="rIdwfpeafxpjxxzvv46stdot">
         <w:r>
           <w:rPr>
             <w:u w:val="single"/>
@@ -12226,6 +12234,68 @@
           <w:szCs w:val="28"/>
           <w:rFonts w:ascii="Calibri" w:cs="Calibri" w:eastAsia="Calibri" w:hAnsi="Calibri"/>
         </w:rPr>
+        <w:t xml:space="preserve">LA PLAGE DE LOMÉ SOUS SURVEILLANCE</w:t>
+      </w:r>
+    </w:p>
+    <w:p>
+      <w:pPr>
+        <w:ind w:left="720"/>
+      </w:pPr>
+      <w:r>
+        <w:rPr>
+          <w:color w:val="1F2937"/>
+          <w:sz w:val="26"/>
+          <w:szCs w:val="26"/>
+          <w:rFonts w:ascii="Calibri" w:cs="Calibri" w:eastAsia="Calibri" w:hAnsi="Calibri"/>
+        </w:rPr>
+        <w:t xml:space="preserve">▪  Source : </w:t>
+      </w:r>
+      <w:hyperlink w:history="1" r:id="rIdgzwuybtiz2wd4fgrzsfbv">
+        <w:r>
+          <w:rPr>
+            <w:u w:val="single"/>
+            <w:color w:val="1F6B5E"/>
+            <w:sz w:val="26"/>
+            <w:szCs w:val="26"/>
+            <w:rFonts w:ascii="Calibri" w:cs="Calibri" w:eastAsia="Calibri" w:hAnsi="Calibri"/>
+          </w:rPr>
+          <w:t xml:space="preserve">AllAfrica (TG)</w:t>
+        </w:r>
+      </w:hyperlink>
+      <w:r>
+        <w:rPr>
+          <w:color w:val="1F2937"/>
+          <w:sz w:val="26"/>
+          <w:szCs w:val="26"/>
+          <w:rFonts w:ascii="Calibri" w:cs="Calibri" w:eastAsia="Calibri" w:hAnsi="Calibri"/>
+        </w:rPr>
+        <w:t xml:space="preserve"> — 26 octobre 2026, 11 h UTC</w:t>
+      </w:r>
+    </w:p>
+    <w:p>
+      <w:pPr>
+        <w:spacing w:before="160"/>
+        <w:ind w:left="360"/>
+      </w:pPr>
+      <w:r>
+        <w:rPr>
+          <w:color w:val="1F6B5E"/>
+          <w:sz w:val="28"/>
+          <w:szCs w:val="28"/>
+          <w:rFonts w:ascii="Calibri" w:cs="Calibri" w:eastAsia="Calibri" w:hAnsi="Calibri"/>
+        </w:rPr>
+        <w:t xml:space="preserve">❑  </w:t>
+      </w:r>
+      <w:r>
+        <w:rPr>
+          <w:b/>
+          <w:bCs/>
+          <w:u w:val="single"/>
+          <w:color w:val="1F6B5E"/>
+          <w:sz w:val="28"/>
+          <w:szCs w:val="28"/>
+          <w:rFonts w:ascii="Calibri" w:cs="Calibri" w:eastAsia="Calibri" w:hAnsi="Calibri"/>
+        </w:rPr>
         <w:t xml:space="preserve">TSÉVIÉ : LES FORCES DE SÉCURITÉ DÉPLOYÉES SUR LE SITE DU MEETING REPORTÉ DU CNCC</w:t>
       </w:r>
     </w:p>
@@ -12242,7 +12312,7 @@
         </w:rPr>
         <w:t xml:space="preserve">▪  Source : </w:t>
       </w:r>
-      <w:hyperlink w:history="1" r:id="rIdkga-ycjpqsb9bfn-kf96e">
+      <w:hyperlink w:history="1" r:id="rId8chsqvitv8-gmwh9cnhj_">
         <w:r>
           <w:rPr>
             <w:u w:val="single"/>
@@ -12304,7 +12374,7 @@
         </w:rPr>
         <w:t xml:space="preserve">▪  Source : </w:t>
       </w:r>
-      <w:hyperlink w:history="1" r:id="rIdjv1-ia9zn41zohwluke3t">
+      <w:hyperlink w:history="1" r:id="rIdrw5ssw0uppwt9zmkghbgk">
         <w:r>
           <w:rPr>
             <w:u w:val="single"/>
@@ -12324,79 +12394,6 @@
           <w:rFonts w:ascii="Calibri" w:cs="Calibri" w:eastAsia="Calibri" w:hAnsi="Calibri"/>
         </w:rPr>
         <w:t xml:space="preserve"> — 25 octobre 2026, 10 h UTC</w:t>
-      </w:r>
-    </w:p>
-    <w:p>
-      <w:pPr>
-        <w:spacing w:before="160"/>
-        <w:ind w:left="360"/>
-      </w:pPr>
-      <w:r>
-        <w:rPr>
-          <w:color w:val="1F6B5E"/>
-          <w:sz w:val="28"/>
-          <w:szCs w:val="28"/>
-          <w:rFonts w:ascii="Calibri" w:cs="Calibri" w:eastAsia="Calibri" w:hAnsi="Calibri"/>
-        </w:rPr>
-        <w:t xml:space="preserve">❑  </w:t>
-      </w:r>
-      <w:r>
-        <w:rPr>
-          <w:b/>
-          <w:bCs/>
-          <w:u w:val="single"/>
-          <w:color w:val="1F6B5E"/>
-          <w:sz w:val="28"/>
-          <w:szCs w:val="28"/>
-          <w:rFonts w:ascii="Calibri" w:cs="Calibri" w:eastAsia="Calibri" w:hAnsi="Calibri"/>
-        </w:rPr>
-        <w:t xml:space="preserve">TOGO : AGRICULTURE, NUCLÉAIRE… LES DÉPUTÉS ADOPTENT QUATRE TEXTES STRATÉGIQUES</w:t>
-      </w:r>
-    </w:p>
-    <w:p>
-      <w:pPr>
-        <w:ind w:left="720"/>
-      </w:pPr>
-      <w:r>
-        <w:rPr>
-          <w:color w:val="1F2937"/>
-          <w:sz w:val="26"/>
-          <w:szCs w:val="26"/>
-          <w:rFonts w:ascii="Calibri" w:cs="Calibri" w:eastAsia="Calibri" w:hAnsi="Calibri"/>
-        </w:rPr>
-        <w:t xml:space="preserve">▪  Sources : </w:t>
-      </w:r>
-      <w:hyperlink w:history="1" r:id="rIdmr2huil5nojcivv5aa6vq">
-        <w:r>
-          <w:rPr>
-            <w:u w:val="single"/>
-            <w:color w:val="1F6B5E"/>
-            <w:sz w:val="26"/>
-            <w:szCs w:val="26"/>
-            <w:rFonts w:ascii="Calibri" w:cs="Calibri" w:eastAsia="Calibri" w:hAnsi="Calibri"/>
-          </w:rPr>
-          <w:t xml:space="preserve">24heureinfo.com · ATOP — Agence Togolaise Presse</w:t>
-        </w:r>
-      </w:hyperlink>
-      <w:r>
-        <w:rPr>
-          <w:color w:val="1F2937"/>
-          <w:sz w:val="26"/>
-          <w:szCs w:val="26"/>
-          <w:rFonts w:ascii="Calibri" w:cs="Calibri" w:eastAsia="Calibri" w:hAnsi="Calibri"/>
-        </w:rPr>
-        <w:t xml:space="preserve"> — 23 octobre 2026, 17 h UTC</w:t>
-      </w:r>
-      <w:r>
-        <w:rPr>
-          <w:b/>
-          <w:bCs/>
-          <w:color w:val="1F2937"/>
-          <w:sz w:val="26"/>
-          <w:szCs w:val="26"/>
-          <w:rFonts w:ascii="Calibri" w:cs="Calibri" w:eastAsia="Calibri" w:hAnsi="Calibri"/>
-        </w:rPr>
-        <w:t xml:space="preserve">   ·   Cotation : Confirmé</w:t>
       </w:r>
     </w:p>
     <w:p>
@@ -12629,7 +12626,7 @@
           <w:szCs w:val="22"/>
           <w:rFonts w:ascii="Calibri" w:cs="Calibri" w:eastAsia="Calibri" w:hAnsi="Calibri"/>
         </w:rPr>
-        <w:t xml:space="preserve">Indice de confiance : faible (incident vérifié le plus récent : 120 jours ; aucun signal du jour)</w:t>
+        <w:t xml:space="preserve">Indice de confiance : faible (incident vérifié le plus récent : 121 jours ; aucun signal du jour)</w:t>
       </w:r>
     </w:p>
     <w:tbl>
@@ -12784,7 +12781,7 @@
                 <w:rFonts w:ascii="Calibri" w:cs="Calibri" w:eastAsia="Calibri" w:hAnsi="Calibri"/>
               </w:rPr>
             </w:r>
-            <w:hyperlink w:history="1" r:id="rIdwzjwg44alt69ysniwh3eo">
+            <w:hyperlink w:history="1" r:id="rIdzadkmn-ft19y5gy8cebec">
               <w:r>
                 <w:rPr>
                   <w:u w:val="single"/>
@@ -12841,7 +12838,7 @@
                           </pic:cNvPicPr>
                         </pic:nvPicPr>
                         <pic:blipFill>
-                          <a:blip r:embed="rId14" cstate="none"/>
+                          <a:blip r:embed="rId13" cstate="none"/>
                           <a:srcRect/>
                           <a:stretch>
                             <a:fillRect/>
@@ -12867,7 +12864,7 @@
             <w:pPr>
               <w:jc w:val="right"/>
             </w:pPr>
-            <w:hyperlink w:history="1" r:id="rIdxdpccdzxkxa9taxigkmgx">
+            <w:hyperlink w:history="1" r:id="rId9pcyudyl1hv0chxzgbukz">
               <w:r>
                 <w:rPr>
                   <w:u w:val="single"/>
@@ -13096,7 +13093,7 @@
           <w:szCs w:val="22"/>
           <w:rFonts w:ascii="Calibri" w:cs="Calibri" w:eastAsia="Calibri" w:hAnsi="Calibri"/>
         </w:rPr>
-        <w:t xml:space="preserve">Indice de confiance : faible (incident vérifié le plus récent : 118 jours ; aucun signal du jour)</w:t>
+        <w:t xml:space="preserve">Indice de confiance : faible (incident vérifié le plus récent : 119 jours ; aucun signal du jour)</w:t>
       </w:r>
     </w:p>
     <w:p>
@@ -13221,7 +13218,7 @@
           <w:rFonts w:ascii="Calibri" w:cs="Calibri" w:eastAsia="Calibri" w:hAnsi="Calibri"/>
         </w:rPr>
       </w:r>
-      <w:hyperlink w:history="1" r:id="rIdlzotiotzxm-cw6nynir3g">
+      <w:hyperlink w:history="1" r:id="rId7j3ly91es4zyqe0fbjkcx">
         <w:r>
           <w:rPr>
             <w:u w:val="single"/>
@@ -13483,7 +13480,7 @@
         </w:rPr>
         <w:t xml:space="preserve">▪  Source : </w:t>
       </w:r>
-      <w:hyperlink w:history="1" r:id="rIdmq1xphjusxtyaqgq-xoi2">
+      <w:hyperlink w:history="1" r:id="rIdgvup9ih5oqza_map3zc5s">
         <w:r>
           <w:rPr>
             <w:u w:val="single"/>
@@ -13545,7 +13542,7 @@
         </w:rPr>
         <w:t xml:space="preserve">▪  Source : </w:t>
       </w:r>
-      <w:hyperlink w:history="1" r:id="rIdagemwbewxn_hzmhgjr0ys">
+      <w:hyperlink w:history="1" r:id="rIdpxqb0pgscuw7_3d3lutny">
         <w:r>
           <w:rPr>
             <w:u w:val="single"/>
@@ -13607,7 +13604,7 @@
         </w:rPr>
         <w:t xml:space="preserve">▪  Source : </w:t>
       </w:r>
-      <w:hyperlink w:history="1" r:id="rIdoka41ebrresidagqmwvka">
+      <w:hyperlink w:history="1" r:id="rIdcnkhqxex93cs0i_sdotde">
         <w:r>
           <w:rPr>
             <w:u w:val="single"/>
@@ -13669,7 +13666,7 @@
         </w:rPr>
         <w:t xml:space="preserve">▪  Source : </w:t>
       </w:r>
-      <w:hyperlink w:history="1" r:id="rIdcodwqindeahn0ibsxynba">
+      <w:hyperlink w:history="1" r:id="rIdhuyhfsf69iwzkncmihthp">
         <w:r>
           <w:rPr>
             <w:u w:val="single"/>
@@ -13731,7 +13728,7 @@
         </w:rPr>
         <w:t xml:space="preserve">▪  Source : </w:t>
       </w:r>
-      <w:hyperlink w:history="1" r:id="rIdvlfhj32gppbi2cw_hapm7">
+      <w:hyperlink w:history="1" r:id="rIdjyfzymasa9ag5qzujbbee">
         <w:r>
           <w:rPr>
             <w:u w:val="single"/>
@@ -13993,7 +13990,7 @@
         </w:rPr>
         <w:t xml:space="preserve">▪  Source : </w:t>
       </w:r>
-      <w:hyperlink w:history="1" r:id="rId20fmy1ucx8tyfkunrh6jy">
+      <w:hyperlink w:history="1" r:id="rIdjq5yd9yljrgw8eck_tdb-">
         <w:r>
           <w:rPr>
             <w:u w:val="single"/>
@@ -14055,7 +14052,7 @@
         </w:rPr>
         <w:t xml:space="preserve">▪  Source : </w:t>
       </w:r>
-      <w:hyperlink w:history="1" r:id="rIdl3oipoenbvfrd5wysqenw">
+      <w:hyperlink w:history="1" r:id="rIdki-rrorjayly4eq33oid9">
         <w:r>
           <w:rPr>
             <w:u w:val="single"/>
@@ -14117,7 +14114,7 @@
         </w:rPr>
         <w:t xml:space="preserve">▪  Source : </w:t>
       </w:r>
-      <w:hyperlink w:history="1" r:id="rIdmpe0_czlarlzof5kqexa3">
+      <w:hyperlink w:history="1" r:id="rIdyhnowmp_c8rwr7k4o_sea">
         <w:r>
           <w:rPr>
             <w:u w:val="single"/>
@@ -14190,7 +14187,7 @@
         </w:rPr>
         <w:t xml:space="preserve">▪  Source : </w:t>
       </w:r>
-      <w:hyperlink w:history="1" r:id="rId_jglmyb6thqasbioi58l0">
+      <w:hyperlink w:history="1" r:id="rId2hqb8mj1qr11w-hjpb1if">
         <w:r>
           <w:rPr>
             <w:u w:val="single"/>
@@ -14498,7 +14495,7 @@
           <w:szCs w:val="22"/>
           <w:rFonts w:ascii="Calibri" w:cs="Calibri" w:eastAsia="Calibri" w:hAnsi="Calibri"/>
         </w:rPr>
-        <w:t xml:space="preserve">Indice de confiance : faible (incident vérifié le plus récent : 210 jours ; aucun signal du jour)</w:t>
+        <w:t xml:space="preserve">Indice de confiance : moyenne (incident vérifié le plus récent : 211 jours ; 1 signal du jour)</w:t>
       </w:r>
     </w:p>
     <w:p>
@@ -14514,7 +14511,7 @@
           <w:szCs w:val="40"/>
           <w:rFonts w:ascii="Arial Narrow" w:cs="Arial Narrow" w:eastAsia="Arial Narrow" w:hAnsi="Arial Narrow"/>
         </w:rPr>
-        <w:t xml:space="preserve">Liberia: Dolphin Killed, Butchered Before NaFAA Rescue Team Arrived</w:t>
+        <w:t xml:space="preserve">Libéria : Un dauphin tué et massacré avant l'arrivée de l'équipe de secours de la NaFAA</w:t>
       </w:r>
     </w:p>
     <w:p>
@@ -14584,7 +14581,7 @@
           <w:szCs w:val="26"/>
           <w:rFonts w:ascii="Calibri" w:cs="Calibri" w:eastAsia="Calibri" w:hAnsi="Calibri"/>
         </w:rPr>
-        <w:t xml:space="preserve">« Monrovia — What began as a moment of hope for conservationists ended in frustration after a dolphin that washed ashore at Miami Beach in Monrovia was killed and… »</w:t>
+        <w:t xml:space="preserve">« Monrovia — Ce qui a commencé comme un moment d'espoir pour les défenseurs de l'environnement s'est terminé par une frustration après qu'un dauphin qui s'est échoué à Miami Beach à Monrovia a été tué et… »</w:t>
       </w:r>
     </w:p>
     <w:p>
@@ -14611,7 +14608,7 @@
           <w:szCs w:val="26"/>
           <w:rFonts w:ascii="Calibri" w:cs="Calibri" w:eastAsia="Calibri" w:hAnsi="Calibri"/>
         </w:rPr>
-        <w:t xml:space="preserve">Fait sécuritaire à suivre : vérifier son incidence sur les sites, les itinéraires et les personnels présents dans la zone.</w:t>
+        <w:t xml:space="preserve">Menace armée sur les axes et localités de la zone : réévaluer les déplacements terrestres (horaires, convois, itinéraires de repli) et les consignes des sites et des personnels présents à proximité.</w:t>
       </w:r>
     </w:p>
     <w:p>
@@ -14637,7 +14634,7 @@
           <w:rFonts w:ascii="Calibri" w:cs="Calibri" w:eastAsia="Calibri" w:hAnsi="Calibri"/>
         </w:rPr>
       </w:r>
-      <w:hyperlink w:history="1" r:id="rId2kcub9lgij-fhi2megdpi">
+      <w:hyperlink w:history="1" r:id="rIdqaviq13ojfactlsrtrwik">
         <w:r>
           <w:rPr>
             <w:u w:val="single"/>
@@ -14972,7 +14969,7 @@
         </w:rPr>
         <w:t xml:space="preserve">▪  Source : </w:t>
       </w:r>
-      <w:hyperlink w:history="1" r:id="rIdfvavq_wl0ze4-__lx83pz">
+      <w:hyperlink w:history="1" r:id="rIdlptshnyjwvn3hqkzinxdp">
         <w:r>
           <w:rPr>
             <w:u w:val="single"/>
@@ -15034,7 +15031,7 @@
         </w:rPr>
         <w:t xml:space="preserve">▪  Source : </w:t>
       </w:r>
-      <w:hyperlink w:history="1" r:id="rIdjnj4deknobaz7dj52ome0">
+      <w:hyperlink w:history="1" r:id="rId2xrhurrj2b9kufgzh0xjn">
         <w:r>
           <w:rPr>
             <w:u w:val="single"/>
@@ -15080,7 +15077,7 @@
           <w:szCs w:val="28"/>
           <w:rFonts w:ascii="Calibri" w:cs="Calibri" w:eastAsia="Calibri" w:hAnsi="Calibri"/>
         </w:rPr>
-        <w:t xml:space="preserve">(EN) A FORMER SECURITY CHIEF’S VISION FOR LIBERIA’S IMMIGRATION SERVICE FINALLY PLAYS</w:t>
+        <w:t xml:space="preserve">LIBÉRIA : DANS LE CADRE DE LA TENTATIVE DE LA DÉFENSE D’ANNULER LA CONDAMNATION DE PETER BON JALLAH</w:t>
       </w:r>
     </w:p>
     <w:p>
@@ -15096,7 +15093,7 @@
         </w:rPr>
         <w:t xml:space="preserve">▪  Source : </w:t>
       </w:r>
-      <w:hyperlink w:history="1" r:id="rIdab7gtsqgdxrmftv_s5us-">
+      <w:hyperlink w:history="1" r:id="rId1kiqzz87bggo84gwu-lo1">
         <w:r>
           <w:rPr>
             <w:u w:val="single"/>
@@ -15115,7 +15112,18 @@
           <w:szCs w:val="26"/>
           <w:rFonts w:ascii="Calibri" w:cs="Calibri" w:eastAsia="Calibri" w:hAnsi="Calibri"/>
         </w:rPr>
-        <w:t xml:space="preserve"> — 26 octobre 2026, 6 h UTC</w:t>
+        <w:t xml:space="preserve"> — 28 octobre 2026, 7 h UTC</w:t>
+      </w:r>
+      <w:r>
+        <w:rPr>
+          <w:b/>
+          <w:bCs/>
+          <w:color w:val="1F2937"/>
+          <w:sz w:val="26"/>
+          <w:szCs w:val="26"/>
+          <w:rFonts w:ascii="Calibri" w:cs="Calibri" w:eastAsia="Calibri" w:hAnsi="Calibri"/>
+        </w:rPr>
+        <w:t xml:space="preserve">   ·   Cotation : Probable</w:t>
       </w:r>
     </w:p>
     <w:p>
@@ -15142,7 +15150,7 @@
           <w:szCs w:val="28"/>
           <w:rFonts w:ascii="Calibri" w:cs="Calibri" w:eastAsia="Calibri" w:hAnsi="Calibri"/>
         </w:rPr>
-        <w:t xml:space="preserve">(EN) LIBERIA IMPOSES 21-DAY ISOLATION AND MONITORING RULES FOR TRAVELERS AMID REGIONAL EBOLA THREAT</w:t>
+        <w:t xml:space="preserve">LA VISION D'UN ANCIEN CHEF DE LA SÉCURITÉ POUR LE SERVICE D'IMMIGRATION DU LIBÉRIA JOUE ENFIN</w:t>
       </w:r>
     </w:p>
     <w:p>
@@ -15158,7 +15166,69 @@
         </w:rPr>
         <w:t xml:space="preserve">▪  Source : </w:t>
       </w:r>
-      <w:hyperlink w:history="1" r:id="rIdjb36vrrq3w0grit0ddeed">
+      <w:hyperlink w:history="1" r:id="rIdr6rgxdxzpy5vz076y780l">
+        <w:r>
+          <w:rPr>
+            <w:u w:val="single"/>
+            <w:color w:val="1F6B5E"/>
+            <w:sz w:val="26"/>
+            <w:szCs w:val="26"/>
+            <w:rFonts w:ascii="Calibri" w:cs="Calibri" w:eastAsia="Calibri" w:hAnsi="Calibri"/>
+          </w:rPr>
+          <w:t xml:space="preserve">FrontPageAfrica — Liberia</w:t>
+        </w:r>
+      </w:hyperlink>
+      <w:r>
+        <w:rPr>
+          <w:color w:val="1F2937"/>
+          <w:sz w:val="26"/>
+          <w:szCs w:val="26"/>
+          <w:rFonts w:ascii="Calibri" w:cs="Calibri" w:eastAsia="Calibri" w:hAnsi="Calibri"/>
+        </w:rPr>
+        <w:t xml:space="preserve"> — 26 octobre 2026, 6 h UTC</w:t>
+      </w:r>
+    </w:p>
+    <w:p>
+      <w:pPr>
+        <w:spacing w:before="160"/>
+        <w:ind w:left="360"/>
+      </w:pPr>
+      <w:r>
+        <w:rPr>
+          <w:color w:val="1F6B5E"/>
+          <w:sz w:val="28"/>
+          <w:szCs w:val="28"/>
+          <w:rFonts w:ascii="Calibri" w:cs="Calibri" w:eastAsia="Calibri" w:hAnsi="Calibri"/>
+        </w:rPr>
+        <w:t xml:space="preserve">❑  </w:t>
+      </w:r>
+      <w:r>
+        <w:rPr>
+          <w:b/>
+          <w:bCs/>
+          <w:u w:val="single"/>
+          <w:color w:val="1F6B5E"/>
+          <w:sz w:val="28"/>
+          <w:szCs w:val="28"/>
+          <w:rFonts w:ascii="Calibri" w:cs="Calibri" w:eastAsia="Calibri" w:hAnsi="Calibri"/>
+        </w:rPr>
+        <w:t xml:space="preserve">LE LIBÉRIA IMPOSE DES RÈGLES D'ISOLEMENT ET DE SURVEILLANCE DE 21 JOURS AUX VOYAGEURS FACE À LA MENACE RÉGIONALE D'EBOLA</w:t>
+      </w:r>
+    </w:p>
+    <w:p>
+      <w:pPr>
+        <w:ind w:left="720"/>
+      </w:pPr>
+      <w:r>
+        <w:rPr>
+          <w:color w:val="1F2937"/>
+          <w:sz w:val="26"/>
+          <w:szCs w:val="26"/>
+          <w:rFonts w:ascii="Calibri" w:cs="Calibri" w:eastAsia="Calibri" w:hAnsi="Calibri"/>
+        </w:rPr>
+        <w:t xml:space="preserve">▪  Source : </w:t>
+      </w:r>
+      <w:hyperlink w:history="1" r:id="rId6g6slyc9fndefc0cnp6vy">
         <w:r>
           <w:rPr>
             <w:u w:val="single"/>
@@ -15182,6 +15252,268 @@
     </w:p>
     <w:p>
       <w:pPr>
+        <w:pageBreakBefore/>
+        <w:spacing w:after="0" w:before="0"/>
+        <w:rPr>
+          <w:sz w:val="2"/>
+          <w:szCs w:val="2"/>
+        </w:rPr>
+      </w:pPr>
+    </w:p>
+    <w:tbl>
+      <w:tblPr>
+        <w:tblW w:type="dxa" w:w="17680"/>
+        <w:tblBorders>
+          <w:top w:val="single" w:color="auto" w:sz="4"/>
+          <w:left w:val="single" w:color="auto" w:sz="4"/>
+          <w:bottom w:val="single" w:color="auto" w:sz="4"/>
+          <w:right w:val="single" w:color="auto" w:sz="4"/>
+          <w:insideH w:val="single" w:color="auto" w:sz="4"/>
+          <w:insideV w:val="single" w:color="auto" w:sz="4"/>
+        </w:tblBorders>
+      </w:tblPr>
+      <w:tblGrid>
+        <w:gridCol w:w="1000"/>
+        <w:gridCol w:w="15180"/>
+        <w:gridCol w:w="1500"/>
+      </w:tblGrid>
+      <w:tr>
+        <w:tc>
+          <w:tcPr>
+            <w:tcW w:type="dxa" w:w="1000"/>
+            <w:tcBorders>
+              <w:top w:val="none" w:color="FFFFFF" w:sz="0"/>
+              <w:left w:val="none" w:color="FFFFFF" w:sz="0"/>
+              <w:bottom w:val="none" w:color="FFFFFF" w:sz="0"/>
+              <w:right w:val="none" w:color="FFFFFF" w:sz="0"/>
+            </w:tcBorders>
+            <w:shd w:fill="1F6B5E" w:color="auto" w:val="clear"/>
+            <w:vAlign w:val="center"/>
+          </w:tcPr>
+          <w:p>
+            <w:pPr>
+              <w:jc w:val="center"/>
+            </w:pPr>
+            <w:r>
+              <w:rPr>
+                <w:color w:val="FFFFFF"/>
+                <w:sz w:val="28"/>
+                <w:szCs w:val="28"/>
+                <w:rFonts w:ascii="Arial Narrow" w:cs="Arial Narrow" w:eastAsia="Arial Narrow" w:hAnsi="Arial Narrow"/>
+              </w:rPr>
+              <w:t xml:space="preserve">VIII</w:t>
+            </w:r>
+          </w:p>
+        </w:tc>
+        <w:tc>
+          <w:tcPr>
+            <w:tcW w:type="dxa" w:w="15180"/>
+            <w:tcBorders>
+              <w:top w:val="none" w:color="FFFFFF" w:sz="0"/>
+              <w:left w:val="none" w:color="FFFFFF" w:sz="0"/>
+              <w:bottom w:val="none" w:color="FFFFFF" w:sz="0"/>
+              <w:right w:val="none" w:color="FFFFFF" w:sz="0"/>
+            </w:tcBorders>
+            <w:vAlign w:val="center"/>
+          </w:tcPr>
+          <w:p>
+            <w:pPr>
+              <w:ind w:left="200"/>
+            </w:pPr>
+            <w:r>
+              <w:rPr>
+                <w:color w:val="1F6B5E"/>
+                <w:sz w:val="56"/>
+                <w:szCs w:val="56"/>
+                <w:rFonts w:ascii="Arial Narrow" w:cs="Arial Narrow" w:eastAsia="Arial Narrow" w:hAnsi="Arial Narrow"/>
+              </w:rPr>
+              <w:t xml:space="preserve">Liberia</w:t>
+            </w:r>
+          </w:p>
+        </w:tc>
+        <w:tc>
+          <w:tcPr>
+            <w:tcW w:type="dxa" w:w="1500"/>
+            <w:tcBorders>
+              <w:top w:val="none" w:color="FFFFFF" w:sz="0"/>
+              <w:left w:val="none" w:color="FFFFFF" w:sz="0"/>
+              <w:bottom w:val="none" w:color="FFFFFF" w:sz="0"/>
+              <w:right w:val="none" w:color="FFFFFF" w:sz="0"/>
+            </w:tcBorders>
+            <w:vAlign w:val="center"/>
+          </w:tcPr>
+          <w:tbl>
+            <w:tblPr>
+              <w:tblW w:type="dxa" w:w="1200"/>
+              <w:tblBorders>
+                <w:top w:val="single" w:color="auto" w:sz="4"/>
+                <w:left w:val="single" w:color="auto" w:sz="4"/>
+                <w:bottom w:val="single" w:color="auto" w:sz="4"/>
+                <w:right w:val="single" w:color="auto" w:sz="4"/>
+                <w:insideH w:val="single" w:color="auto" w:sz="4"/>
+                <w:insideV w:val="single" w:color="auto" w:sz="4"/>
+              </w:tblBorders>
+            </w:tblPr>
+            <w:tblGrid>
+              <w:gridCol w:w="1200"/>
+            </w:tblGrid>
+            <w:tr>
+              <w:trPr>
+                <w:trHeight w:val="120" w:hRule="exact"/>
+              </w:trPr>
+              <w:tc>
+                <w:tcPr>
+                  <w:tcW w:type="dxa" w:w="1200"/>
+                  <w:tcBorders>
+                    <w:top w:val="single" w:color="1F2937" w:sz="6"/>
+                    <w:left w:val="single" w:color="1F2937" w:sz="6"/>
+                    <w:bottom w:val="single" w:color="1F2937" w:sz="6"/>
+                    <w:right w:val="single" w:color="1F2937" w:sz="6"/>
+                  </w:tcBorders>
+                  <w:shd w:fill="BF0A30" w:color="auto" w:val="clear"/>
+                </w:tcPr>
+                <w:p>
+                  <w:r>
+                    <w:rPr>
+                      <w:color w:val="1F2937"/>
+                      <w:sz w:val="2"/>
+                      <w:szCs w:val="2"/>
+                      <w:rFonts w:ascii="Calibri" w:cs="Calibri" w:eastAsia="Calibri" w:hAnsi="Calibri"/>
+                    </w:rPr>
+                  </w:r>
+                </w:p>
+              </w:tc>
+            </w:tr>
+            <w:tr>
+              <w:trPr>
+                <w:trHeight w:val="120" w:hRule="exact"/>
+              </w:trPr>
+              <w:tc>
+                <w:tcPr>
+                  <w:tcW w:type="dxa" w:w="1200"/>
+                  <w:tcBorders>
+                    <w:top w:val="single" w:color="1F2937" w:sz="6"/>
+                    <w:left w:val="single" w:color="1F2937" w:sz="6"/>
+                    <w:bottom w:val="single" w:color="1F2937" w:sz="6"/>
+                    <w:right w:val="single" w:color="1F2937" w:sz="6"/>
+                  </w:tcBorders>
+                  <w:shd w:fill="FFFFFF" w:color="auto" w:val="clear"/>
+                </w:tcPr>
+                <w:p>
+                  <w:r>
+                    <w:rPr>
+                      <w:color w:val="1F2937"/>
+                      <w:sz w:val="2"/>
+                      <w:szCs w:val="2"/>
+                      <w:rFonts w:ascii="Calibri" w:cs="Calibri" w:eastAsia="Calibri" w:hAnsi="Calibri"/>
+                    </w:rPr>
+                  </w:r>
+                </w:p>
+              </w:tc>
+            </w:tr>
+            <w:tr>
+              <w:trPr>
+                <w:trHeight w:val="120" w:hRule="exact"/>
+              </w:trPr>
+              <w:tc>
+                <w:tcPr>
+                  <w:tcW w:type="dxa" w:w="1200"/>
+                  <w:tcBorders>
+                    <w:top w:val="single" w:color="1F2937" w:sz="6"/>
+                    <w:left w:val="single" w:color="1F2937" w:sz="6"/>
+                    <w:bottom w:val="single" w:color="1F2937" w:sz="6"/>
+                    <w:right w:val="single" w:color="1F2937" w:sz="6"/>
+                  </w:tcBorders>
+                  <w:shd w:fill="BF0A30" w:color="auto" w:val="clear"/>
+                </w:tcPr>
+                <w:p>
+                  <w:r>
+                    <w:rPr>
+                      <w:color w:val="1F2937"/>
+                      <w:sz w:val="2"/>
+                      <w:szCs w:val="2"/>
+                      <w:rFonts w:ascii="Calibri" w:cs="Calibri" w:eastAsia="Calibri" w:hAnsi="Calibri"/>
+                    </w:rPr>
+                  </w:r>
+                </w:p>
+              </w:tc>
+            </w:tr>
+            <w:tr>
+              <w:trPr>
+                <w:trHeight w:val="120" w:hRule="exact"/>
+              </w:trPr>
+              <w:tc>
+                <w:tcPr>
+                  <w:tcW w:type="dxa" w:w="1200"/>
+                  <w:tcBorders>
+                    <w:top w:val="single" w:color="1F2937" w:sz="6"/>
+                    <w:left w:val="single" w:color="1F2937" w:sz="6"/>
+                    <w:bottom w:val="single" w:color="1F2937" w:sz="6"/>
+                    <w:right w:val="single" w:color="1F2937" w:sz="6"/>
+                  </w:tcBorders>
+                  <w:shd w:fill="FFFFFF" w:color="auto" w:val="clear"/>
+                </w:tcPr>
+                <w:p>
+                  <w:r>
+                    <w:rPr>
+                      <w:color w:val="1F2937"/>
+                      <w:sz w:val="2"/>
+                      <w:szCs w:val="2"/>
+                      <w:rFonts w:ascii="Calibri" w:cs="Calibri" w:eastAsia="Calibri" w:hAnsi="Calibri"/>
+                    </w:rPr>
+                  </w:r>
+                </w:p>
+              </w:tc>
+            </w:tr>
+            <w:tr>
+              <w:trPr>
+                <w:trHeight w:val="120" w:hRule="exact"/>
+              </w:trPr>
+              <w:tc>
+                <w:tcPr>
+                  <w:tcW w:type="dxa" w:w="1200"/>
+                  <w:tcBorders>
+                    <w:top w:val="single" w:color="1F2937" w:sz="6"/>
+                    <w:left w:val="single" w:color="1F2937" w:sz="6"/>
+                    <w:bottom w:val="single" w:color="1F2937" w:sz="6"/>
+                    <w:right w:val="single" w:color="1F2937" w:sz="6"/>
+                  </w:tcBorders>
+                  <w:shd w:fill="BF0A30" w:color="auto" w:val="clear"/>
+                </w:tcPr>
+                <w:p>
+                  <w:r>
+                    <w:rPr>
+                      <w:color w:val="1F2937"/>
+                      <w:sz w:val="2"/>
+                      <w:szCs w:val="2"/>
+                      <w:rFonts w:ascii="Calibri" w:cs="Calibri" w:eastAsia="Calibri" w:hAnsi="Calibri"/>
+                    </w:rPr>
+                  </w:r>
+                </w:p>
+              </w:tc>
+            </w:tr>
+          </w:tbl>
+          <w:p/>
+        </w:tc>
+      </w:tr>
+    </w:tbl>
+    <w:p>
+      <w:pPr>
+        <w:pBdr>
+          <w:bottom w:val="single" w:color="A3A3A3" w:sz="4" w:space="1"/>
+        </w:pBdr>
+      </w:pPr>
+      <w:r>
+        <w:rPr>
+          <w:color w:val="1F2937"/>
+          <w:sz w:val="12"/>
+          <w:szCs w:val="12"/>
+          <w:rFonts w:ascii="Calibri" w:cs="Calibri" w:eastAsia="Calibri" w:hAnsi="Calibri"/>
+        </w:rPr>
+      </w:r>
+    </w:p>
+    <w:p>
+      <w:pPr>
         <w:spacing w:before="160"/>
         <w:ind w:left="360"/>
       </w:pPr>
@@ -15204,7 +15536,7 @@
           <w:szCs w:val="28"/>
           <w:rFonts w:ascii="Calibri" w:cs="Calibri" w:eastAsia="Calibri" w:hAnsi="Calibri"/>
         </w:rPr>
-        <w:t xml:space="preserve">(EN) AFL FIRES TWO SOLDIERS OVER ASSAULT</w:t>
+        <w:t xml:space="preserve">L'AFL TIRE SUR DEUX SOLDATS À LA SUITE D'UN ASSAUT</w:t>
       </w:r>
     </w:p>
     <w:p>
@@ -15220,7 +15552,7 @@
         </w:rPr>
         <w:t xml:space="preserve">▪  Source : </w:t>
       </w:r>
-      <w:hyperlink w:history="1" r:id="rIdm2p3uuqgr-camh11xhwyv">
+      <w:hyperlink w:history="1" r:id="rIdneqpcnwdcd5jp6cfdav4b">
         <w:r>
           <w:rPr>
             <w:u w:val="single"/>
@@ -15501,7 +15833,7 @@
                 <w:szCs w:val="40"/>
                 <w:rFonts w:ascii="Arial Narrow" w:cs="Arial Narrow" w:eastAsia="Arial Narrow" w:hAnsi="Arial Narrow"/>
               </w:rPr>
-              <w:t xml:space="preserve">Immeuble effondré à Thiès : un mort et deux blessés, selon le bilan provisoire</w:t>
+              <w:t xml:space="preserve">Touba : un débat sur les moteurs de Jakarta se termine par la mort de Baye M. Diop</w:t>
             </w:r>
           </w:p>
           <w:p>
@@ -15528,7 +15860,7 @@
                 <w:szCs w:val="26"/>
                 <w:rFonts w:ascii="Calibri" w:cs="Calibri" w:eastAsia="Calibri" w:hAnsi="Calibri"/>
               </w:rPr>
-              <w:t xml:space="preserve">Fait rapporté le mardi 27 octobre 2026. Lieu : Thiès, Sénégal. Actualité sociale. Repris par 2 médias distincts (APS — Agence Sénégalaise Presse, Pressafrik) : le fait est recoupé.</w:t>
+              <w:t xml:space="preserve">Fait rapporté le mercredi 28 octobre 2026. Lieu : Sénégal. Actualité politique. Une seule source à ce stade (Dakar Actu) : à confirmer par un second média.</w:t>
             </w:r>
           </w:p>
           <w:p>
@@ -15560,7 +15892,7 @@
                 <w:szCs w:val="26"/>
                 <w:rFonts w:ascii="Calibri" w:cs="Calibri" w:eastAsia="Calibri" w:hAnsi="Calibri"/>
               </w:rPr>
-              <w:t xml:space="preserve">APS — Agence Sénégalaise Presse : </w:t>
+              <w:t xml:space="preserve">Dakar Actu : </w:t>
             </w:r>
             <w:r>
               <w:rPr>
@@ -15571,12 +15903,39 @@
                 <w:szCs w:val="26"/>
                 <w:rFonts w:ascii="Calibri" w:cs="Calibri" w:eastAsia="Calibri" w:hAnsi="Calibri"/>
               </w:rPr>
-              <w:t xml:space="preserve">« Thiès, 27 oct (APS) –L’effondrement d’un immeuble R+5 en construction mardi dans la commune de Thiès-Ouest a fait trois victimes, dont un mort et deux blessés extraits des décombres, selon le bilan provisoire tiré par le Groupement d’incendie et de secours numéro 2, couvrant les régions de Thiès et Diourbel. »</w:t>
+              <w:t xml:space="preserve">« Une discussion entre deux amis a dégénéré dans la nuit du 26 au 27 octobre à Darou Khoudoss. Selon L’Observateur, Baye M. Diop a été mortellement poignardé par un conducteur de Jakarta qui a pris la fuite. Le différend portait sur la puissance et les caractéristiques des moteurs de motos Jakarta. Il s’est achevé par la mort de Baye M. »</w:t>
             </w:r>
           </w:p>
           <w:p>
             <w:pPr>
-              <w:spacing w:after="60"/>
+              <w:spacing w:before="120" w:after="20"/>
+            </w:pPr>
+            <w:r>
+              <w:rPr>
+                <w:b/>
+                <w:bCs/>
+                <w:color w:val="1F6B5E"/>
+                <w:sz w:val="28"/>
+                <w:szCs w:val="28"/>
+                <w:rFonts w:ascii="Calibri" w:cs="Calibri" w:eastAsia="Calibri" w:hAnsi="Calibri"/>
+              </w:rPr>
+              <w:t xml:space="preserve">Enjeux sûreté</w:t>
+            </w:r>
+          </w:p>
+          <w:p>
+            <w:r>
+              <w:rPr>
+                <w:color w:val="1F2937"/>
+                <w:sz w:val="26"/>
+                <w:szCs w:val="26"/>
+                <w:rFonts w:ascii="Calibri" w:cs="Calibri" w:eastAsia="Calibri" w:hAnsi="Calibri"/>
+              </w:rPr>
+              <w:t xml:space="preserve">Climat politique à suivre : en mesurer l'incidence sur la stabilité locale et les déplacements.</w:t>
+            </w:r>
+          </w:p>
+          <w:p>
+            <w:pPr>
+              <w:spacing w:before="120"/>
             </w:pPr>
             <w:r>
               <w:rPr>
@@ -15587,71 +15946,17 @@
                 <w:szCs w:val="26"/>
                 <w:rFonts w:ascii="Calibri" w:cs="Calibri" w:eastAsia="Calibri" w:hAnsi="Calibri"/>
               </w:rPr>
-              <w:t xml:space="preserve">Pressafrik : </w:t>
-            </w:r>
-            <w:r>
-              <w:rPr>
-                <w:i/>
-                <w:iCs/>
+              <w:t xml:space="preserve">Source : </w:t>
+            </w:r>
+            <w:r>
+              <w:rPr>
                 <w:color w:val="1F2937"/>
                 <w:sz w:val="26"/>
                 <w:szCs w:val="26"/>
                 <w:rFonts w:ascii="Calibri" w:cs="Calibri" w:eastAsia="Calibri" w:hAnsi="Calibri"/>
               </w:rPr>
-              <w:t xml:space="preserve">« Les secours ont dégagé trois personnes des ruines de l’immeuble de deux étages en construction qu... www.pressafrik.com »</w:t>
-            </w:r>
-          </w:p>
-          <w:p>
-            <w:pPr>
-              <w:spacing w:before="120" w:after="20"/>
-            </w:pPr>
-            <w:r>
-              <w:rPr>
-                <w:b/>
-                <w:bCs/>
-                <w:color w:val="1F6B5E"/>
-                <w:sz w:val="28"/>
-                <w:szCs w:val="28"/>
-                <w:rFonts w:ascii="Calibri" w:cs="Calibri" w:eastAsia="Calibri" w:hAnsi="Calibri"/>
-              </w:rPr>
-              <w:t xml:space="preserve">Enjeux sûreté</w:t>
-            </w:r>
-          </w:p>
-          <w:p>
-            <w:r>
-              <w:rPr>
-                <w:color w:val="1F2937"/>
-                <w:sz w:val="26"/>
-                <w:szCs w:val="26"/>
-                <w:rFonts w:ascii="Calibri" w:cs="Calibri" w:eastAsia="Calibri" w:hAnsi="Calibri"/>
-              </w:rPr>
-              <w:t xml:space="preserve">Risque accidentel ou technique : rappeler les consignes de sécurité routière et incendie, vérifier l'exposition des sites et des prestataires.</w:t>
-            </w:r>
-          </w:p>
-          <w:p>
-            <w:pPr>
-              <w:spacing w:before="120"/>
-            </w:pPr>
-            <w:r>
-              <w:rPr>
-                <w:b/>
-                <w:bCs/>
-                <w:color w:val="1F2937"/>
-                <w:sz w:val="26"/>
-                <w:szCs w:val="26"/>
-                <w:rFonts w:ascii="Calibri" w:cs="Calibri" w:eastAsia="Calibri" w:hAnsi="Calibri"/>
-              </w:rPr>
-              <w:t xml:space="preserve">Sources : </w:t>
-            </w:r>
-            <w:r>
-              <w:rPr>
-                <w:color w:val="1F2937"/>
-                <w:sz w:val="26"/>
-                <w:szCs w:val="26"/>
-                <w:rFonts w:ascii="Calibri" w:cs="Calibri" w:eastAsia="Calibri" w:hAnsi="Calibri"/>
-              </w:rPr>
-            </w:r>
-            <w:hyperlink w:history="1" r:id="rIdmqjkyo-7igqkhrqfuonbl">
+            </w:r>
+            <w:hyperlink w:history="1" r:id="rIdv3ztg2ztocovn6vf9yn_n">
               <w:r>
                 <w:rPr>
                   <w:u w:val="single"/>
@@ -15660,7 +15965,7 @@
                   <w:szCs w:val="26"/>
                   <w:rFonts w:ascii="Calibri" w:cs="Calibri" w:eastAsia="Calibri" w:hAnsi="Calibri"/>
                 </w:rPr>
-                <w:t xml:space="preserve">APS — Agence Sénégalaise Presse</w:t>
+                <w:t xml:space="preserve">Dakar Actu</w:t>
               </w:r>
             </w:hyperlink>
             <w:r>
@@ -15670,28 +15975,7 @@
                 <w:szCs w:val="26"/>
                 <w:rFonts w:ascii="Calibri" w:cs="Calibri" w:eastAsia="Calibri" w:hAnsi="Calibri"/>
               </w:rPr>
-              <w:t xml:space="preserve"> · </w:t>
-            </w:r>
-            <w:hyperlink w:history="1" r:id="rIdg1xmhw3ccr1wqdxp8cers">
-              <w:r>
-                <w:rPr>
-                  <w:u w:val="single"/>
-                  <w:color w:val="1F6B5E"/>
-                  <w:sz w:val="26"/>
-                  <w:szCs w:val="26"/>
-                  <w:rFonts w:ascii="Calibri" w:cs="Calibri" w:eastAsia="Calibri" w:hAnsi="Calibri"/>
-                </w:rPr>
-                <w:t xml:space="preserve">Pressafrik</w:t>
-              </w:r>
-            </w:hyperlink>
-            <w:r>
-              <w:rPr>
-                <w:color w:val="1F2937"/>
-                <w:sz w:val="26"/>
-                <w:szCs w:val="26"/>
-                <w:rFonts w:ascii="Calibri" w:cs="Calibri" w:eastAsia="Calibri" w:hAnsi="Calibri"/>
-              </w:rPr>
-              <w:t xml:space="preserve"> — 27 octobre 2026, 19 h UTC</w:t>
+              <w:t xml:space="preserve"> — 28 octobre 2026, 8 h UTC</w:t>
             </w:r>
             <w:r>
               <w:rPr>
@@ -15702,7 +15986,7 @@
                 <w:szCs w:val="26"/>
                 <w:rFonts w:ascii="Calibri" w:cs="Calibri" w:eastAsia="Calibri" w:hAnsi="Calibri"/>
               </w:rPr>
-              <w:t xml:space="preserve">   ·   Cotation : Confirmé</w:t>
+              <w:t xml:space="preserve">   ·   Cotation : Probable</w:t>
             </w:r>
           </w:p>
         </w:tc>
@@ -15724,7 +16008,7 @@
             <w:r>
               <w:drawing>
                 <wp:inline distT="0" distB="0" distL="0" distR="0">
-                  <wp:extent cx="3810000" cy="2266950"/>
+                  <wp:extent cx="3810000" cy="2143125"/>
                   <wp:effectExtent t="0" r="0" b="0" l="0"/>
                   <wp:docPr id="1" name="" descr="" title=""/>
                   <wp:cNvGraphicFramePr>
@@ -15740,7 +16024,7 @@
                           </pic:cNvPicPr>
                         </pic:nvPicPr>
                         <pic:blipFill>
-                          <a:blip r:embed="rId15" cstate="none"/>
+                          <a:blip r:embed="rId14" cstate="none"/>
                           <a:srcRect/>
                           <a:stretch>
                             <a:fillRect/>
@@ -15749,7 +16033,7 @@
                         <pic:spPr bwMode="auto">
                           <a:xfrm>
                             <a:off x="0" y="0"/>
-                            <a:ext cx="3810000" cy="2266950"/>
+                            <a:ext cx="3810000" cy="2143125"/>
                           </a:xfrm>
                           <a:prstGeom prst="rect">
                             <a:avLst/>
@@ -15766,7 +16050,7 @@
             <w:pPr>
               <w:jc w:val="right"/>
             </w:pPr>
-            <w:hyperlink w:history="1" r:id="rIdmgbnboac28if6ewohz0r_">
+            <w:hyperlink w:history="1" r:id="rIdm_vvqx6dmsrfeo9gyxvwn">
               <w:r>
                 <w:rPr>
                   <w:u w:val="single"/>
@@ -15775,7 +16059,7 @@
                   <w:szCs w:val="16"/>
                   <w:rFonts w:ascii="Calibri" w:cs="Calibri" w:eastAsia="Calibri" w:hAnsi="Calibri"/>
                 </w:rPr>
-                <w:t xml:space="preserve">Photo : © pressafrik.com</w:t>
+                <w:t xml:space="preserve">Photo : © dakaractu.com</w:t>
               </w:r>
             </w:hyperlink>
           </w:p>
@@ -16006,6 +16290,298 @@
           <w:szCs w:val="28"/>
           <w:rFonts w:ascii="Calibri" w:cs="Calibri" w:eastAsia="Calibri" w:hAnsi="Calibri"/>
         </w:rPr>
+        <w:t xml:space="preserve">MORT D’AMINATA SY : LE SUSPECT INVOQUE UNE CHUTE, LES CONSTATATIONS DÉCRIVENT DES VIOLENCES</w:t>
+      </w:r>
+    </w:p>
+    <w:p>
+      <w:pPr>
+        <w:ind w:left="720"/>
+      </w:pPr>
+      <w:r>
+        <w:rPr>
+          <w:color w:val="1F2937"/>
+          <w:sz w:val="26"/>
+          <w:szCs w:val="26"/>
+          <w:rFonts w:ascii="Calibri" w:cs="Calibri" w:eastAsia="Calibri" w:hAnsi="Calibri"/>
+        </w:rPr>
+        <w:t xml:space="preserve">▪  Source : </w:t>
+      </w:r>
+      <w:hyperlink w:history="1" r:id="rIdxfn5kbhph3ptg2a5p62ed">
+        <w:r>
+          <w:rPr>
+            <w:u w:val="single"/>
+            <w:color w:val="1F6B5E"/>
+            <w:sz w:val="26"/>
+            <w:szCs w:val="26"/>
+            <w:rFonts w:ascii="Calibri" w:cs="Calibri" w:eastAsia="Calibri" w:hAnsi="Calibri"/>
+          </w:rPr>
+          <w:t xml:space="preserve">Dakar Actu</w:t>
+        </w:r>
+      </w:hyperlink>
+      <w:r>
+        <w:rPr>
+          <w:color w:val="1F2937"/>
+          <w:sz w:val="26"/>
+          <w:szCs w:val="26"/>
+          <w:rFonts w:ascii="Calibri" w:cs="Calibri" w:eastAsia="Calibri" w:hAnsi="Calibri"/>
+        </w:rPr>
+        <w:t xml:space="preserve"> — 28 octobre 2026, 8 h UTC</w:t>
+      </w:r>
+      <w:r>
+        <w:rPr>
+          <w:b/>
+          <w:bCs/>
+          <w:color w:val="1F2937"/>
+          <w:sz w:val="26"/>
+          <w:szCs w:val="26"/>
+          <w:rFonts w:ascii="Calibri" w:cs="Calibri" w:eastAsia="Calibri" w:hAnsi="Calibri"/>
+        </w:rPr>
+        <w:t xml:space="preserve">   ·   Cotation : Probable</w:t>
+      </w:r>
+    </w:p>
+    <w:p>
+      <w:pPr>
+        <w:spacing w:before="160"/>
+        <w:ind w:left="360"/>
+      </w:pPr>
+      <w:r>
+        <w:rPr>
+          <w:color w:val="1F6B5E"/>
+          <w:sz w:val="28"/>
+          <w:szCs w:val="28"/>
+          <w:rFonts w:ascii="Calibri" w:cs="Calibri" w:eastAsia="Calibri" w:hAnsi="Calibri"/>
+        </w:rPr>
+        <w:t xml:space="preserve">❑  </w:t>
+      </w:r>
+      <w:r>
+        <w:rPr>
+          <w:b/>
+          <w:bCs/>
+          <w:u w:val="single"/>
+          <w:color w:val="1F6B5E"/>
+          <w:sz w:val="28"/>
+          <w:szCs w:val="28"/>
+          <w:rFonts w:ascii="Calibri" w:cs="Calibri" w:eastAsia="Calibri" w:hAnsi="Calibri"/>
+        </w:rPr>
+        <w:t xml:space="preserve">TALIBOU DIALLO TUÉ AU COU ET AU THORAX : UNE DISPUTE ENTRE COLOCATAIRES POUR UNE PRISE ÉLECTRIQUE, AU CŒUR DU DRAME</w:t>
+      </w:r>
+    </w:p>
+    <w:p>
+      <w:pPr>
+        <w:ind w:left="720"/>
+      </w:pPr>
+      <w:r>
+        <w:rPr>
+          <w:color w:val="1F2937"/>
+          <w:sz w:val="26"/>
+          <w:szCs w:val="26"/>
+          <w:rFonts w:ascii="Calibri" w:cs="Calibri" w:eastAsia="Calibri" w:hAnsi="Calibri"/>
+        </w:rPr>
+        <w:t xml:space="preserve">▪  Source : </w:t>
+      </w:r>
+      <w:hyperlink w:history="1" r:id="rIdfqvbmesneshv-syg4nwug">
+        <w:r>
+          <w:rPr>
+            <w:u w:val="single"/>
+            <w:color w:val="1F6B5E"/>
+            <w:sz w:val="26"/>
+            <w:szCs w:val="26"/>
+            <w:rFonts w:ascii="Calibri" w:cs="Calibri" w:eastAsia="Calibri" w:hAnsi="Calibri"/>
+          </w:rPr>
+          <w:t xml:space="preserve">Dakar Actu</w:t>
+        </w:r>
+      </w:hyperlink>
+      <w:r>
+        <w:rPr>
+          <w:color w:val="1F2937"/>
+          <w:sz w:val="26"/>
+          <w:szCs w:val="26"/>
+          <w:rFonts w:ascii="Calibri" w:cs="Calibri" w:eastAsia="Calibri" w:hAnsi="Calibri"/>
+        </w:rPr>
+        <w:t xml:space="preserve"> — 28 octobre 2026, 8 h UTC</w:t>
+      </w:r>
+      <w:r>
+        <w:rPr>
+          <w:b/>
+          <w:bCs/>
+          <w:color w:val="1F2937"/>
+          <w:sz w:val="26"/>
+          <w:szCs w:val="26"/>
+          <w:rFonts w:ascii="Calibri" w:cs="Calibri" w:eastAsia="Calibri" w:hAnsi="Calibri"/>
+        </w:rPr>
+        <w:t xml:space="preserve">   ·   Cotation : Probable</w:t>
+      </w:r>
+    </w:p>
+    <w:p>
+      <w:pPr>
+        <w:spacing w:before="160"/>
+        <w:ind w:left="360"/>
+      </w:pPr>
+      <w:r>
+        <w:rPr>
+          <w:color w:val="1F6B5E"/>
+          <w:sz w:val="28"/>
+          <w:szCs w:val="28"/>
+          <w:rFonts w:ascii="Calibri" w:cs="Calibri" w:eastAsia="Calibri" w:hAnsi="Calibri"/>
+        </w:rPr>
+        <w:t xml:space="preserve">❑  </w:t>
+      </w:r>
+      <w:r>
+        <w:rPr>
+          <w:b/>
+          <w:bCs/>
+          <w:u w:val="single"/>
+          <w:color w:val="1F6B5E"/>
+          <w:sz w:val="28"/>
+          <w:szCs w:val="28"/>
+          <w:rFonts w:ascii="Calibri" w:cs="Calibri" w:eastAsia="Calibri" w:hAnsi="Calibri"/>
+        </w:rPr>
+        <w:t xml:space="preserve">LYCÉENNE TUÉE À PODOR : DE L'HISTOIRE D'AMOUR AU DRAME</w:t>
+      </w:r>
+    </w:p>
+    <w:p>
+      <w:pPr>
+        <w:ind w:left="720"/>
+      </w:pPr>
+      <w:r>
+        <w:rPr>
+          <w:color w:val="1F2937"/>
+          <w:sz w:val="26"/>
+          <w:szCs w:val="26"/>
+          <w:rFonts w:ascii="Calibri" w:cs="Calibri" w:eastAsia="Calibri" w:hAnsi="Calibri"/>
+        </w:rPr>
+        <w:t xml:space="preserve">▪  Source : </w:t>
+      </w:r>
+      <w:hyperlink w:history="1" r:id="rId6sdeiycmafz8lsh0a_tpv">
+        <w:r>
+          <w:rPr>
+            <w:u w:val="single"/>
+            <w:color w:val="1F6B5E"/>
+            <w:sz w:val="26"/>
+            <w:szCs w:val="26"/>
+            <w:rFonts w:ascii="Calibri" w:cs="Calibri" w:eastAsia="Calibri" w:hAnsi="Calibri"/>
+          </w:rPr>
+          <w:t xml:space="preserve">Seneweb</w:t>
+        </w:r>
+      </w:hyperlink>
+      <w:r>
+        <w:rPr>
+          <w:color w:val="1F2937"/>
+          <w:sz w:val="26"/>
+          <w:szCs w:val="26"/>
+          <w:rFonts w:ascii="Calibri" w:cs="Calibri" w:eastAsia="Calibri" w:hAnsi="Calibri"/>
+        </w:rPr>
+        <w:t xml:space="preserve"> — 28 octobre 2026, 7 h UTC</w:t>
+      </w:r>
+      <w:r>
+        <w:rPr>
+          <w:b/>
+          <w:bCs/>
+          <w:color w:val="1F2937"/>
+          <w:sz w:val="26"/>
+          <w:szCs w:val="26"/>
+          <w:rFonts w:ascii="Calibri" w:cs="Calibri" w:eastAsia="Calibri" w:hAnsi="Calibri"/>
+        </w:rPr>
+        <w:t xml:space="preserve">   ·   Cotation : Probable</w:t>
+      </w:r>
+    </w:p>
+    <w:p>
+      <w:pPr>
+        <w:spacing w:before="160"/>
+        <w:ind w:left="360"/>
+      </w:pPr>
+      <w:r>
+        <w:rPr>
+          <w:color w:val="1F6B5E"/>
+          <w:sz w:val="28"/>
+          <w:szCs w:val="28"/>
+          <w:rFonts w:ascii="Calibri" w:cs="Calibri" w:eastAsia="Calibri" w:hAnsi="Calibri"/>
+        </w:rPr>
+        <w:t xml:space="preserve">❑  </w:t>
+      </w:r>
+      <w:r>
+        <w:rPr>
+          <w:b/>
+          <w:bCs/>
+          <w:u w:val="single"/>
+          <w:color w:val="1F6B5E"/>
+          <w:sz w:val="28"/>
+          <w:szCs w:val="28"/>
+          <w:rFonts w:ascii="Calibri" w:cs="Calibri" w:eastAsia="Calibri" w:hAnsi="Calibri"/>
+        </w:rPr>
+        <w:t xml:space="preserve">IMMEUBLE EFFONDRÉ À THIÈS : UN MORT ET DEUX BLESSÉS, SELON LE BILAN PROVISOIRE</w:t>
+      </w:r>
+    </w:p>
+    <w:p>
+      <w:pPr>
+        <w:ind w:left="720"/>
+      </w:pPr>
+      <w:r>
+        <w:rPr>
+          <w:color w:val="1F2937"/>
+          <w:sz w:val="26"/>
+          <w:szCs w:val="26"/>
+          <w:rFonts w:ascii="Calibri" w:cs="Calibri" w:eastAsia="Calibri" w:hAnsi="Calibri"/>
+        </w:rPr>
+        <w:t xml:space="preserve">▪  Sources : </w:t>
+      </w:r>
+      <w:hyperlink w:history="1" r:id="rIdiel3cdr9tp1ehcjqf4ezm">
+        <w:r>
+          <w:rPr>
+            <w:u w:val="single"/>
+            <w:color w:val="1F6B5E"/>
+            <w:sz w:val="26"/>
+            <w:szCs w:val="26"/>
+            <w:rFonts w:ascii="Calibri" w:cs="Calibri" w:eastAsia="Calibri" w:hAnsi="Calibri"/>
+          </w:rPr>
+          <w:t xml:space="preserve">APS — Agence Sénégalaise Presse · Pressafrik</w:t>
+        </w:r>
+      </w:hyperlink>
+      <w:r>
+        <w:rPr>
+          <w:color w:val="1F2937"/>
+          <w:sz w:val="26"/>
+          <w:szCs w:val="26"/>
+          <w:rFonts w:ascii="Calibri" w:cs="Calibri" w:eastAsia="Calibri" w:hAnsi="Calibri"/>
+        </w:rPr>
+        <w:t xml:space="preserve"> — 27 octobre 2026, 19 h UTC</w:t>
+      </w:r>
+      <w:r>
+        <w:rPr>
+          <w:b/>
+          <w:bCs/>
+          <w:color w:val="1F2937"/>
+          <w:sz w:val="26"/>
+          <w:szCs w:val="26"/>
+          <w:rFonts w:ascii="Calibri" w:cs="Calibri" w:eastAsia="Calibri" w:hAnsi="Calibri"/>
+        </w:rPr>
+        <w:t xml:space="preserve">   ·   Cotation : Confirmé</w:t>
+      </w:r>
+    </w:p>
+    <w:p>
+      <w:pPr>
+        <w:spacing w:before="160"/>
+        <w:ind w:left="360"/>
+      </w:pPr>
+      <w:r>
+        <w:rPr>
+          <w:color w:val="1F6B5E"/>
+          <w:sz w:val="28"/>
+          <w:szCs w:val="28"/>
+          <w:rFonts w:ascii="Calibri" w:cs="Calibri" w:eastAsia="Calibri" w:hAnsi="Calibri"/>
+        </w:rPr>
+        <w:t xml:space="preserve">❑  </w:t>
+      </w:r>
+      <w:r>
+        <w:rPr>
+          <w:b/>
+          <w:bCs/>
+          <w:u w:val="single"/>
+          <w:color w:val="1F6B5E"/>
+          <w:sz w:val="28"/>
+          <w:szCs w:val="28"/>
+          <w:rFonts w:ascii="Calibri" w:cs="Calibri" w:eastAsia="Calibri" w:hAnsi="Calibri"/>
+        </w:rPr>
         <w:t xml:space="preserve">PACTE DE STABILITÉ SOCIALE : LE GOUVERNEMENT VISE 71 % D’EXÉCUTION DES ENGAGEMENTS EN DÉCEMBRE</w:t>
       </w:r>
     </w:p>
@@ -16022,7 +16598,7 @@
         </w:rPr>
         <w:t xml:space="preserve">▪  Sources : </w:t>
       </w:r>
-      <w:hyperlink w:history="1" r:id="rIdpn8hfdhdldaaxv4avakxa">
+      <w:hyperlink w:history="1" r:id="rIdln29bmom9t2culv3fymch">
         <w:r>
           <w:rPr>
             <w:u w:val="single"/>
@@ -16053,265 +16629,6 @@
           <w:rFonts w:ascii="Calibri" w:cs="Calibri" w:eastAsia="Calibri" w:hAnsi="Calibri"/>
         </w:rPr>
         <w:t xml:space="preserve">   ·   Cotation : Confirmé</w:t>
-      </w:r>
-    </w:p>
-    <w:p>
-      <w:pPr>
-        <w:spacing w:before="160"/>
-        <w:ind w:left="360"/>
-      </w:pPr>
-      <w:r>
-        <w:rPr>
-          <w:color w:val="1F6B5E"/>
-          <w:sz w:val="28"/>
-          <w:szCs w:val="28"/>
-          <w:rFonts w:ascii="Calibri" w:cs="Calibri" w:eastAsia="Calibri" w:hAnsi="Calibri"/>
-        </w:rPr>
-        <w:t xml:space="preserve">❑  </w:t>
-      </w:r>
-      <w:r>
-        <w:rPr>
-          <w:b/>
-          <w:bCs/>
-          <w:u w:val="single"/>
-          <w:color w:val="1F6B5E"/>
-          <w:sz w:val="28"/>
-          <w:szCs w:val="28"/>
-          <w:rFonts w:ascii="Calibri" w:cs="Calibri" w:eastAsia="Calibri" w:hAnsi="Calibri"/>
-        </w:rPr>
-        <w:t xml:space="preserve">MALIKA : UN LOCATAIRE INTERPELLÉ POUR AVOIR POIGNARDÉ À MORT SON VOISIN LORS D'UNE ALTERCATION</w:t>
-      </w:r>
-    </w:p>
-    <w:p>
-      <w:pPr>
-        <w:ind w:left="720"/>
-      </w:pPr>
-      <w:r>
-        <w:rPr>
-          <w:color w:val="1F2937"/>
-          <w:sz w:val="26"/>
-          <w:szCs w:val="26"/>
-          <w:rFonts w:ascii="Calibri" w:cs="Calibri" w:eastAsia="Calibri" w:hAnsi="Calibri"/>
-        </w:rPr>
-        <w:t xml:space="preserve">▪  Source : </w:t>
-      </w:r>
-      <w:hyperlink w:history="1" r:id="rId5_-yvszksemm72rrwwtgb">
-        <w:r>
-          <w:rPr>
-            <w:u w:val="single"/>
-            <w:color w:val="1F6B5E"/>
-            <w:sz w:val="26"/>
-            <w:szCs w:val="26"/>
-            <w:rFonts w:ascii="Calibri" w:cs="Calibri" w:eastAsia="Calibri" w:hAnsi="Calibri"/>
-          </w:rPr>
-          <w:t xml:space="preserve">Seneweb</w:t>
-        </w:r>
-      </w:hyperlink>
-      <w:r>
-        <w:rPr>
-          <w:color w:val="1F2937"/>
-          <w:sz w:val="26"/>
-          <w:szCs w:val="26"/>
-          <w:rFonts w:ascii="Calibri" w:cs="Calibri" w:eastAsia="Calibri" w:hAnsi="Calibri"/>
-        </w:rPr>
-        <w:t xml:space="preserve"> — 27 octobre 2026, 13 h UTC</w:t>
-      </w:r>
-    </w:p>
-    <w:p>
-      <w:pPr>
-        <w:spacing w:before="160"/>
-        <w:ind w:left="360"/>
-      </w:pPr>
-      <w:r>
-        <w:rPr>
-          <w:color w:val="1F6B5E"/>
-          <w:sz w:val="28"/>
-          <w:szCs w:val="28"/>
-          <w:rFonts w:ascii="Calibri" w:cs="Calibri" w:eastAsia="Calibri" w:hAnsi="Calibri"/>
-        </w:rPr>
-        <w:t xml:space="preserve">❑  </w:t>
-      </w:r>
-      <w:r>
-        <w:rPr>
-          <w:b/>
-          <w:bCs/>
-          <w:u w:val="single"/>
-          <w:color w:val="1F6B5E"/>
-          <w:sz w:val="28"/>
-          <w:szCs w:val="28"/>
-          <w:rFonts w:ascii="Calibri" w:cs="Calibri" w:eastAsia="Calibri" w:hAnsi="Calibri"/>
-        </w:rPr>
-        <w:t xml:space="preserve">MEURTRE PRÉSUMÉ D’AMINATA SY À PODOR : LE SUSPECT RETROUVÉ DANS UNE CACHETTE ET ARRÊTÉ À MBACKÉ</w:t>
-      </w:r>
-    </w:p>
-    <w:p>
-      <w:pPr>
-        <w:ind w:left="720"/>
-      </w:pPr>
-      <w:r>
-        <w:rPr>
-          <w:color w:val="1F2937"/>
-          <w:sz w:val="26"/>
-          <w:szCs w:val="26"/>
-          <w:rFonts w:ascii="Calibri" w:cs="Calibri" w:eastAsia="Calibri" w:hAnsi="Calibri"/>
-        </w:rPr>
-        <w:t xml:space="preserve">▪  Sources : </w:t>
-      </w:r>
-      <w:hyperlink w:history="1" r:id="rIdybk4gppgsbbtg9c0mq6tz">
-        <w:r>
-          <w:rPr>
-            <w:u w:val="single"/>
-            <w:color w:val="1F6B5E"/>
-            <w:sz w:val="26"/>
-            <w:szCs w:val="26"/>
-            <w:rFonts w:ascii="Calibri" w:cs="Calibri" w:eastAsia="Calibri" w:hAnsi="Calibri"/>
-          </w:rPr>
-          <w:t xml:space="preserve">Dakar Actu · Seneweb</w:t>
-        </w:r>
-      </w:hyperlink>
-      <w:r>
-        <w:rPr>
-          <w:color w:val="1F2937"/>
-          <w:sz w:val="26"/>
-          <w:szCs w:val="26"/>
-          <w:rFonts w:ascii="Calibri" w:cs="Calibri" w:eastAsia="Calibri" w:hAnsi="Calibri"/>
-        </w:rPr>
-        <w:t xml:space="preserve"> — 27 octobre 2026, 11 h UTC</w:t>
-      </w:r>
-      <w:r>
-        <w:rPr>
-          <w:b/>
-          <w:bCs/>
-          <w:color w:val="1F2937"/>
-          <w:sz w:val="26"/>
-          <w:szCs w:val="26"/>
-          <w:rFonts w:ascii="Calibri" w:cs="Calibri" w:eastAsia="Calibri" w:hAnsi="Calibri"/>
-        </w:rPr>
-        <w:t xml:space="preserve">   ·   Cotation : Confirmé</w:t>
-      </w:r>
-    </w:p>
-    <w:p>
-      <w:pPr>
-        <w:spacing w:before="160"/>
-        <w:ind w:left="360"/>
-      </w:pPr>
-      <w:r>
-        <w:rPr>
-          <w:color w:val="1F6B5E"/>
-          <w:sz w:val="28"/>
-          <w:szCs w:val="28"/>
-          <w:rFonts w:ascii="Calibri" w:cs="Calibri" w:eastAsia="Calibri" w:hAnsi="Calibri"/>
-        </w:rPr>
-        <w:t xml:space="preserve">❑  </w:t>
-      </w:r>
-      <w:r>
-        <w:rPr>
-          <w:b/>
-          <w:bCs/>
-          <w:u w:val="single"/>
-          <w:color w:val="1F6B5E"/>
-          <w:sz w:val="28"/>
-          <w:szCs w:val="28"/>
-          <w:rFonts w:ascii="Calibri" w:cs="Calibri" w:eastAsia="Calibri" w:hAnsi="Calibri"/>
-        </w:rPr>
-        <w:t xml:space="preserve">KARAMO CISSÉ NDIAYE ARRÊTÉ POUR LE MEURTRE D’AMINATA SY APRÈS UNE DISPUTE VIOLENTE</w:t>
-      </w:r>
-    </w:p>
-    <w:p>
-      <w:pPr>
-        <w:ind w:left="720"/>
-      </w:pPr>
-      <w:r>
-        <w:rPr>
-          <w:color w:val="1F2937"/>
-          <w:sz w:val="26"/>
-          <w:szCs w:val="26"/>
-          <w:rFonts w:ascii="Calibri" w:cs="Calibri" w:eastAsia="Calibri" w:hAnsi="Calibri"/>
-        </w:rPr>
-        <w:t xml:space="preserve">▪  Source : </w:t>
-      </w:r>
-      <w:hyperlink w:history="1" r:id="rIdfzmbfzfvjanfrms9l2zyi">
-        <w:r>
-          <w:rPr>
-            <w:u w:val="single"/>
-            <w:color w:val="1F6B5E"/>
-            <w:sz w:val="26"/>
-            <w:szCs w:val="26"/>
-            <w:rFonts w:ascii="Calibri" w:cs="Calibri" w:eastAsia="Calibri" w:hAnsi="Calibri"/>
-          </w:rPr>
-          <w:t xml:space="preserve">SeneNews</w:t>
-        </w:r>
-      </w:hyperlink>
-      <w:r>
-        <w:rPr>
-          <w:color w:val="1F2937"/>
-          <w:sz w:val="26"/>
-          <w:szCs w:val="26"/>
-          <w:rFonts w:ascii="Calibri" w:cs="Calibri" w:eastAsia="Calibri" w:hAnsi="Calibri"/>
-        </w:rPr>
-        <w:t xml:space="preserve"> — 27 octobre 2026, 8 h UTC</w:t>
-      </w:r>
-    </w:p>
-    <w:p>
-      <w:pPr>
-        <w:spacing w:before="160"/>
-        <w:ind w:left="360"/>
-      </w:pPr>
-      <w:r>
-        <w:rPr>
-          <w:color w:val="1F6B5E"/>
-          <w:sz w:val="28"/>
-          <w:szCs w:val="28"/>
-          <w:rFonts w:ascii="Calibri" w:cs="Calibri" w:eastAsia="Calibri" w:hAnsi="Calibri"/>
-        </w:rPr>
-        <w:t xml:space="preserve">❑  </w:t>
-      </w:r>
-      <w:r>
-        <w:rPr>
-          <w:b/>
-          <w:bCs/>
-          <w:u w:val="single"/>
-          <w:color w:val="1F6B5E"/>
-          <w:sz w:val="28"/>
-          <w:szCs w:val="28"/>
-          <w:rFonts w:ascii="Calibri" w:cs="Calibri" w:eastAsia="Calibri" w:hAnsi="Calibri"/>
-        </w:rPr>
-        <w:t xml:space="preserve">DRAME À ZIGUINCHOR : UN COMMERÇANT RETROUVÉ MORT PENDU APRÈS LA PERTE DE 800 000 F CFA</w:t>
-      </w:r>
-    </w:p>
-    <w:p>
-      <w:pPr>
-        <w:ind w:left="720"/>
-      </w:pPr>
-      <w:r>
-        <w:rPr>
-          <w:color w:val="1F2937"/>
-          <w:sz w:val="26"/>
-          <w:szCs w:val="26"/>
-          <w:rFonts w:ascii="Calibri" w:cs="Calibri" w:eastAsia="Calibri" w:hAnsi="Calibri"/>
-        </w:rPr>
-        <w:t xml:space="preserve">▪  Source : </w:t>
-      </w:r>
-      <w:hyperlink w:history="1" r:id="rIduy5g-ms8xtkeoffvun1qm">
-        <w:r>
-          <w:rPr>
-            <w:u w:val="single"/>
-            <w:color w:val="1F6B5E"/>
-            <w:sz w:val="26"/>
-            <w:szCs w:val="26"/>
-            <w:rFonts w:ascii="Calibri" w:cs="Calibri" w:eastAsia="Calibri" w:hAnsi="Calibri"/>
-          </w:rPr>
-          <w:t xml:space="preserve">Seneweb</w:t>
-        </w:r>
-      </w:hyperlink>
-      <w:r>
-        <w:rPr>
-          <w:color w:val="1F2937"/>
-          <w:sz w:val="26"/>
-          <w:szCs w:val="26"/>
-          <w:rFonts w:ascii="Calibri" w:cs="Calibri" w:eastAsia="Calibri" w:hAnsi="Calibri"/>
-        </w:rPr>
-        <w:t xml:space="preserve"> — 26 octobre 2026, 23 h UTC</w:t>
       </w:r>
     </w:p>
     <w:p>
@@ -16538,7 +16855,7 @@
           <w:szCs w:val="28"/>
           <w:rFonts w:ascii="Calibri" w:cs="Calibri" w:eastAsia="Calibri" w:hAnsi="Calibri"/>
         </w:rPr>
-        <w:t xml:space="preserve">« ILS L’ONT DÉCOUVERT PENDU » : LE GRAND COMMERÇANT ABDOULAYE DIALLO S’EST DONNÉ LA MORT DANS SA BOUTIQUE</w:t>
+        <w:t xml:space="preserve">MALIKA : UN LOCATAIRE INTERPELLÉ POUR AVOIR POIGNARDÉ À MORT SON VOISIN LORS D'UNE ALTERCATION</w:t>
       </w:r>
     </w:p>
     <w:p>
@@ -16554,7 +16871,142 @@
         </w:rPr>
         <w:t xml:space="preserve">▪  Source : </w:t>
       </w:r>
-      <w:hyperlink w:history="1" r:id="rIdckqwd1ctted4_5pqzvhl2">
+      <w:hyperlink w:history="1" r:id="rIdb9dstrk-_ouao8dsjcs2u">
+        <w:r>
+          <w:rPr>
+            <w:u w:val="single"/>
+            <w:color w:val="1F6B5E"/>
+            <w:sz w:val="26"/>
+            <w:szCs w:val="26"/>
+            <w:rFonts w:ascii="Calibri" w:cs="Calibri" w:eastAsia="Calibri" w:hAnsi="Calibri"/>
+          </w:rPr>
+          <w:t xml:space="preserve">Seneweb</w:t>
+        </w:r>
+      </w:hyperlink>
+      <w:r>
+        <w:rPr>
+          <w:color w:val="1F2937"/>
+          <w:sz w:val="26"/>
+          <w:szCs w:val="26"/>
+          <w:rFonts w:ascii="Calibri" w:cs="Calibri" w:eastAsia="Calibri" w:hAnsi="Calibri"/>
+        </w:rPr>
+        <w:t xml:space="preserve"> — 27 octobre 2026, 13 h UTC</w:t>
+      </w:r>
+    </w:p>
+    <w:p>
+      <w:pPr>
+        <w:spacing w:before="160"/>
+        <w:ind w:left="360"/>
+      </w:pPr>
+      <w:r>
+        <w:rPr>
+          <w:color w:val="1F6B5E"/>
+          <w:sz w:val="28"/>
+          <w:szCs w:val="28"/>
+          <w:rFonts w:ascii="Calibri" w:cs="Calibri" w:eastAsia="Calibri" w:hAnsi="Calibri"/>
+        </w:rPr>
+        <w:t xml:space="preserve">❑  </w:t>
+      </w:r>
+      <w:r>
+        <w:rPr>
+          <w:b/>
+          <w:bCs/>
+          <w:u w:val="single"/>
+          <w:color w:val="1F6B5E"/>
+          <w:sz w:val="28"/>
+          <w:szCs w:val="28"/>
+          <w:rFonts w:ascii="Calibri" w:cs="Calibri" w:eastAsia="Calibri" w:hAnsi="Calibri"/>
+        </w:rPr>
+        <w:t xml:space="preserve">MEURTRE PRÉSUMÉ D’AMINATA SY À PODOR : LE SUSPECT RETROUVÉ DANS UNE CACHETTE ET ARRÊTÉ À MBACKÉ</w:t>
+      </w:r>
+    </w:p>
+    <w:p>
+      <w:pPr>
+        <w:ind w:left="720"/>
+      </w:pPr>
+      <w:r>
+        <w:rPr>
+          <w:color w:val="1F2937"/>
+          <w:sz w:val="26"/>
+          <w:szCs w:val="26"/>
+          <w:rFonts w:ascii="Calibri" w:cs="Calibri" w:eastAsia="Calibri" w:hAnsi="Calibri"/>
+        </w:rPr>
+        <w:t xml:space="preserve">▪  Sources : </w:t>
+      </w:r>
+      <w:hyperlink w:history="1" r:id="rIdfds9lv8izsgniwru8wxvw">
+        <w:r>
+          <w:rPr>
+            <w:u w:val="single"/>
+            <w:color w:val="1F6B5E"/>
+            <w:sz w:val="26"/>
+            <w:szCs w:val="26"/>
+            <w:rFonts w:ascii="Calibri" w:cs="Calibri" w:eastAsia="Calibri" w:hAnsi="Calibri"/>
+          </w:rPr>
+          <w:t xml:space="preserve">Dakar Actu · Seneweb</w:t>
+        </w:r>
+      </w:hyperlink>
+      <w:r>
+        <w:rPr>
+          <w:color w:val="1F2937"/>
+          <w:sz w:val="26"/>
+          <w:szCs w:val="26"/>
+          <w:rFonts w:ascii="Calibri" w:cs="Calibri" w:eastAsia="Calibri" w:hAnsi="Calibri"/>
+        </w:rPr>
+        <w:t xml:space="preserve"> — 27 octobre 2026, 11 h UTC</w:t>
+      </w:r>
+      <w:r>
+        <w:rPr>
+          <w:b/>
+          <w:bCs/>
+          <w:color w:val="1F2937"/>
+          <w:sz w:val="26"/>
+          <w:szCs w:val="26"/>
+          <w:rFonts w:ascii="Calibri" w:cs="Calibri" w:eastAsia="Calibri" w:hAnsi="Calibri"/>
+        </w:rPr>
+        <w:t xml:space="preserve">   ·   Cotation : Confirmé</w:t>
+      </w:r>
+    </w:p>
+    <w:p>
+      <w:pPr>
+        <w:spacing w:before="160"/>
+        <w:ind w:left="360"/>
+      </w:pPr>
+      <w:r>
+        <w:rPr>
+          <w:color w:val="1F6B5E"/>
+          <w:sz w:val="28"/>
+          <w:szCs w:val="28"/>
+          <w:rFonts w:ascii="Calibri" w:cs="Calibri" w:eastAsia="Calibri" w:hAnsi="Calibri"/>
+        </w:rPr>
+        <w:t xml:space="preserve">❑  </w:t>
+      </w:r>
+      <w:r>
+        <w:rPr>
+          <w:b/>
+          <w:bCs/>
+          <w:u w:val="single"/>
+          <w:color w:val="1F6B5E"/>
+          <w:sz w:val="28"/>
+          <w:szCs w:val="28"/>
+          <w:rFonts w:ascii="Calibri" w:cs="Calibri" w:eastAsia="Calibri" w:hAnsi="Calibri"/>
+        </w:rPr>
+        <w:t xml:space="preserve">KARAMO CISSÉ NDIAYE ARRÊTÉ POUR LE MEURTRE D’AMINATA SY APRÈS UNE DISPUTE VIOLENTE</w:t>
+      </w:r>
+    </w:p>
+    <w:p>
+      <w:pPr>
+        <w:ind w:left="720"/>
+      </w:pPr>
+      <w:r>
+        <w:rPr>
+          <w:color w:val="1F2937"/>
+          <w:sz w:val="26"/>
+          <w:szCs w:val="26"/>
+          <w:rFonts w:ascii="Calibri" w:cs="Calibri" w:eastAsia="Calibri" w:hAnsi="Calibri"/>
+        </w:rPr>
+        <w:t xml:space="preserve">▪  Source : </w:t>
+      </w:r>
+      <w:hyperlink w:history="1" r:id="rIdtysnhifjmvtyer_zvalno">
         <w:r>
           <w:rPr>
             <w:u w:val="single"/>
@@ -16573,18 +17025,7 @@
           <w:szCs w:val="26"/>
           <w:rFonts w:ascii="Calibri" w:cs="Calibri" w:eastAsia="Calibri" w:hAnsi="Calibri"/>
         </w:rPr>
-        <w:t xml:space="preserve"> — 26 octobre 2026, 21 h UTC</w:t>
-      </w:r>
-      <w:r>
-        <w:rPr>
-          <w:b/>
-          <w:bCs/>
-          <w:color w:val="1F2937"/>
-          <w:sz w:val="26"/>
-          <w:szCs w:val="26"/>
-          <w:rFonts w:ascii="Calibri" w:cs="Calibri" w:eastAsia="Calibri" w:hAnsi="Calibri"/>
-        </w:rPr>
-        <w:t xml:space="preserve">   ·   Cotation : Non confirmé</w:t>
+        <w:t xml:space="preserve"> — 27 octobre 2026, 8 h UTC</w:t>
       </w:r>
     </w:p>
     <w:p>
@@ -16611,7 +17052,7 @@
           <w:szCs w:val="28"/>
           <w:rFonts w:ascii="Calibri" w:cs="Calibri" w:eastAsia="Calibri" w:hAnsi="Calibri"/>
         </w:rPr>
-        <w:t xml:space="preserve">ZIGUINCHOR : UN JEUNE HOMME RETROUVÉ MORT DANS UNE BOUTIQUE À TILÈNE</w:t>
+        <w:t xml:space="preserve">DRAME À ZIGUINCHOR : UN COMMERÇANT RETROUVÉ MORT PENDU APRÈS LA PERTE DE 800 000 F CFA</w:t>
       </w:r>
     </w:p>
     <w:p>
@@ -16627,7 +17068,7 @@
         </w:rPr>
         <w:t xml:space="preserve">▪  Source : </w:t>
       </w:r>
-      <w:hyperlink w:history="1" r:id="rIdcnv9surujfnlawn3-ihwu">
+      <w:hyperlink w:history="1" r:id="rIdch-rclvhe3ji4ftv6hyv2">
         <w:r>
           <w:rPr>
             <w:u w:val="single"/>
@@ -16636,7 +17077,7 @@
             <w:szCs w:val="26"/>
             <w:rFonts w:ascii="Calibri" w:cs="Calibri" w:eastAsia="Calibri" w:hAnsi="Calibri"/>
           </w:rPr>
-          <w:t xml:space="preserve">Dakar Actu</w:t>
+          <w:t xml:space="preserve">Seneweb</w:t>
         </w:r>
       </w:hyperlink>
       <w:r>
@@ -16646,131 +17087,7 @@
           <w:szCs w:val="26"/>
           <w:rFonts w:ascii="Calibri" w:cs="Calibri" w:eastAsia="Calibri" w:hAnsi="Calibri"/>
         </w:rPr>
-        <w:t xml:space="preserve"> — 26 octobre 2026, 17 h UTC</w:t>
-      </w:r>
-    </w:p>
-    <w:p>
-      <w:pPr>
-        <w:spacing w:before="160"/>
-        <w:ind w:left="360"/>
-      </w:pPr>
-      <w:r>
-        <w:rPr>
-          <w:color w:val="1F6B5E"/>
-          <w:sz w:val="28"/>
-          <w:szCs w:val="28"/>
-          <w:rFonts w:ascii="Calibri" w:cs="Calibri" w:eastAsia="Calibri" w:hAnsi="Calibri"/>
-        </w:rPr>
-        <w:t xml:space="preserve">❑  </w:t>
-      </w:r>
-      <w:r>
-        <w:rPr>
-          <w:b/>
-          <w:bCs/>
-          <w:u w:val="single"/>
-          <w:color w:val="1F6B5E"/>
-          <w:sz w:val="28"/>
-          <w:szCs w:val="28"/>
-          <w:rFonts w:ascii="Calibri" w:cs="Calibri" w:eastAsia="Calibri" w:hAnsi="Calibri"/>
-        </w:rPr>
-        <w:t xml:space="preserve">FÉMINICIDES AU SÉNÉGAL – AMINATA SY ET MAME DIARRA SOW TUÉES LE MÊME JOUR : SEYDI GASSAMA LANCE UN CRI D’ALARME</w:t>
-      </w:r>
-    </w:p>
-    <w:p>
-      <w:pPr>
-        <w:ind w:left="720"/>
-      </w:pPr>
-      <w:r>
-        <w:rPr>
-          <w:color w:val="1F2937"/>
-          <w:sz w:val="26"/>
-          <w:szCs w:val="26"/>
-          <w:rFonts w:ascii="Calibri" w:cs="Calibri" w:eastAsia="Calibri" w:hAnsi="Calibri"/>
-        </w:rPr>
-        <w:t xml:space="preserve">▪  Source : </w:t>
-      </w:r>
-      <w:hyperlink w:history="1" r:id="rIdysleuajft1yu-v7ovqrbn">
-        <w:r>
-          <w:rPr>
-            <w:u w:val="single"/>
-            <w:color w:val="1F6B5E"/>
-            <w:sz w:val="26"/>
-            <w:szCs w:val="26"/>
-            <w:rFonts w:ascii="Calibri" w:cs="Calibri" w:eastAsia="Calibri" w:hAnsi="Calibri"/>
-          </w:rPr>
-          <w:t xml:space="preserve">SeneNews</w:t>
-        </w:r>
-      </w:hyperlink>
-      <w:r>
-        <w:rPr>
-          <w:color w:val="1F2937"/>
-          <w:sz w:val="26"/>
-          <w:szCs w:val="26"/>
-          <w:rFonts w:ascii="Calibri" w:cs="Calibri" w:eastAsia="Calibri" w:hAnsi="Calibri"/>
-        </w:rPr>
-        <w:t xml:space="preserve"> — 26 octobre 2026, 17 h UTC</w:t>
-      </w:r>
-    </w:p>
-    <w:p>
-      <w:pPr>
-        <w:spacing w:before="160"/>
-        <w:ind w:left="360"/>
-      </w:pPr>
-      <w:r>
-        <w:rPr>
-          <w:color w:val="1F6B5E"/>
-          <w:sz w:val="28"/>
-          <w:szCs w:val="28"/>
-          <w:rFonts w:ascii="Calibri" w:cs="Calibri" w:eastAsia="Calibri" w:hAnsi="Calibri"/>
-        </w:rPr>
-        <w:t xml:space="preserve">❑  </w:t>
-      </w:r>
-      <w:r>
-        <w:rPr>
-          <w:b/>
-          <w:bCs/>
-          <w:u w:val="single"/>
-          <w:color w:val="1F6B5E"/>
-          <w:sz w:val="28"/>
-          <w:szCs w:val="28"/>
-          <w:rFonts w:ascii="Calibri" w:cs="Calibri" w:eastAsia="Calibri" w:hAnsi="Calibri"/>
-        </w:rPr>
-        <w:t xml:space="preserve">TROPHÉE ANPS : LE TROPHÉE DU MEILLEUR LUTTEUR EN LUTTE AVEC FRAPPE PORTE DÉSORMAIS LE NOM DE MANGA II</w:t>
-      </w:r>
-    </w:p>
-    <w:p>
-      <w:pPr>
-        <w:ind w:left="720"/>
-      </w:pPr>
-      <w:r>
-        <w:rPr>
-          <w:color w:val="1F2937"/>
-          <w:sz w:val="26"/>
-          <w:szCs w:val="26"/>
-          <w:rFonts w:ascii="Calibri" w:cs="Calibri" w:eastAsia="Calibri" w:hAnsi="Calibri"/>
-        </w:rPr>
-        <w:t xml:space="preserve">▪  Source : </w:t>
-      </w:r>
-      <w:hyperlink w:history="1" r:id="rIdi1gnrgw103olwmzmw7rxy">
-        <w:r>
-          <w:rPr>
-            <w:u w:val="single"/>
-            <w:color w:val="1F6B5E"/>
-            <w:sz w:val="26"/>
-            <w:szCs w:val="26"/>
-            <w:rFonts w:ascii="Calibri" w:cs="Calibri" w:eastAsia="Calibri" w:hAnsi="Calibri"/>
-          </w:rPr>
-          <w:t xml:space="preserve">wiwsport</w:t>
-        </w:r>
-      </w:hyperlink>
-      <w:r>
-        <w:rPr>
-          <w:color w:val="1F2937"/>
-          <w:sz w:val="26"/>
-          <w:szCs w:val="26"/>
-          <w:rFonts w:ascii="Calibri" w:cs="Calibri" w:eastAsia="Calibri" w:hAnsi="Calibri"/>
-        </w:rPr>
-        <w:t xml:space="preserve"> — 26 octobre 2026, 13 h UTC</w:t>
+        <w:t xml:space="preserve"> — 26 octobre 2026, 23 h UTC</w:t>
       </w:r>
     </w:p>
     <w:p>
@@ -16935,7 +17252,7 @@
               <w:szCs w:val="20"/>
               <w:rFonts w:ascii="Calibri" w:cs="Calibri" w:eastAsia="Calibri" w:hAnsi="Calibri"/>
             </w:rPr>
-            <w:t xml:space="preserve">|  27/10/26   |   </w:t>
+            <w:t xml:space="preserve">|  28/10/26   |   </w:t>
           </w:r>
           <w:r>
             <w:rPr>

</xml_diff>